<commit_message>
Update CSE-20 routine PDF and template DOCX files
Revised the class routine PDF and its corresponding DOCX template for CSE-20. These updates likely reflect schedule or formatting changes effective from July 20, 2025.
</commit_message>
<xml_diff>
--- a/Routine/CSE-20_Routine Tamplate - Copy.docx
+++ b/Routine/CSE-20_Routine Tamplate - Copy.docx
@@ -1070,28 +1070,7 @@
                   <w14:round/>
                 </w14:textOutline>
               </w:rPr>
-              <w:t xml:space="preserve"> </w:t>
-            </w:r>
-            <w:r>
-              <w:rPr>
-                <w:rFonts w:ascii="Times New Roman" w:hAnsi="Times New Roman" w:cs="Times New Roman"/>
-                <w:b/>
-                <w:bCs/>
-                <w:color w:val="C45911" w:themeColor="accent2" w:themeShade="BF"/>
-                <w:sz w:val="48"/>
-                <w:szCs w:val="48"/>
-                <w14:shadow w14:blurRad="38100" w14:dist="25400" w14:dir="5400000" w14:sx="100000" w14:sy="100000" w14:kx="0" w14:ky="0" w14:algn="ctr">
-                  <w14:srgbClr w14:val="6E747A">
-                    <w14:alpha w14:val="57000"/>
-                  </w14:srgbClr>
-                </w14:shadow>
-                <w14:textOutline w14:w="0" w14:cap="flat" w14:cmpd="sng" w14:algn="ctr">
-                  <w14:noFill/>
-                  <w14:prstDash w14:val="solid"/>
-                  <w14:round/>
-                </w14:textOutline>
-              </w:rPr>
-              <w:t>CHILL</w:t>
+              <w:t xml:space="preserve"> CHILL</w:t>
             </w:r>
           </w:p>
           <w:p>
@@ -1708,21 +1687,123 @@
               <w:rPr>
                 <w:rFonts w:ascii="Times New Roman" w:hAnsi="Times New Roman" w:cs="Times New Roman"/>
                 <w:bCs/>
-                <w:color w:val="000000" w:themeColor="text1"/>
-                <w:sz w:val="44"/>
-                <w:szCs w:val="44"/>
-                <w14:shadow w14:blurRad="38100" w14:dist="19050" w14:dir="2700000" w14:sx="100000" w14:sy="100000" w14:kx="0" w14:ky="0" w14:algn="tl">
-                  <w14:schemeClr w14:val="dk1">
-                    <w14:alpha w14:val="60000"/>
-                  </w14:schemeClr>
-                </w14:shadow>
-                <w14:textOutline w14:w="0" w14:cap="flat" w14:cmpd="sng" w14:algn="ctr">
-                  <w14:noFill/>
-                  <w14:prstDash w14:val="solid"/>
-                  <w14:round/>
-                </w14:textOutline>
-              </w:rPr>
-            </w:pPr>
+                <w:sz w:val="44"/>
+                <w:szCs w:val="44"/>
+                <w14:shadow w14:blurRad="38100" w14:dist="19050" w14:dir="2700000" w14:sx="100000" w14:sy="100000" w14:kx="0" w14:ky="0" w14:algn="tl">
+                  <w14:schemeClr w14:val="dk1">
+                    <w14:alpha w14:val="60000"/>
+                  </w14:schemeClr>
+                </w14:shadow>
+                <w14:textOutline w14:w="0" w14:cap="flat" w14:cmpd="sng" w14:algn="ctr">
+                  <w14:noFill/>
+                  <w14:prstDash w14:val="solid"/>
+                  <w14:round/>
+                </w14:textOutline>
+              </w:rPr>
+            </w:pPr>
+            <w:r>
+              <w:rPr>
+                <w:rFonts w:ascii="Times New Roman" w:hAnsi="Times New Roman" w:cs="Times New Roman"/>
+                <w:bCs/>
+                <w:sz w:val="44"/>
+                <w:szCs w:val="44"/>
+                <w14:shadow w14:blurRad="38100" w14:dist="19050" w14:dir="2700000" w14:sx="100000" w14:sy="100000" w14:kx="0" w14:ky="0" w14:algn="tl">
+                  <w14:schemeClr w14:val="dk1">
+                    <w14:alpha w14:val="60000"/>
+                  </w14:schemeClr>
+                </w14:shadow>
+                <w14:textOutline w14:w="0" w14:cap="flat" w14:cmpd="sng" w14:algn="ctr">
+                  <w14:noFill/>
+                  <w14:prstDash w14:val="solid"/>
+                  <w14:round/>
+                </w14:textOutline>
+              </w:rPr>
+              <w:t>CSE 4106</w:t>
+            </w:r>
+          </w:p>
+          <w:p>
+            <w:pPr>
+              <w:jc w:val="center"/>
+              <w:rPr>
+                <w:rFonts w:ascii="Times New Roman" w:hAnsi="Times New Roman" w:cs="Times New Roman"/>
+                <w:bCs/>
+                <w:color w:val="000000" w:themeColor="text1"/>
+                <w:sz w:val="44"/>
+                <w:szCs w:val="44"/>
+                <w14:shadow w14:blurRad="38100" w14:dist="19050" w14:dir="2700000" w14:sx="100000" w14:sy="100000" w14:kx="0" w14:ky="0" w14:algn="tl">
+                  <w14:schemeClr w14:val="dk1">
+                    <w14:alpha w14:val="60000"/>
+                  </w14:schemeClr>
+                </w14:shadow>
+                <w14:textOutline w14:w="0" w14:cap="flat" w14:cmpd="sng" w14:algn="ctr">
+                  <w14:noFill/>
+                  <w14:prstDash w14:val="solid"/>
+                  <w14:round/>
+                </w14:textOutline>
+              </w:rPr>
+            </w:pPr>
+            <w:r>
+              <w:rPr>
+                <w:rFonts w:ascii="Times New Roman" w:hAnsi="Times New Roman" w:cs="Times New Roman"/>
+                <w:bCs/>
+                <w:color w:val="000000" w:themeColor="text1"/>
+                <w:sz w:val="44"/>
+                <w:szCs w:val="44"/>
+                <w14:shadow w14:blurRad="38100" w14:dist="19050" w14:dir="2700000" w14:sx="100000" w14:sy="100000" w14:kx="0" w14:ky="0" w14:algn="tl">
+                  <w14:schemeClr w14:val="dk1">
+                    <w14:alpha w14:val="60000"/>
+                  </w14:schemeClr>
+                </w14:shadow>
+                <w14:textOutline w14:w="0" w14:cap="flat" w14:cmpd="sng" w14:algn="ctr">
+                  <w14:noFill/>
+                  <w14:prstDash w14:val="solid"/>
+                  <w14:round/>
+                </w14:textOutline>
+              </w:rPr>
+              <w:t>Alternate Weeks</w:t>
+            </w:r>
+          </w:p>
+          <w:p>
+            <w:pPr>
+              <w:jc w:val="center"/>
+              <w:rPr>
+                <w:rFonts w:ascii="Times New Roman" w:hAnsi="Times New Roman" w:cs="Times New Roman"/>
+                <w:bCs/>
+                <w:color w:val="000000" w:themeColor="text1"/>
+                <w:sz w:val="44"/>
+                <w:szCs w:val="44"/>
+                <w14:shadow w14:blurRad="38100" w14:dist="19050" w14:dir="2700000" w14:sx="100000" w14:sy="100000" w14:kx="0" w14:ky="0" w14:algn="tl">
+                  <w14:schemeClr w14:val="dk1">
+                    <w14:alpha w14:val="60000"/>
+                  </w14:schemeClr>
+                </w14:shadow>
+                <w14:textOutline w14:w="0" w14:cap="flat" w14:cmpd="sng" w14:algn="ctr">
+                  <w14:noFill/>
+                  <w14:prstDash w14:val="solid"/>
+                  <w14:round/>
+                </w14:textOutline>
+              </w:rPr>
+            </w:pPr>
+            <w:r>
+              <w:rPr>
+                <w:rFonts w:ascii="Times New Roman" w:hAnsi="Times New Roman" w:cs="Times New Roman"/>
+                <w:bCs/>
+                <w:color w:val="000000" w:themeColor="text1"/>
+                <w:sz w:val="44"/>
+                <w:szCs w:val="44"/>
+                <w14:shadow w14:blurRad="38100" w14:dist="19050" w14:dir="2700000" w14:sx="100000" w14:sy="100000" w14:kx="0" w14:ky="0" w14:algn="tl">
+                  <w14:schemeClr w14:val="dk1">
+                    <w14:alpha w14:val="60000"/>
+                  </w14:schemeClr>
+                </w14:shadow>
+                <w14:textOutline w14:w="0" w14:cap="flat" w14:cmpd="sng" w14:algn="ctr">
+                  <w14:noFill/>
+                  <w14:prstDash w14:val="solid"/>
+                  <w14:round/>
+                </w14:textOutline>
+              </w:rPr>
+              <w:t>Shanta ma’am</w:t>
+            </w:r>
           </w:p>
         </w:tc>
         <w:tc>
@@ -2250,21 +2331,143 @@
               <w:rPr>
                 <w:rFonts w:ascii="Times New Roman" w:hAnsi="Times New Roman" w:cs="Times New Roman"/>
                 <w:bCs/>
-                <w:color w:val="000000" w:themeColor="text1"/>
-                <w:sz w:val="44"/>
-                <w:szCs w:val="44"/>
-                <w14:shadow w14:blurRad="38100" w14:dist="19050" w14:dir="2700000" w14:sx="100000" w14:sy="100000" w14:kx="0" w14:ky="0" w14:algn="tl">
-                  <w14:schemeClr w14:val="dk1">
-                    <w14:alpha w14:val="60000"/>
-                  </w14:schemeClr>
-                </w14:shadow>
-                <w14:textOutline w14:w="0" w14:cap="flat" w14:cmpd="sng" w14:algn="ctr">
-                  <w14:noFill/>
-                  <w14:prstDash w14:val="solid"/>
-                  <w14:round/>
-                </w14:textOutline>
-              </w:rPr>
-            </w:pPr>
+                <w:sz w:val="44"/>
+                <w:szCs w:val="44"/>
+                <w14:shadow w14:blurRad="38100" w14:dist="19050" w14:dir="2700000" w14:sx="100000" w14:sy="100000" w14:kx="0" w14:ky="0" w14:algn="tl">
+                  <w14:schemeClr w14:val="dk1">
+                    <w14:alpha w14:val="60000"/>
+                  </w14:schemeClr>
+                </w14:shadow>
+                <w14:textOutline w14:w="0" w14:cap="flat" w14:cmpd="sng" w14:algn="ctr">
+                  <w14:noFill/>
+                  <w14:prstDash w14:val="solid"/>
+                  <w14:round/>
+                </w14:textOutline>
+              </w:rPr>
+            </w:pPr>
+            <w:r>
+              <w:rPr>
+                <w:rFonts w:ascii="Times New Roman" w:hAnsi="Times New Roman" w:cs="Times New Roman"/>
+                <w:bCs/>
+                <w:sz w:val="44"/>
+                <w:szCs w:val="44"/>
+                <w14:shadow w14:blurRad="38100" w14:dist="19050" w14:dir="2700000" w14:sx="100000" w14:sy="100000" w14:kx="0" w14:ky="0" w14:algn="tl">
+                  <w14:schemeClr w14:val="dk1">
+                    <w14:alpha w14:val="60000"/>
+                  </w14:schemeClr>
+                </w14:shadow>
+                <w14:textOutline w14:w="0" w14:cap="flat" w14:cmpd="sng" w14:algn="ctr">
+                  <w14:noFill/>
+                  <w14:prstDash w14:val="solid"/>
+                  <w14:round/>
+                </w14:textOutline>
+              </w:rPr>
+              <w:t>CSE 4106</w:t>
+            </w:r>
+          </w:p>
+          <w:p>
+            <w:pPr>
+              <w:jc w:val="center"/>
+              <w:rPr>
+                <w:rFonts w:ascii="Times New Roman" w:hAnsi="Times New Roman" w:cs="Times New Roman"/>
+                <w:bCs/>
+                <w:color w:val="000000" w:themeColor="text1"/>
+                <w:sz w:val="44"/>
+                <w:szCs w:val="44"/>
+                <w14:shadow w14:blurRad="38100" w14:dist="19050" w14:dir="2700000" w14:sx="100000" w14:sy="100000" w14:kx="0" w14:ky="0" w14:algn="tl">
+                  <w14:schemeClr w14:val="dk1">
+                    <w14:alpha w14:val="60000"/>
+                  </w14:schemeClr>
+                </w14:shadow>
+                <w14:textOutline w14:w="0" w14:cap="flat" w14:cmpd="sng" w14:algn="ctr">
+                  <w14:noFill/>
+                  <w14:prstDash w14:val="solid"/>
+                  <w14:round/>
+                </w14:textOutline>
+              </w:rPr>
+            </w:pPr>
+            <w:r>
+              <w:rPr>
+                <w:rFonts w:ascii="Times New Roman" w:hAnsi="Times New Roman" w:cs="Times New Roman"/>
+                <w:bCs/>
+                <w:color w:val="000000" w:themeColor="text1"/>
+                <w:sz w:val="44"/>
+                <w:szCs w:val="44"/>
+                <w14:shadow w14:blurRad="38100" w14:dist="19050" w14:dir="2700000" w14:sx="100000" w14:sy="100000" w14:kx="0" w14:ky="0" w14:algn="tl">
+                  <w14:schemeClr w14:val="dk1">
+                    <w14:alpha w14:val="60000"/>
+                  </w14:schemeClr>
+                </w14:shadow>
+                <w14:textOutline w14:w="0" w14:cap="flat" w14:cmpd="sng" w14:algn="ctr">
+                  <w14:noFill/>
+                  <w14:prstDash w14:val="solid"/>
+                  <w14:round/>
+                </w14:textOutline>
+              </w:rPr>
+              <w:t xml:space="preserve">Room no. </w:t>
+            </w:r>
+            <w:r>
+              <w:rPr>
+                <w:rFonts w:ascii="Times New Roman" w:hAnsi="Times New Roman" w:cs="Times New Roman"/>
+                <w:bCs/>
+                <w:color w:val="000000" w:themeColor="text1"/>
+                <w:sz w:val="44"/>
+                <w:szCs w:val="44"/>
+                <w14:shadow w14:blurRad="38100" w14:dist="19050" w14:dir="2700000" w14:sx="100000" w14:sy="100000" w14:kx="0" w14:ky="0" w14:algn="tl">
+                  <w14:schemeClr w14:val="dk1">
+                    <w14:alpha w14:val="60000"/>
+                  </w14:schemeClr>
+                </w14:shadow>
+                <w14:textOutline w14:w="0" w14:cap="flat" w14:cmpd="sng" w14:algn="ctr">
+                  <w14:noFill/>
+                  <w14:prstDash w14:val="solid"/>
+                  <w14:round/>
+                </w14:textOutline>
+              </w:rPr>
+              <w:t>704</w:t>
+            </w:r>
+          </w:p>
+          <w:p>
+            <w:pPr>
+              <w:jc w:val="center"/>
+              <w:rPr>
+                <w:rFonts w:ascii="Times New Roman" w:hAnsi="Times New Roman" w:cs="Times New Roman"/>
+                <w:bCs/>
+                <w:color w:val="000000" w:themeColor="text1"/>
+                <w:sz w:val="44"/>
+                <w:szCs w:val="44"/>
+                <w14:shadow w14:blurRad="38100" w14:dist="19050" w14:dir="2700000" w14:sx="100000" w14:sy="100000" w14:kx="0" w14:ky="0" w14:algn="tl">
+                  <w14:schemeClr w14:val="dk1">
+                    <w14:alpha w14:val="60000"/>
+                  </w14:schemeClr>
+                </w14:shadow>
+                <w14:textOutline w14:w="0" w14:cap="flat" w14:cmpd="sng" w14:algn="ctr">
+                  <w14:noFill/>
+                  <w14:prstDash w14:val="solid"/>
+                  <w14:round/>
+                </w14:textOutline>
+              </w:rPr>
+            </w:pPr>
+            <w:r>
+              <w:rPr>
+                <w:rFonts w:ascii="Times New Roman" w:hAnsi="Times New Roman" w:cs="Times New Roman"/>
+                <w:bCs/>
+                <w:color w:val="000000" w:themeColor="text1"/>
+                <w:sz w:val="44"/>
+                <w:szCs w:val="44"/>
+                <w14:shadow w14:blurRad="38100" w14:dist="19050" w14:dir="2700000" w14:sx="100000" w14:sy="100000" w14:kx="0" w14:ky="0" w14:algn="tl">
+                  <w14:schemeClr w14:val="dk1">
+                    <w14:alpha w14:val="60000"/>
+                  </w14:schemeClr>
+                </w14:shadow>
+                <w14:textOutline w14:w="0" w14:cap="flat" w14:cmpd="sng" w14:algn="ctr">
+                  <w14:noFill/>
+                  <w14:prstDash w14:val="solid"/>
+                  <w14:round/>
+                </w14:textOutline>
+              </w:rPr>
+              <w:t>Shanta ma’am</w:t>
+            </w:r>
           </w:p>
         </w:tc>
         <w:tc>
@@ -3300,27 +3503,7 @@
                   <w14:round/>
                 </w14:textOutline>
               </w:rPr>
-              <w:t xml:space="preserve">Room no. </w:t>
-            </w:r>
-            <w:r>
-              <w:rPr>
-                <w:rFonts w:ascii="Times New Roman" w:hAnsi="Times New Roman" w:cs="Times New Roman"/>
-                <w:bCs/>
-                <w:color w:val="000000" w:themeColor="text1"/>
-                <w:sz w:val="44"/>
-                <w:szCs w:val="44"/>
-                <w14:shadow w14:blurRad="38100" w14:dist="19050" w14:dir="2700000" w14:sx="100000" w14:sy="100000" w14:kx="0" w14:ky="0" w14:algn="tl">
-                  <w14:schemeClr w14:val="dk1">
-                    <w14:alpha w14:val="60000"/>
-                  </w14:schemeClr>
-                </w14:shadow>
-                <w14:textOutline w14:w="0" w14:cap="flat" w14:cmpd="sng" w14:algn="ctr">
-                  <w14:noFill/>
-                  <w14:prstDash w14:val="solid"/>
-                  <w14:round/>
-                </w14:textOutline>
-              </w:rPr>
-              <w:t>709</w:t>
+              <w:t>Alternate Weeks</w:t>
             </w:r>
           </w:p>
           <w:p>
@@ -3704,127 +3887,6 @@
               <w:rPr>
                 <w:rFonts w:ascii="Times New Roman" w:hAnsi="Times New Roman" w:cs="Times New Roman"/>
                 <w:bCs/>
-                <w:sz w:val="44"/>
-                <w:szCs w:val="44"/>
-                <w14:shadow w14:blurRad="38100" w14:dist="19050" w14:dir="2700000" w14:sx="100000" w14:sy="100000" w14:kx="0" w14:ky="0" w14:algn="tl">
-                  <w14:schemeClr w14:val="dk1">
-                    <w14:alpha w14:val="60000"/>
-                  </w14:schemeClr>
-                </w14:shadow>
-                <w14:textOutline w14:w="0" w14:cap="flat" w14:cmpd="sng" w14:algn="ctr">
-                  <w14:noFill/>
-                  <w14:prstDash w14:val="solid"/>
-                  <w14:round/>
-                </w14:textOutline>
-              </w:rPr>
-            </w:pPr>
-            <w:r>
-              <w:rPr>
-                <w:rFonts w:ascii="Times New Roman" w:hAnsi="Times New Roman" w:cs="Times New Roman"/>
-                <w:bCs/>
-                <w:sz w:val="44"/>
-                <w:szCs w:val="44"/>
-                <w14:shadow w14:blurRad="38100" w14:dist="19050" w14:dir="2700000" w14:sx="100000" w14:sy="100000" w14:kx="0" w14:ky="0" w14:algn="tl">
-                  <w14:schemeClr w14:val="dk1">
-                    <w14:alpha w14:val="60000"/>
-                  </w14:schemeClr>
-                </w14:shadow>
-                <w14:textOutline w14:w="0" w14:cap="flat" w14:cmpd="sng" w14:algn="ctr">
-                  <w14:noFill/>
-                  <w14:prstDash w14:val="solid"/>
-                  <w14:round/>
-                </w14:textOutline>
-              </w:rPr>
-              <w:t>CSE 410</w:t>
-            </w:r>
-            <w:r>
-              <w:rPr>
-                <w:rFonts w:ascii="Times New Roman" w:hAnsi="Times New Roman" w:cs="Times New Roman"/>
-                <w:bCs/>
-                <w:sz w:val="44"/>
-                <w:szCs w:val="44"/>
-                <w14:shadow w14:blurRad="38100" w14:dist="19050" w14:dir="2700000" w14:sx="100000" w14:sy="100000" w14:kx="0" w14:ky="0" w14:algn="tl">
-                  <w14:schemeClr w14:val="dk1">
-                    <w14:alpha w14:val="60000"/>
-                  </w14:schemeClr>
-                </w14:shadow>
-                <w14:textOutline w14:w="0" w14:cap="flat" w14:cmpd="sng" w14:algn="ctr">
-                  <w14:noFill/>
-                  <w14:prstDash w14:val="solid"/>
-                  <w14:round/>
-                </w14:textOutline>
-              </w:rPr>
-              <w:t>6</w:t>
-            </w:r>
-          </w:p>
-          <w:p>
-            <w:pPr>
-              <w:jc w:val="center"/>
-              <w:rPr>
-                <w:rFonts w:ascii="Times New Roman" w:hAnsi="Times New Roman" w:cs="Times New Roman"/>
-                <w:bCs/>
-                <w:color w:val="000000" w:themeColor="text1"/>
-                <w:sz w:val="44"/>
-                <w:szCs w:val="44"/>
-                <w14:shadow w14:blurRad="38100" w14:dist="19050" w14:dir="2700000" w14:sx="100000" w14:sy="100000" w14:kx="0" w14:ky="0" w14:algn="tl">
-                  <w14:schemeClr w14:val="dk1">
-                    <w14:alpha w14:val="60000"/>
-                  </w14:schemeClr>
-                </w14:shadow>
-                <w14:textOutline w14:w="0" w14:cap="flat" w14:cmpd="sng" w14:algn="ctr">
-                  <w14:noFill/>
-                  <w14:prstDash w14:val="solid"/>
-                  <w14:round/>
-                </w14:textOutline>
-              </w:rPr>
-            </w:pPr>
-            <w:r>
-              <w:rPr>
-                <w:rFonts w:ascii="Times New Roman" w:hAnsi="Times New Roman" w:cs="Times New Roman"/>
-                <w:bCs/>
-                <w:color w:val="000000" w:themeColor="text1"/>
-                <w:sz w:val="44"/>
-                <w:szCs w:val="44"/>
-                <w14:shadow w14:blurRad="38100" w14:dist="19050" w14:dir="2700000" w14:sx="100000" w14:sy="100000" w14:kx="0" w14:ky="0" w14:algn="tl">
-                  <w14:schemeClr w14:val="dk1">
-                    <w14:alpha w14:val="60000"/>
-                  </w14:schemeClr>
-                </w14:shadow>
-                <w14:textOutline w14:w="0" w14:cap="flat" w14:cmpd="sng" w14:algn="ctr">
-                  <w14:noFill/>
-                  <w14:prstDash w14:val="solid"/>
-                  <w14:round/>
-                </w14:textOutline>
-              </w:rPr>
-              <w:t xml:space="preserve">Room no. </w:t>
-            </w:r>
-            <w:r>
-              <w:rPr>
-                <w:rFonts w:ascii="Times New Roman" w:hAnsi="Times New Roman" w:cs="Times New Roman"/>
-                <w:bCs/>
-                <w:color w:val="000000" w:themeColor="text1"/>
-                <w:sz w:val="44"/>
-                <w:szCs w:val="44"/>
-                <w14:shadow w14:blurRad="38100" w14:dist="19050" w14:dir="2700000" w14:sx="100000" w14:sy="100000" w14:kx="0" w14:ky="0" w14:algn="tl">
-                  <w14:schemeClr w14:val="dk1">
-                    <w14:alpha w14:val="60000"/>
-                  </w14:schemeClr>
-                </w14:shadow>
-                <w14:textOutline w14:w="0" w14:cap="flat" w14:cmpd="sng" w14:algn="ctr">
-                  <w14:noFill/>
-                  <w14:prstDash w14:val="solid"/>
-                  <w14:round/>
-                </w14:textOutline>
-              </w:rPr>
-              <w:t>704</w:t>
-            </w:r>
-          </w:p>
-          <w:p>
-            <w:pPr>
-              <w:jc w:val="center"/>
-              <w:rPr>
-                <w:rFonts w:ascii="Times New Roman" w:hAnsi="Times New Roman" w:cs="Times New Roman"/>
-                <w:bCs/>
                 <w:color w:val="4472C4" w:themeColor="accent1"/>
                 <w:sz w:val="44"/>
                 <w:szCs w:val="44"/>
@@ -3840,46 +3902,6 @@
                 </w14:textOutline>
               </w:rPr>
             </w:pPr>
-            <w:r>
-              <w:rPr>
-                <w:rFonts w:ascii="Times New Roman" w:hAnsi="Times New Roman" w:cs="Times New Roman"/>
-                <w:bCs/>
-                <w:color w:val="000000" w:themeColor="text1"/>
-                <w:sz w:val="44"/>
-                <w:szCs w:val="44"/>
-                <w14:shadow w14:blurRad="38100" w14:dist="19050" w14:dir="2700000" w14:sx="100000" w14:sy="100000" w14:kx="0" w14:ky="0" w14:algn="tl">
-                  <w14:schemeClr w14:val="dk1">
-                    <w14:alpha w14:val="60000"/>
-                  </w14:schemeClr>
-                </w14:shadow>
-                <w14:textOutline w14:w="0" w14:cap="flat" w14:cmpd="sng" w14:algn="ctr">
-                  <w14:noFill/>
-                  <w14:prstDash w14:val="solid"/>
-                  <w14:round/>
-                </w14:textOutline>
-              </w:rPr>
-              <w:t>Shanta</w:t>
-            </w:r>
-            <w:r>
-              <w:rPr>
-                <w:rFonts w:ascii="Times New Roman" w:hAnsi="Times New Roman" w:cs="Times New Roman"/>
-                <w:bCs/>
-                <w:color w:val="000000" w:themeColor="text1"/>
-                <w:sz w:val="44"/>
-                <w:szCs w:val="44"/>
-                <w14:shadow w14:blurRad="38100" w14:dist="19050" w14:dir="2700000" w14:sx="100000" w14:sy="100000" w14:kx="0" w14:ky="0" w14:algn="tl">
-                  <w14:schemeClr w14:val="dk1">
-                    <w14:alpha w14:val="60000"/>
-                  </w14:schemeClr>
-                </w14:shadow>
-                <w14:textOutline w14:w="0" w14:cap="flat" w14:cmpd="sng" w14:algn="ctr">
-                  <w14:noFill/>
-                  <w14:prstDash w14:val="solid"/>
-                  <w14:round/>
-                </w14:textOutline>
-              </w:rPr>
-              <w:t xml:space="preserve"> ma’am</w:t>
-            </w:r>
           </w:p>
         </w:tc>
         <w:tc>
@@ -4518,27 +4540,7 @@
                   <w14:round/>
                 </w14:textOutline>
               </w:rPr>
-              <w:t>41</w:t>
-            </w:r>
-            <w:r>
-              <w:rPr>
-                <w:rFonts w:ascii="Times New Roman" w:hAnsi="Times New Roman" w:cs="Times New Roman"/>
-                <w:bCs/>
-                <w:color w:val="000000" w:themeColor="text1"/>
-                <w:sz w:val="44"/>
-                <w:szCs w:val="44"/>
-                <w14:shadow w14:blurRad="38100" w14:dist="19050" w14:dir="2700000" w14:sx="100000" w14:sy="100000" w14:kx="0" w14:ky="0" w14:algn="tl">
-                  <w14:schemeClr w14:val="dk1">
-                    <w14:alpha w14:val="60000"/>
-                  </w14:schemeClr>
-                </w14:shadow>
-                <w14:textOutline w14:w="0" w14:cap="flat" w14:cmpd="sng" w14:algn="ctr">
-                  <w14:noFill/>
-                  <w14:prstDash w14:val="solid"/>
-                  <w14:round/>
-                </w14:textOutline>
-              </w:rPr>
-              <w:t>4</w:t>
+              <w:t>414</w:t>
             </w:r>
           </w:p>
           <w:p>
@@ -4632,143 +4634,21 @@
               <w:rPr>
                 <w:rFonts w:ascii="Times New Roman" w:hAnsi="Times New Roman" w:cs="Times New Roman"/>
                 <w:bCs/>
-                <w:sz w:val="44"/>
-                <w:szCs w:val="44"/>
-                <w14:shadow w14:blurRad="38100" w14:dist="19050" w14:dir="2700000" w14:sx="100000" w14:sy="100000" w14:kx="0" w14:ky="0" w14:algn="tl">
-                  <w14:schemeClr w14:val="dk1">
-                    <w14:alpha w14:val="60000"/>
-                  </w14:schemeClr>
-                </w14:shadow>
-                <w14:textOutline w14:w="0" w14:cap="flat" w14:cmpd="sng" w14:algn="ctr">
-                  <w14:noFill/>
-                  <w14:prstDash w14:val="solid"/>
-                  <w14:round/>
-                </w14:textOutline>
-              </w:rPr>
-            </w:pPr>
-            <w:r>
-              <w:rPr>
-                <w:rFonts w:ascii="Times New Roman" w:hAnsi="Times New Roman" w:cs="Times New Roman"/>
-                <w:bCs/>
-                <w:sz w:val="44"/>
-                <w:szCs w:val="44"/>
-                <w14:shadow w14:blurRad="38100" w14:dist="19050" w14:dir="2700000" w14:sx="100000" w14:sy="100000" w14:kx="0" w14:ky="0" w14:algn="tl">
-                  <w14:schemeClr w14:val="dk1">
-                    <w14:alpha w14:val="60000"/>
-                  </w14:schemeClr>
-                </w14:shadow>
-                <w14:textOutline w14:w="0" w14:cap="flat" w14:cmpd="sng" w14:algn="ctr">
-                  <w14:noFill/>
-                  <w14:prstDash w14:val="solid"/>
-                  <w14:round/>
-                </w14:textOutline>
-              </w:rPr>
-              <w:t>CSE 4106</w:t>
-            </w:r>
-          </w:p>
-          <w:p>
-            <w:pPr>
-              <w:jc w:val="center"/>
-              <w:rPr>
-                <w:rFonts w:ascii="Times New Roman" w:hAnsi="Times New Roman" w:cs="Times New Roman"/>
-                <w:bCs/>
-                <w:color w:val="000000" w:themeColor="text1"/>
-                <w:sz w:val="44"/>
-                <w:szCs w:val="44"/>
-                <w14:shadow w14:blurRad="38100" w14:dist="19050" w14:dir="2700000" w14:sx="100000" w14:sy="100000" w14:kx="0" w14:ky="0" w14:algn="tl">
-                  <w14:schemeClr w14:val="dk1">
-                    <w14:alpha w14:val="60000"/>
-                  </w14:schemeClr>
-                </w14:shadow>
-                <w14:textOutline w14:w="0" w14:cap="flat" w14:cmpd="sng" w14:algn="ctr">
-                  <w14:noFill/>
-                  <w14:prstDash w14:val="solid"/>
-                  <w14:round/>
-                </w14:textOutline>
-              </w:rPr>
-            </w:pPr>
-            <w:r>
-              <w:rPr>
-                <w:rFonts w:ascii="Times New Roman" w:hAnsi="Times New Roman" w:cs="Times New Roman"/>
-                <w:bCs/>
-                <w:color w:val="000000" w:themeColor="text1"/>
-                <w:sz w:val="44"/>
-                <w:szCs w:val="44"/>
-                <w14:shadow w14:blurRad="38100" w14:dist="19050" w14:dir="2700000" w14:sx="100000" w14:sy="100000" w14:kx="0" w14:ky="0" w14:algn="tl">
-                  <w14:schemeClr w14:val="dk1">
-                    <w14:alpha w14:val="60000"/>
-                  </w14:schemeClr>
-                </w14:shadow>
-                <w14:textOutline w14:w="0" w14:cap="flat" w14:cmpd="sng" w14:algn="ctr">
-                  <w14:noFill/>
-                  <w14:prstDash w14:val="solid"/>
-                  <w14:round/>
-                </w14:textOutline>
-              </w:rPr>
-              <w:t xml:space="preserve">Room no. </w:t>
-            </w:r>
-            <w:r>
-              <w:rPr>
-                <w:rFonts w:ascii="Times New Roman" w:hAnsi="Times New Roman" w:cs="Times New Roman"/>
-                <w:bCs/>
-                <w:color w:val="000000" w:themeColor="text1"/>
-                <w:sz w:val="44"/>
-                <w:szCs w:val="44"/>
-                <w14:shadow w14:blurRad="38100" w14:dist="19050" w14:dir="2700000" w14:sx="100000" w14:sy="100000" w14:kx="0" w14:ky="0" w14:algn="tl">
-                  <w14:schemeClr w14:val="dk1">
-                    <w14:alpha w14:val="60000"/>
-                  </w14:schemeClr>
-                </w14:shadow>
-                <w14:textOutline w14:w="0" w14:cap="flat" w14:cmpd="sng" w14:algn="ctr">
-                  <w14:noFill/>
-                  <w14:prstDash w14:val="solid"/>
-                  <w14:round/>
-                </w14:textOutline>
-              </w:rPr>
-              <w:t>704</w:t>
-            </w:r>
-          </w:p>
-          <w:p>
-            <w:pPr>
-              <w:jc w:val="center"/>
-              <w:rPr>
-                <w:rFonts w:ascii="Times New Roman" w:hAnsi="Times New Roman" w:cs="Times New Roman"/>
-                <w:bCs/>
-                <w:color w:val="000000" w:themeColor="text1"/>
-                <w:sz w:val="44"/>
-                <w:szCs w:val="44"/>
-                <w14:shadow w14:blurRad="38100" w14:dist="19050" w14:dir="2700000" w14:sx="100000" w14:sy="100000" w14:kx="0" w14:ky="0" w14:algn="tl">
-                  <w14:schemeClr w14:val="dk1">
-                    <w14:alpha w14:val="60000"/>
-                  </w14:schemeClr>
-                </w14:shadow>
-                <w14:textOutline w14:w="0" w14:cap="flat" w14:cmpd="sng" w14:algn="ctr">
-                  <w14:noFill/>
-                  <w14:prstDash w14:val="solid"/>
-                  <w14:round/>
-                </w14:textOutline>
-              </w:rPr>
-            </w:pPr>
-            <w:r>
-              <w:rPr>
-                <w:rFonts w:ascii="Times New Roman" w:hAnsi="Times New Roman" w:cs="Times New Roman"/>
-                <w:bCs/>
-                <w:color w:val="000000" w:themeColor="text1"/>
-                <w:sz w:val="44"/>
-                <w:szCs w:val="44"/>
-                <w14:shadow w14:blurRad="38100" w14:dist="19050" w14:dir="2700000" w14:sx="100000" w14:sy="100000" w14:kx="0" w14:ky="0" w14:algn="tl">
-                  <w14:schemeClr w14:val="dk1">
-                    <w14:alpha w14:val="60000"/>
-                  </w14:schemeClr>
-                </w14:shadow>
-                <w14:textOutline w14:w="0" w14:cap="flat" w14:cmpd="sng" w14:algn="ctr">
-                  <w14:noFill/>
-                  <w14:prstDash w14:val="solid"/>
-                  <w14:round/>
-                </w14:textOutline>
-              </w:rPr>
-              <w:t>Shanta ma’am</w:t>
-            </w:r>
+                <w:color w:val="000000" w:themeColor="text1"/>
+                <w:sz w:val="44"/>
+                <w:szCs w:val="44"/>
+                <w14:shadow w14:blurRad="38100" w14:dist="19050" w14:dir="2700000" w14:sx="100000" w14:sy="100000" w14:kx="0" w14:ky="0" w14:algn="tl">
+                  <w14:schemeClr w14:val="dk1">
+                    <w14:alpha w14:val="60000"/>
+                  </w14:schemeClr>
+                </w14:shadow>
+                <w14:textOutline w14:w="0" w14:cap="flat" w14:cmpd="sng" w14:algn="ctr">
+                  <w14:noFill/>
+                  <w14:prstDash w14:val="solid"/>
+                  <w14:round/>
+                </w14:textOutline>
+              </w:rPr>
+            </w:pPr>
           </w:p>
         </w:tc>
         <w:tc>
@@ -5061,26 +4941,7 @@
                   <w14:round/>
                 </w14:textOutline>
               </w:rPr>
-              <w:t>410</w:t>
-            </w:r>
-            <w:r>
-              <w:rPr>
-                <w:rFonts w:ascii="Times New Roman" w:hAnsi="Times New Roman" w:cs="Times New Roman"/>
-                <w:bCs/>
-                <w:sz w:val="44"/>
-                <w:szCs w:val="44"/>
-                <w14:shadow w14:blurRad="38100" w14:dist="19050" w14:dir="2700000" w14:sx="100000" w14:sy="100000" w14:kx="0" w14:ky="0" w14:algn="tl">
-                  <w14:schemeClr w14:val="dk1">
-                    <w14:alpha w14:val="60000"/>
-                  </w14:schemeClr>
-                </w14:shadow>
-                <w14:textOutline w14:w="0" w14:cap="flat" w14:cmpd="sng" w14:algn="ctr">
-                  <w14:noFill/>
-                  <w14:prstDash w14:val="solid"/>
-                  <w14:round/>
-                </w14:textOutline>
-              </w:rPr>
-              <w:t>3</w:t>
+              <w:t>4103</w:t>
             </w:r>
           </w:p>
           <w:p>
@@ -5142,27 +5003,7 @@
                   <w14:round/>
                 </w14:textOutline>
               </w:rPr>
-              <w:t>70</w:t>
-            </w:r>
-            <w:r>
-              <w:rPr>
-                <w:rFonts w:ascii="Times New Roman" w:hAnsi="Times New Roman" w:cs="Times New Roman"/>
-                <w:bCs/>
-                <w:color w:val="000000" w:themeColor="text1"/>
-                <w:sz w:val="44"/>
-                <w:szCs w:val="44"/>
-                <w14:shadow w14:blurRad="38100" w14:dist="19050" w14:dir="2700000" w14:sx="100000" w14:sy="100000" w14:kx="0" w14:ky="0" w14:algn="tl">
-                  <w14:schemeClr w14:val="dk1">
-                    <w14:alpha w14:val="60000"/>
-                  </w14:schemeClr>
-                </w14:shadow>
-                <w14:textOutline w14:w="0" w14:cap="flat" w14:cmpd="sng" w14:algn="ctr">
-                  <w14:noFill/>
-                  <w14:prstDash w14:val="solid"/>
-                  <w14:round/>
-                </w14:textOutline>
-              </w:rPr>
-              <w:t>1</w:t>
+              <w:t>701</w:t>
             </w:r>
           </w:p>
           <w:p>
@@ -5255,26 +5096,7 @@
                   <w14:round/>
                 </w14:textOutline>
               </w:rPr>
-              <w:t>CSE 41</w:t>
-            </w:r>
-            <w:r>
-              <w:rPr>
-                <w:rFonts w:ascii="Times New Roman" w:hAnsi="Times New Roman" w:cs="Times New Roman"/>
-                <w:bCs/>
-                <w:sz w:val="44"/>
-                <w:szCs w:val="44"/>
-                <w14:shadow w14:blurRad="38100" w14:dist="19050" w14:dir="2700000" w14:sx="100000" w14:sy="100000" w14:kx="0" w14:ky="0" w14:algn="tl">
-                  <w14:schemeClr w14:val="dk1">
-                    <w14:alpha w14:val="60000"/>
-                  </w14:schemeClr>
-                </w14:shadow>
-                <w14:textOutline w14:w="0" w14:cap="flat" w14:cmpd="sng" w14:algn="ctr">
-                  <w14:noFill/>
-                  <w14:prstDash w14:val="solid"/>
-                  <w14:round/>
-                </w14:textOutline>
-              </w:rPr>
-              <w:t>05</w:t>
+              <w:t>CSE 4105</w:t>
             </w:r>
           </w:p>
           <w:p>
@@ -5511,27 +5333,7 @@
                   <w14:round/>
                 </w14:textOutline>
               </w:rPr>
-              <w:t>31</w:t>
-            </w:r>
-            <w:r>
-              <w:rPr>
-                <w:rFonts w:ascii="Times New Roman" w:hAnsi="Times New Roman" w:cs="Times New Roman"/>
-                <w:bCs/>
-                <w:color w:val="000000" w:themeColor="text1"/>
-                <w:sz w:val="44"/>
-                <w:szCs w:val="44"/>
-                <w14:shadow w14:blurRad="38100" w14:dist="19050" w14:dir="2700000" w14:sx="100000" w14:sy="100000" w14:kx="0" w14:ky="0" w14:algn="tl">
-                  <w14:schemeClr w14:val="dk1">
-                    <w14:alpha w14:val="60000"/>
-                  </w14:schemeClr>
-                </w14:shadow>
-                <w14:textOutline w14:w="0" w14:cap="flat" w14:cmpd="sng" w14:algn="ctr">
-                  <w14:noFill/>
-                  <w14:prstDash w14:val="solid"/>
-                  <w14:round/>
-                </w14:textOutline>
-              </w:rPr>
-              <w:t>1</w:t>
+              <w:t>311</w:t>
             </w:r>
           </w:p>
           <w:p>
@@ -6226,7 +6028,7 @@
   <w:style w:type="paragraph" w:default="1" w:styleId="Normal">
     <w:name w:val="Normal"/>
     <w:qFormat/>
-    <w:rsid w:val="00BC406A"/>
+    <w:rsid w:val="00EB0687"/>
   </w:style>
   <w:style w:type="character" w:default="1" w:styleId="DefaultParagraphFont">
     <w:name w:val="Default Paragraph Font"/>

</xml_diff>

<commit_message>
Update CSE-20 Fall-25 routine documents
Revised the PDF, DOCX, and PNG files for the CSE-20 Fall-25 class routine to reflect the latest schedule and template changes effective from July 20, 2025.
</commit_message>
<xml_diff>
--- a/Routine/CSE-20_Routine Tamplate - Copy.docx
+++ b/Routine/CSE-20_Routine Tamplate - Copy.docx
@@ -3461,49 +3461,69 @@
                   <w14:round/>
                 </w14:textOutline>
               </w:rPr>
-              <w:t>4104</w:t>
-            </w:r>
-          </w:p>
-          <w:p>
-            <w:pPr>
-              <w:jc w:val="center"/>
-              <w:rPr>
-                <w:rFonts w:ascii="Times New Roman" w:hAnsi="Times New Roman" w:cs="Times New Roman"/>
-                <w:bCs/>
-                <w:color w:val="000000" w:themeColor="text1"/>
-                <w:sz w:val="44"/>
-                <w:szCs w:val="44"/>
-                <w14:shadow w14:blurRad="38100" w14:dist="19050" w14:dir="2700000" w14:sx="100000" w14:sy="100000" w14:kx="0" w14:ky="0" w14:algn="tl">
-                  <w14:schemeClr w14:val="dk1">
-                    <w14:alpha w14:val="60000"/>
-                  </w14:schemeClr>
-                </w14:shadow>
-                <w14:textOutline w14:w="0" w14:cap="flat" w14:cmpd="sng" w14:algn="ctr">
-                  <w14:noFill/>
-                  <w14:prstDash w14:val="solid"/>
-                  <w14:round/>
-                </w14:textOutline>
-              </w:rPr>
-            </w:pPr>
-            <w:r>
-              <w:rPr>
-                <w:rFonts w:ascii="Times New Roman" w:hAnsi="Times New Roman" w:cs="Times New Roman"/>
-                <w:bCs/>
-                <w:color w:val="000000" w:themeColor="text1"/>
-                <w:sz w:val="44"/>
-                <w:szCs w:val="44"/>
-                <w14:shadow w14:blurRad="38100" w14:dist="19050" w14:dir="2700000" w14:sx="100000" w14:sy="100000" w14:kx="0" w14:ky="0" w14:algn="tl">
-                  <w14:schemeClr w14:val="dk1">
-                    <w14:alpha w14:val="60000"/>
-                  </w14:schemeClr>
-                </w14:shadow>
-                <w14:textOutline w14:w="0" w14:cap="flat" w14:cmpd="sng" w14:algn="ctr">
-                  <w14:noFill/>
-                  <w14:prstDash w14:val="solid"/>
-                  <w14:round/>
-                </w14:textOutline>
-              </w:rPr>
-              <w:t>Alternate Weeks</w:t>
+              <w:t>4103</w:t>
+            </w:r>
+          </w:p>
+          <w:p>
+            <w:pPr>
+              <w:jc w:val="center"/>
+              <w:rPr>
+                <w:rFonts w:ascii="Times New Roman" w:hAnsi="Times New Roman" w:cs="Times New Roman"/>
+                <w:bCs/>
+                <w:color w:val="000000" w:themeColor="text1"/>
+                <w:sz w:val="44"/>
+                <w:szCs w:val="44"/>
+                <w14:shadow w14:blurRad="38100" w14:dist="19050" w14:dir="2700000" w14:sx="100000" w14:sy="100000" w14:kx="0" w14:ky="0" w14:algn="tl">
+                  <w14:schemeClr w14:val="dk1">
+                    <w14:alpha w14:val="60000"/>
+                  </w14:schemeClr>
+                </w14:shadow>
+                <w14:textOutline w14:w="0" w14:cap="flat" w14:cmpd="sng" w14:algn="ctr">
+                  <w14:noFill/>
+                  <w14:prstDash w14:val="solid"/>
+                  <w14:round/>
+                </w14:textOutline>
+              </w:rPr>
+            </w:pPr>
+            <w:r>
+              <w:rPr>
+                <w:rFonts w:ascii="Times New Roman" w:hAnsi="Times New Roman" w:cs="Times New Roman"/>
+                <w:bCs/>
+                <w:color w:val="000000" w:themeColor="text1"/>
+                <w:sz w:val="44"/>
+                <w:szCs w:val="44"/>
+                <w14:shadow w14:blurRad="38100" w14:dist="19050" w14:dir="2700000" w14:sx="100000" w14:sy="100000" w14:kx="0" w14:ky="0" w14:algn="tl">
+                  <w14:schemeClr w14:val="dk1">
+                    <w14:alpha w14:val="60000"/>
+                  </w14:schemeClr>
+                </w14:shadow>
+                <w14:textOutline w14:w="0" w14:cap="flat" w14:cmpd="sng" w14:algn="ctr">
+                  <w14:noFill/>
+                  <w14:prstDash w14:val="solid"/>
+                  <w14:round/>
+                </w14:textOutline>
+              </w:rPr>
+              <w:t xml:space="preserve">Room no. </w:t>
+            </w:r>
+            <w:r>
+              <w:rPr>
+                <w:rFonts w:ascii="Times New Roman" w:hAnsi="Times New Roman" w:cs="Times New Roman"/>
+                <w:bCs/>
+                <w:color w:val="000000" w:themeColor="text1"/>
+                <w:sz w:val="44"/>
+                <w:szCs w:val="44"/>
+                <w14:shadow w14:blurRad="38100" w14:dist="19050" w14:dir="2700000" w14:sx="100000" w14:sy="100000" w14:kx="0" w14:ky="0" w14:algn="tl">
+                  <w14:schemeClr w14:val="dk1">
+                    <w14:alpha w14:val="60000"/>
+                  </w14:schemeClr>
+                </w14:shadow>
+                <w14:textOutline w14:w="0" w14:cap="flat" w14:cmpd="sng" w14:algn="ctr">
+                  <w14:noFill/>
+                  <w14:prstDash w14:val="solid"/>
+                  <w14:round/>
+                </w14:textOutline>
+              </w:rPr>
+              <w:t>607</w:t>
             </w:r>
           </w:p>
           <w:p>
@@ -4332,27 +4352,7 @@
                   <w14:round/>
                 </w14:textOutline>
               </w:rPr>
-              <w:t xml:space="preserve">Room no. </w:t>
-            </w:r>
-            <w:r>
-              <w:rPr>
-                <w:rFonts w:ascii="Times New Roman" w:hAnsi="Times New Roman" w:cs="Times New Roman"/>
-                <w:bCs/>
-                <w:color w:val="000000" w:themeColor="text1"/>
-                <w:sz w:val="44"/>
-                <w:szCs w:val="44"/>
-                <w14:shadow w14:blurRad="38100" w14:dist="19050" w14:dir="2700000" w14:sx="100000" w14:sy="100000" w14:kx="0" w14:ky="0" w14:algn="tl">
-                  <w14:schemeClr w14:val="dk1">
-                    <w14:alpha w14:val="60000"/>
-                  </w14:schemeClr>
-                </w14:shadow>
-                <w14:textOutline w14:w="0" w14:cap="flat" w14:cmpd="sng" w14:algn="ctr">
-                  <w14:noFill/>
-                  <w14:prstDash w14:val="solid"/>
-                  <w14:round/>
-                </w14:textOutline>
-              </w:rPr>
-              <w:t>709</w:t>
+              <w:t>Alternate Weeks</w:t>
             </w:r>
           </w:p>
           <w:p>
@@ -4941,7 +4941,7 @@
                   <w14:round/>
                 </w14:textOutline>
               </w:rPr>
-              <w:t>4103</w:t>
+              <w:t>4104</w:t>
             </w:r>
           </w:p>
           <w:p>
@@ -5003,7 +5003,7 @@
                   <w14:round/>
                 </w14:textOutline>
               </w:rPr>
-              <w:t>701</w:t>
+              <w:t>709</w:t>
             </w:r>
           </w:p>
           <w:p>

</xml_diff>

<commit_message>
Update CSE-20 routine and course documents
Removed outdated CSE-20 and CSE19 routine and course files, and added the new CSE-20 Class Routine for Spring-26. Updated the CSE-20 routine template document.
</commit_message>
<xml_diff>
--- a/Routine/CSE-20_Routine Tamplate - Copy.docx
+++ b/Routine/CSE-20_Routine Tamplate - Copy.docx
@@ -253,7 +253,7 @@
             <w14:round/>
           </w14:textOutline>
         </w:rPr>
-        <w:t>Fall</w:t>
+        <w:t>Spring</w:t>
       </w:r>
       <w:r>
         <w:rPr>
@@ -274,7 +274,28 @@
             <w14:round/>
           </w14:textOutline>
         </w:rPr>
-        <w:t>-25</w:t>
+        <w:t>-2</w:t>
+      </w:r>
+      <w:r>
+        <w:rPr>
+          <w:rFonts w:ascii="Times New Roman" w:hAnsi="Times New Roman" w:cs="Times New Roman"/>
+          <w:b/>
+          <w:bCs/>
+          <w:color w:val="4472C4" w:themeColor="accent1"/>
+          <w:sz w:val="44"/>
+          <w:szCs w:val="44"/>
+          <w14:shadow w14:blurRad="38100" w14:dist="25400" w14:dir="5400000" w14:sx="100000" w14:sy="100000" w14:kx="0" w14:ky="0" w14:algn="ctr">
+            <w14:srgbClr w14:val="6E747A">
+              <w14:alpha w14:val="57000"/>
+            </w14:srgbClr>
+          </w14:shadow>
+          <w14:textOutline w14:w="0" w14:cap="flat" w14:cmpd="sng" w14:algn="ctr">
+            <w14:noFill/>
+            <w14:prstDash w14:val="solid"/>
+            <w14:round/>
+          </w14:textOutline>
+        </w:rPr>
+        <w:t>6</w:t>
       </w:r>
       <w:r>
         <w:rPr>
@@ -321,7 +342,88 @@
             <w14:round/>
           </w14:textOutline>
         </w:rPr>
-        <w:t>July 20</w:t>
+        <w:t>Janua</w:t>
+      </w:r>
+      <w:r>
+        <w:rPr>
+          <w:rFonts w:ascii="Times New Roman" w:hAnsi="Times New Roman" w:cs="Times New Roman"/>
+          <w:b/>
+          <w:color w:val="4472C4" w:themeColor="accent1"/>
+          <w:sz w:val="44"/>
+          <w:szCs w:val="44"/>
+          <w14:shadow w14:blurRad="38100" w14:dist="25400" w14:dir="5400000" w14:sx="100000" w14:sy="100000" w14:kx="0" w14:ky="0" w14:algn="ctr">
+            <w14:srgbClr w14:val="6E747A">
+              <w14:alpha w14:val="57000"/>
+            </w14:srgbClr>
+          </w14:shadow>
+          <w14:textOutline w14:w="0" w14:cap="flat" w14:cmpd="sng" w14:algn="ctr">
+            <w14:noFill/>
+            <w14:prstDash w14:val="solid"/>
+            <w14:round/>
+          </w14:textOutline>
+        </w:rPr>
+        <w:t>ry</w:t>
+      </w:r>
+      <w:r>
+        <w:rPr>
+          <w:rFonts w:ascii="Times New Roman" w:hAnsi="Times New Roman" w:cs="Times New Roman"/>
+          <w:b/>
+          <w:color w:val="4472C4" w:themeColor="accent1"/>
+          <w:sz w:val="44"/>
+          <w:szCs w:val="44"/>
+          <w14:shadow w14:blurRad="38100" w14:dist="25400" w14:dir="5400000" w14:sx="100000" w14:sy="100000" w14:kx="0" w14:ky="0" w14:algn="ctr">
+            <w14:srgbClr w14:val="6E747A">
+              <w14:alpha w14:val="57000"/>
+            </w14:srgbClr>
+          </w14:shadow>
+          <w14:textOutline w14:w="0" w14:cap="flat" w14:cmpd="sng" w14:algn="ctr">
+            <w14:noFill/>
+            <w14:prstDash w14:val="solid"/>
+            <w14:round/>
+          </w14:textOutline>
+        </w:rPr>
+        <w:t xml:space="preserve"> </w:t>
+      </w:r>
+      <w:r>
+        <w:rPr>
+          <w:rFonts w:ascii="Times New Roman" w:hAnsi="Times New Roman" w:cs="Times New Roman"/>
+          <w:b/>
+          <w:color w:val="4472C4" w:themeColor="accent1"/>
+          <w:sz w:val="44"/>
+          <w:szCs w:val="44"/>
+          <w14:shadow w14:blurRad="38100" w14:dist="25400" w14:dir="5400000" w14:sx="100000" w14:sy="100000" w14:kx="0" w14:ky="0" w14:algn="ctr">
+            <w14:srgbClr w14:val="6E747A">
+              <w14:alpha w14:val="57000"/>
+            </w14:srgbClr>
+          </w14:shadow>
+          <w14:textOutline w14:w="0" w14:cap="flat" w14:cmpd="sng" w14:algn="ctr">
+            <w14:noFill/>
+            <w14:prstDash w14:val="solid"/>
+            <w14:round/>
+          </w14:textOutline>
+        </w:rPr>
+        <w:t>6</w:t>
+      </w:r>
+      <w:r>
+        <w:rPr>
+          <w:rFonts w:ascii="Times New Roman" w:hAnsi="Times New Roman" w:cs="Times New Roman"/>
+          <w:b/>
+          <w:color w:val="4472C4" w:themeColor="accent1"/>
+          <w:sz w:val="44"/>
+          <w:szCs w:val="44"/>
+          <w:vertAlign w:val="superscript"/>
+          <w14:shadow w14:blurRad="38100" w14:dist="25400" w14:dir="5400000" w14:sx="100000" w14:sy="100000" w14:kx="0" w14:ky="0" w14:algn="ctr">
+            <w14:srgbClr w14:val="6E747A">
+              <w14:alpha w14:val="57000"/>
+            </w14:srgbClr>
+          </w14:shadow>
+          <w14:textOutline w14:w="0" w14:cap="flat" w14:cmpd="sng" w14:algn="ctr">
+            <w14:noFill/>
+            <w14:prstDash w14:val="solid"/>
+            <w14:round/>
+          </w14:textOutline>
+        </w:rPr>
+        <w:t>th</w:t>
       </w:r>
       <w:r>
         <w:rPr>
@@ -361,7 +463,27 @@
             <w14:round/>
           </w14:textOutline>
         </w:rPr>
-        <w:t>25</w:t>
+        <w:t>2</w:t>
+      </w:r>
+      <w:r>
+        <w:rPr>
+          <w:rFonts w:ascii="Times New Roman" w:hAnsi="Times New Roman" w:cs="Times New Roman"/>
+          <w:b/>
+          <w:color w:val="4472C4" w:themeColor="accent1"/>
+          <w:sz w:val="44"/>
+          <w:szCs w:val="44"/>
+          <w14:shadow w14:blurRad="38100" w14:dist="25400" w14:dir="5400000" w14:sx="100000" w14:sy="100000" w14:kx="0" w14:ky="0" w14:algn="ctr">
+            <w14:srgbClr w14:val="6E747A">
+              <w14:alpha w14:val="57000"/>
+            </w14:srgbClr>
+          </w14:shadow>
+          <w14:textOutline w14:w="0" w14:cap="flat" w14:cmpd="sng" w14:algn="ctr">
+            <w14:noFill/>
+            <w14:prstDash w14:val="solid"/>
+            <w14:round/>
+          </w14:textOutline>
+        </w:rPr>
+        <w:t>6</w:t>
       </w:r>
     </w:p>
     <w:tbl>
@@ -1111,66 +1233,281 @@
               <w:jc w:val="center"/>
               <w:rPr>
                 <w:rFonts w:ascii="Times New Roman" w:hAnsi="Times New Roman" w:cs="Times New Roman"/>
-                <w:b/>
-                <w:bCs/>
-                <w:color w:val="C45911" w:themeColor="accent2" w:themeShade="BF"/>
-                <w:sz w:val="48"/>
-                <w:szCs w:val="48"/>
-                <w14:shadow w14:blurRad="38100" w14:dist="25400" w14:dir="5400000" w14:sx="100000" w14:sy="100000" w14:kx="0" w14:ky="0" w14:algn="ctr">
-                  <w14:srgbClr w14:val="6E747A">
-                    <w14:alpha w14:val="57000"/>
-                  </w14:srgbClr>
-                </w14:shadow>
-                <w14:textOutline w14:w="0" w14:cap="flat" w14:cmpd="sng" w14:algn="ctr">
-                  <w14:noFill/>
-                  <w14:prstDash w14:val="solid"/>
-                  <w14:round/>
-                </w14:textOutline>
-              </w:rPr>
-            </w:pPr>
-            <w:r>
-              <w:rPr>
-                <w:rFonts w:ascii="Times New Roman" w:hAnsi="Times New Roman" w:cs="Times New Roman"/>
-                <w:b/>
-                <w:bCs/>
-                <w:color w:val="C45911" w:themeColor="accent2" w:themeShade="BF"/>
-                <w:sz w:val="48"/>
-                <w:szCs w:val="48"/>
-                <w14:shadow w14:blurRad="38100" w14:dist="25400" w14:dir="5400000" w14:sx="100000" w14:sy="100000" w14:kx="0" w14:ky="0" w14:algn="ctr">
-                  <w14:srgbClr w14:val="6E747A">
-                    <w14:alpha w14:val="57000"/>
-                  </w14:srgbClr>
-                </w14:shadow>
-                <w14:textOutline w14:w="0" w14:cap="flat" w14:cmpd="sng" w14:algn="ctr">
-                  <w14:noFill/>
-                  <w14:prstDash w14:val="solid"/>
-                  <w14:round/>
-                </w14:textOutline>
-              </w:rPr>
-              <w:t>CHILL</w:t>
-            </w:r>
-          </w:p>
-          <w:p>
-            <w:pPr>
-              <w:jc w:val="center"/>
-              <w:rPr>
-                <w:rFonts w:ascii="Times New Roman" w:hAnsi="Times New Roman" w:cs="Times New Roman"/>
-                <w:bCs/>
-                <w:color w:val="000000" w:themeColor="text1"/>
-                <w:sz w:val="44"/>
-                <w:szCs w:val="44"/>
-                <w14:shadow w14:blurRad="38100" w14:dist="19050" w14:dir="2700000" w14:sx="100000" w14:sy="100000" w14:kx="0" w14:ky="0" w14:algn="tl">
-                  <w14:schemeClr w14:val="dk1">
-                    <w14:alpha w14:val="60000"/>
-                  </w14:schemeClr>
-                </w14:shadow>
-                <w14:textOutline w14:w="0" w14:cap="flat" w14:cmpd="sng" w14:algn="ctr">
-                  <w14:noFill/>
-                  <w14:prstDash w14:val="solid"/>
-                  <w14:round/>
-                </w14:textOutline>
-              </w:rPr>
-            </w:pPr>
+                <w:bCs/>
+                <w:sz w:val="44"/>
+                <w:szCs w:val="44"/>
+                <w14:shadow w14:blurRad="38100" w14:dist="19050" w14:dir="2700000" w14:sx="100000" w14:sy="100000" w14:kx="0" w14:ky="0" w14:algn="tl">
+                  <w14:schemeClr w14:val="dk1">
+                    <w14:alpha w14:val="60000"/>
+                  </w14:schemeClr>
+                </w14:shadow>
+                <w14:textOutline w14:w="0" w14:cap="flat" w14:cmpd="sng" w14:algn="ctr">
+                  <w14:noFill/>
+                  <w14:prstDash w14:val="solid"/>
+                  <w14:round/>
+                </w14:textOutline>
+              </w:rPr>
+            </w:pPr>
+            <w:r>
+              <w:rPr>
+                <w:rFonts w:ascii="Times New Roman" w:hAnsi="Times New Roman" w:cs="Times New Roman"/>
+                <w:bCs/>
+                <w:sz w:val="44"/>
+                <w:szCs w:val="44"/>
+                <w14:shadow w14:blurRad="38100" w14:dist="19050" w14:dir="2700000" w14:sx="100000" w14:sy="100000" w14:kx="0" w14:ky="0" w14:algn="tl">
+                  <w14:schemeClr w14:val="dk1">
+                    <w14:alpha w14:val="60000"/>
+                  </w14:schemeClr>
+                </w14:shadow>
+                <w14:textOutline w14:w="0" w14:cap="flat" w14:cmpd="sng" w14:algn="ctr">
+                  <w14:noFill/>
+                  <w14:prstDash w14:val="solid"/>
+                  <w14:round/>
+                </w14:textOutline>
+              </w:rPr>
+              <w:t>CSE 4</w:t>
+            </w:r>
+            <w:r>
+              <w:rPr>
+                <w:rFonts w:ascii="Times New Roman" w:hAnsi="Times New Roman" w:cs="Times New Roman"/>
+                <w:bCs/>
+                <w:sz w:val="44"/>
+                <w:szCs w:val="44"/>
+                <w14:shadow w14:blurRad="38100" w14:dist="19050" w14:dir="2700000" w14:sx="100000" w14:sy="100000" w14:kx="0" w14:ky="0" w14:algn="tl">
+                  <w14:schemeClr w14:val="dk1">
+                    <w14:alpha w14:val="60000"/>
+                  </w14:schemeClr>
+                </w14:shadow>
+                <w14:textOutline w14:w="0" w14:cap="flat" w14:cmpd="sng" w14:algn="ctr">
+                  <w14:noFill/>
+                  <w14:prstDash w14:val="solid"/>
+                  <w14:round/>
+                </w14:textOutline>
+              </w:rPr>
+              <w:t>2</w:t>
+            </w:r>
+            <w:r>
+              <w:rPr>
+                <w:rFonts w:ascii="Times New Roman" w:hAnsi="Times New Roman" w:cs="Times New Roman"/>
+                <w:bCs/>
+                <w:sz w:val="44"/>
+                <w:szCs w:val="44"/>
+                <w14:shadow w14:blurRad="38100" w14:dist="19050" w14:dir="2700000" w14:sx="100000" w14:sy="100000" w14:kx="0" w14:ky="0" w14:algn="tl">
+                  <w14:schemeClr w14:val="dk1">
+                    <w14:alpha w14:val="60000"/>
+                  </w14:schemeClr>
+                </w14:shadow>
+                <w14:textOutline w14:w="0" w14:cap="flat" w14:cmpd="sng" w14:algn="ctr">
+                  <w14:noFill/>
+                  <w14:prstDash w14:val="solid"/>
+                  <w14:round/>
+                </w14:textOutline>
+              </w:rPr>
+              <w:t>0</w:t>
+            </w:r>
+            <w:r>
+              <w:rPr>
+                <w:rFonts w:ascii="Times New Roman" w:hAnsi="Times New Roman" w:cs="Times New Roman"/>
+                <w:bCs/>
+                <w:sz w:val="44"/>
+                <w:szCs w:val="44"/>
+                <w14:shadow w14:blurRad="38100" w14:dist="19050" w14:dir="2700000" w14:sx="100000" w14:sy="100000" w14:kx="0" w14:ky="0" w14:algn="tl">
+                  <w14:schemeClr w14:val="dk1">
+                    <w14:alpha w14:val="60000"/>
+                  </w14:schemeClr>
+                </w14:shadow>
+                <w14:textOutline w14:w="0" w14:cap="flat" w14:cmpd="sng" w14:algn="ctr">
+                  <w14:noFill/>
+                  <w14:prstDash w14:val="solid"/>
+                  <w14:round/>
+                </w14:textOutline>
+              </w:rPr>
+              <w:t>3</w:t>
+            </w:r>
+          </w:p>
+          <w:p>
+            <w:pPr>
+              <w:jc w:val="center"/>
+              <w:rPr>
+                <w:rFonts w:ascii="Times New Roman" w:hAnsi="Times New Roman" w:cs="Times New Roman"/>
+                <w:bCs/>
+                <w:color w:val="000000" w:themeColor="text1"/>
+                <w:sz w:val="44"/>
+                <w:szCs w:val="44"/>
+                <w14:shadow w14:blurRad="38100" w14:dist="19050" w14:dir="2700000" w14:sx="100000" w14:sy="100000" w14:kx="0" w14:ky="0" w14:algn="tl">
+                  <w14:schemeClr w14:val="dk1">
+                    <w14:alpha w14:val="60000"/>
+                  </w14:schemeClr>
+                </w14:shadow>
+                <w14:textOutline w14:w="0" w14:cap="flat" w14:cmpd="sng" w14:algn="ctr">
+                  <w14:noFill/>
+                  <w14:prstDash w14:val="solid"/>
+                  <w14:round/>
+                </w14:textOutline>
+              </w:rPr>
+            </w:pPr>
+            <w:r>
+              <w:rPr>
+                <w:rFonts w:ascii="Times New Roman" w:hAnsi="Times New Roman" w:cs="Times New Roman"/>
+                <w:bCs/>
+                <w:color w:val="000000" w:themeColor="text1"/>
+                <w:sz w:val="44"/>
+                <w:szCs w:val="44"/>
+                <w14:shadow w14:blurRad="38100" w14:dist="19050" w14:dir="2700000" w14:sx="100000" w14:sy="100000" w14:kx="0" w14:ky="0" w14:algn="tl">
+                  <w14:schemeClr w14:val="dk1">
+                    <w14:alpha w14:val="60000"/>
+                  </w14:schemeClr>
+                </w14:shadow>
+                <w14:textOutline w14:w="0" w14:cap="flat" w14:cmpd="sng" w14:algn="ctr">
+                  <w14:noFill/>
+                  <w14:prstDash w14:val="solid"/>
+                  <w14:round/>
+                </w14:textOutline>
+              </w:rPr>
+              <w:t xml:space="preserve">Room no. </w:t>
+            </w:r>
+            <w:r>
+              <w:rPr>
+                <w:rFonts w:ascii="Times New Roman" w:hAnsi="Times New Roman" w:cs="Times New Roman"/>
+                <w:bCs/>
+                <w:color w:val="000000" w:themeColor="text1"/>
+                <w:sz w:val="44"/>
+                <w:szCs w:val="44"/>
+                <w14:shadow w14:blurRad="38100" w14:dist="19050" w14:dir="2700000" w14:sx="100000" w14:sy="100000" w14:kx="0" w14:ky="0" w14:algn="tl">
+                  <w14:schemeClr w14:val="dk1">
+                    <w14:alpha w14:val="60000"/>
+                  </w14:schemeClr>
+                </w14:shadow>
+                <w14:textOutline w14:w="0" w14:cap="flat" w14:cmpd="sng" w14:algn="ctr">
+                  <w14:noFill/>
+                  <w14:prstDash w14:val="solid"/>
+                  <w14:round/>
+                </w14:textOutline>
+              </w:rPr>
+              <w:t>3</w:t>
+            </w:r>
+            <w:r>
+              <w:rPr>
+                <w:rFonts w:ascii="Times New Roman" w:hAnsi="Times New Roman" w:cs="Times New Roman"/>
+                <w:bCs/>
+                <w:color w:val="000000" w:themeColor="text1"/>
+                <w:sz w:val="44"/>
+                <w:szCs w:val="44"/>
+                <w14:shadow w14:blurRad="38100" w14:dist="19050" w14:dir="2700000" w14:sx="100000" w14:sy="100000" w14:kx="0" w14:ky="0" w14:algn="tl">
+                  <w14:schemeClr w14:val="dk1">
+                    <w14:alpha w14:val="60000"/>
+                  </w14:schemeClr>
+                </w14:shadow>
+                <w14:textOutline w14:w="0" w14:cap="flat" w14:cmpd="sng" w14:algn="ctr">
+                  <w14:noFill/>
+                  <w14:prstDash w14:val="solid"/>
+                  <w14:round/>
+                </w14:textOutline>
+              </w:rPr>
+              <w:t>0</w:t>
+            </w:r>
+            <w:r>
+              <w:rPr>
+                <w:rFonts w:ascii="Times New Roman" w:hAnsi="Times New Roman" w:cs="Times New Roman"/>
+                <w:bCs/>
+                <w:color w:val="000000" w:themeColor="text1"/>
+                <w:sz w:val="44"/>
+                <w:szCs w:val="44"/>
+                <w14:shadow w14:blurRad="38100" w14:dist="19050" w14:dir="2700000" w14:sx="100000" w14:sy="100000" w14:kx="0" w14:ky="0" w14:algn="tl">
+                  <w14:schemeClr w14:val="dk1">
+                    <w14:alpha w14:val="60000"/>
+                  </w14:schemeClr>
+                </w14:shadow>
+                <w14:textOutline w14:w="0" w14:cap="flat" w14:cmpd="sng" w14:algn="ctr">
+                  <w14:noFill/>
+                  <w14:prstDash w14:val="solid"/>
+                  <w14:round/>
+                </w14:textOutline>
+              </w:rPr>
+              <w:t>9</w:t>
+            </w:r>
+          </w:p>
+          <w:p>
+            <w:pPr>
+              <w:jc w:val="center"/>
+              <w:rPr>
+                <w:rFonts w:ascii="Times New Roman" w:hAnsi="Times New Roman" w:cs="Times New Roman"/>
+                <w:bCs/>
+                <w:color w:val="000000" w:themeColor="text1"/>
+                <w:sz w:val="44"/>
+                <w:szCs w:val="44"/>
+                <w14:shadow w14:blurRad="38100" w14:dist="19050" w14:dir="2700000" w14:sx="100000" w14:sy="100000" w14:kx="0" w14:ky="0" w14:algn="tl">
+                  <w14:schemeClr w14:val="dk1">
+                    <w14:alpha w14:val="60000"/>
+                  </w14:schemeClr>
+                </w14:shadow>
+                <w14:textOutline w14:w="0" w14:cap="flat" w14:cmpd="sng" w14:algn="ctr">
+                  <w14:noFill/>
+                  <w14:prstDash w14:val="solid"/>
+                  <w14:round/>
+                </w14:textOutline>
+              </w:rPr>
+            </w:pPr>
+            <w:r>
+              <w:rPr>
+                <w:rFonts w:ascii="Times New Roman" w:hAnsi="Times New Roman" w:cs="Times New Roman"/>
+                <w:bCs/>
+                <w:color w:val="000000" w:themeColor="text1"/>
+                <w:sz w:val="44"/>
+                <w:szCs w:val="44"/>
+                <w14:shadow w14:blurRad="38100" w14:dist="19050" w14:dir="2700000" w14:sx="100000" w14:sy="100000" w14:kx="0" w14:ky="0" w14:algn="tl">
+                  <w14:schemeClr w14:val="dk1">
+                    <w14:alpha w14:val="60000"/>
+                  </w14:schemeClr>
+                </w14:shadow>
+                <w14:textOutline w14:w="0" w14:cap="flat" w14:cmpd="sng" w14:algn="ctr">
+                  <w14:noFill/>
+                  <w14:prstDash w14:val="solid"/>
+                  <w14:round/>
+                </w14:textOutline>
+              </w:rPr>
+              <w:t>Humayara</w:t>
+            </w:r>
+            <w:r>
+              <w:rPr>
+                <w:rFonts w:ascii="Times New Roman" w:hAnsi="Times New Roman" w:cs="Times New Roman"/>
+                <w:bCs/>
+                <w:color w:val="000000" w:themeColor="text1"/>
+                <w:sz w:val="44"/>
+                <w:szCs w:val="44"/>
+                <w14:shadow w14:blurRad="38100" w14:dist="19050" w14:dir="2700000" w14:sx="100000" w14:sy="100000" w14:kx="0" w14:ky="0" w14:algn="tl">
+                  <w14:schemeClr w14:val="dk1">
+                    <w14:alpha w14:val="60000"/>
+                  </w14:schemeClr>
+                </w14:shadow>
+                <w14:textOutline w14:w="0" w14:cap="flat" w14:cmpd="sng" w14:algn="ctr">
+                  <w14:noFill/>
+                  <w14:prstDash w14:val="solid"/>
+                  <w14:round/>
+                </w14:textOutline>
+              </w:rPr>
+              <w:t xml:space="preserve"> ma’am</w:t>
+            </w:r>
+            <w:r>
+              <w:rPr>
+                <w:rFonts w:ascii="Times New Roman" w:hAnsi="Times New Roman" w:cs="Times New Roman"/>
+                <w:bCs/>
+                <w:color w:val="000000" w:themeColor="text1"/>
+                <w:sz w:val="44"/>
+                <w:szCs w:val="44"/>
+                <w14:shadow w14:blurRad="38100" w14:dist="19050" w14:dir="2700000" w14:sx="100000" w14:sy="100000" w14:kx="0" w14:ky="0" w14:algn="tl">
+                  <w14:schemeClr w14:val="dk1">
+                    <w14:alpha w14:val="60000"/>
+                  </w14:schemeClr>
+                </w14:shadow>
+                <w14:textOutline w14:w="0" w14:cap="flat" w14:cmpd="sng" w14:algn="ctr">
+                  <w14:noFill/>
+                  <w14:prstDash w14:val="solid"/>
+                  <w14:round/>
+                </w14:textOutline>
+              </w:rPr>
+              <w:t xml:space="preserve"> </w:t>
+            </w:r>
           </w:p>
         </w:tc>
         <w:tc>
@@ -1342,110 +1679,6 @@
               <w:rPr>
                 <w:rFonts w:ascii="Times New Roman" w:hAnsi="Times New Roman" w:cs="Times New Roman"/>
                 <w:bCs/>
-                <w:color w:val="1F4E79" w:themeColor="accent5" w:themeShade="80"/>
-                <w:sz w:val="44"/>
-                <w:szCs w:val="44"/>
-                <w14:shadow w14:blurRad="38100" w14:dist="19050" w14:dir="2700000" w14:sx="100000" w14:sy="100000" w14:kx="0" w14:ky="0" w14:algn="tl">
-                  <w14:schemeClr w14:val="dk1">
-                    <w14:alpha w14:val="60000"/>
-                  </w14:schemeClr>
-                </w14:shadow>
-                <w14:textOutline w14:w="0" w14:cap="flat" w14:cmpd="sng" w14:algn="ctr">
-                  <w14:noFill/>
-                  <w14:prstDash w14:val="solid"/>
-                  <w14:round/>
-                </w14:textOutline>
-              </w:rPr>
-            </w:pPr>
-            <w:r>
-              <w:rPr>
-                <w:rFonts w:ascii="Times New Roman" w:hAnsi="Times New Roman" w:cs="Times New Roman"/>
-                <w:bCs/>
-                <w:color w:val="1F4E79" w:themeColor="accent5" w:themeShade="80"/>
-                <w:sz w:val="44"/>
-                <w:szCs w:val="44"/>
-                <w14:shadow w14:blurRad="38100" w14:dist="19050" w14:dir="2700000" w14:sx="100000" w14:sy="100000" w14:kx="0" w14:ky="0" w14:algn="tl">
-                  <w14:schemeClr w14:val="dk1">
-                    <w14:alpha w14:val="60000"/>
-                  </w14:schemeClr>
-                </w14:shadow>
-                <w14:textOutline w14:w="0" w14:cap="flat" w14:cmpd="sng" w14:algn="ctr">
-                  <w14:noFill/>
-                  <w14:prstDash w14:val="solid"/>
-                  <w14:round/>
-                </w14:textOutline>
-              </w:rPr>
-              <w:t>IPE 4102</w:t>
-            </w:r>
-          </w:p>
-          <w:p>
-            <w:pPr>
-              <w:jc w:val="center"/>
-              <w:rPr>
-                <w:rFonts w:ascii="Times New Roman" w:hAnsi="Times New Roman" w:cs="Times New Roman"/>
-                <w:bCs/>
-                <w:color w:val="000000" w:themeColor="text1"/>
-                <w:sz w:val="44"/>
-                <w:szCs w:val="44"/>
-                <w14:shadow w14:blurRad="38100" w14:dist="19050" w14:dir="2700000" w14:sx="100000" w14:sy="100000" w14:kx="0" w14:ky="0" w14:algn="tl">
-                  <w14:schemeClr w14:val="dk1">
-                    <w14:alpha w14:val="60000"/>
-                  </w14:schemeClr>
-                </w14:shadow>
-                <w14:textOutline w14:w="0" w14:cap="flat" w14:cmpd="sng" w14:algn="ctr">
-                  <w14:noFill/>
-                  <w14:prstDash w14:val="solid"/>
-                  <w14:round/>
-                </w14:textOutline>
-              </w:rPr>
-            </w:pPr>
-            <w:r>
-              <w:rPr>
-                <w:rFonts w:ascii="Times New Roman" w:hAnsi="Times New Roman" w:cs="Times New Roman"/>
-                <w:bCs/>
-                <w:color w:val="000000" w:themeColor="text1"/>
-                <w:sz w:val="44"/>
-                <w:szCs w:val="44"/>
-                <w14:shadow w14:blurRad="38100" w14:dist="19050" w14:dir="2700000" w14:sx="100000" w14:sy="100000" w14:kx="0" w14:ky="0" w14:algn="tl">
-                  <w14:schemeClr w14:val="dk1">
-                    <w14:alpha w14:val="60000"/>
-                  </w14:schemeClr>
-                </w14:shadow>
-                <w14:textOutline w14:w="0" w14:cap="flat" w14:cmpd="sng" w14:algn="ctr">
-                  <w14:noFill/>
-                  <w14:prstDash w14:val="solid"/>
-                  <w14:round/>
-                </w14:textOutline>
-              </w:rPr>
-              <w:t xml:space="preserve">Room no. </w:t>
-            </w:r>
-            <w:r>
-              <w:rPr>
-                <w:rFonts w:ascii="Times New Roman" w:hAnsi="Times New Roman" w:cs="Times New Roman"/>
-                <w:bCs/>
-                <w:color w:val="000000" w:themeColor="text1"/>
-                <w:sz w:val="44"/>
-                <w:szCs w:val="44"/>
-                <w14:shadow w14:blurRad="38100" w14:dist="19050" w14:dir="2700000" w14:sx="100000" w14:sy="100000" w14:kx="0" w14:ky="0" w14:algn="tl">
-                  <w14:schemeClr w14:val="dk1">
-                    <w14:alpha w14:val="60000"/>
-                  </w14:schemeClr>
-                </w14:shadow>
-                <w14:textOutline w14:w="0" w14:cap="flat" w14:cmpd="sng" w14:algn="ctr">
-                  <w14:noFill/>
-                  <w14:prstDash w14:val="solid"/>
-                  <w14:round/>
-                </w14:textOutline>
-              </w:rPr>
-              <w:t>414</w:t>
-            </w:r>
-          </w:p>
-          <w:p>
-            <w:pPr>
-              <w:jc w:val="center"/>
-              <w:rPr>
-                <w:rFonts w:ascii="Times New Roman" w:hAnsi="Times New Roman" w:cs="Times New Roman"/>
-                <w:bCs/>
                 <w:color w:val="4472C4" w:themeColor="accent1"/>
                 <w:sz w:val="44"/>
                 <w:szCs w:val="44"/>
@@ -1461,26 +1694,6 @@
                 </w14:textOutline>
               </w:rPr>
             </w:pPr>
-            <w:r>
-              <w:rPr>
-                <w:rFonts w:ascii="Times New Roman" w:hAnsi="Times New Roman" w:cs="Times New Roman"/>
-                <w:bCs/>
-                <w:color w:val="000000" w:themeColor="text1"/>
-                <w:sz w:val="44"/>
-                <w:szCs w:val="44"/>
-                <w14:shadow w14:blurRad="38100" w14:dist="19050" w14:dir="2700000" w14:sx="100000" w14:sy="100000" w14:kx="0" w14:ky="0" w14:algn="tl">
-                  <w14:schemeClr w14:val="dk1">
-                    <w14:alpha w14:val="60000"/>
-                  </w14:schemeClr>
-                </w14:shadow>
-                <w14:textOutline w14:w="0" w14:cap="flat" w14:cmpd="sng" w14:algn="ctr">
-                  <w14:noFill/>
-                  <w14:prstDash w14:val="solid"/>
-                  <w14:round/>
-                </w14:textOutline>
-              </w:rPr>
-              <w:t>Tahmid Sir</w:t>
-            </w:r>
           </w:p>
         </w:tc>
         <w:tc>
@@ -1687,123 +1900,21 @@
               <w:rPr>
                 <w:rFonts w:ascii="Times New Roman" w:hAnsi="Times New Roman" w:cs="Times New Roman"/>
                 <w:bCs/>
-                <w:sz w:val="44"/>
-                <w:szCs w:val="44"/>
-                <w14:shadow w14:blurRad="38100" w14:dist="19050" w14:dir="2700000" w14:sx="100000" w14:sy="100000" w14:kx="0" w14:ky="0" w14:algn="tl">
-                  <w14:schemeClr w14:val="dk1">
-                    <w14:alpha w14:val="60000"/>
-                  </w14:schemeClr>
-                </w14:shadow>
-                <w14:textOutline w14:w="0" w14:cap="flat" w14:cmpd="sng" w14:algn="ctr">
-                  <w14:noFill/>
-                  <w14:prstDash w14:val="solid"/>
-                  <w14:round/>
-                </w14:textOutline>
-              </w:rPr>
-            </w:pPr>
-            <w:r>
-              <w:rPr>
-                <w:rFonts w:ascii="Times New Roman" w:hAnsi="Times New Roman" w:cs="Times New Roman"/>
-                <w:bCs/>
-                <w:sz w:val="44"/>
-                <w:szCs w:val="44"/>
-                <w14:shadow w14:blurRad="38100" w14:dist="19050" w14:dir="2700000" w14:sx="100000" w14:sy="100000" w14:kx="0" w14:ky="0" w14:algn="tl">
-                  <w14:schemeClr w14:val="dk1">
-                    <w14:alpha w14:val="60000"/>
-                  </w14:schemeClr>
-                </w14:shadow>
-                <w14:textOutline w14:w="0" w14:cap="flat" w14:cmpd="sng" w14:algn="ctr">
-                  <w14:noFill/>
-                  <w14:prstDash w14:val="solid"/>
-                  <w14:round/>
-                </w14:textOutline>
-              </w:rPr>
-              <w:t>CSE 4106</w:t>
-            </w:r>
-          </w:p>
-          <w:p>
-            <w:pPr>
-              <w:jc w:val="center"/>
-              <w:rPr>
-                <w:rFonts w:ascii="Times New Roman" w:hAnsi="Times New Roman" w:cs="Times New Roman"/>
-                <w:bCs/>
-                <w:color w:val="000000" w:themeColor="text1"/>
-                <w:sz w:val="44"/>
-                <w:szCs w:val="44"/>
-                <w14:shadow w14:blurRad="38100" w14:dist="19050" w14:dir="2700000" w14:sx="100000" w14:sy="100000" w14:kx="0" w14:ky="0" w14:algn="tl">
-                  <w14:schemeClr w14:val="dk1">
-                    <w14:alpha w14:val="60000"/>
-                  </w14:schemeClr>
-                </w14:shadow>
-                <w14:textOutline w14:w="0" w14:cap="flat" w14:cmpd="sng" w14:algn="ctr">
-                  <w14:noFill/>
-                  <w14:prstDash w14:val="solid"/>
-                  <w14:round/>
-                </w14:textOutline>
-              </w:rPr>
-            </w:pPr>
-            <w:r>
-              <w:rPr>
-                <w:rFonts w:ascii="Times New Roman" w:hAnsi="Times New Roman" w:cs="Times New Roman"/>
-                <w:bCs/>
-                <w:color w:val="000000" w:themeColor="text1"/>
-                <w:sz w:val="44"/>
-                <w:szCs w:val="44"/>
-                <w14:shadow w14:blurRad="38100" w14:dist="19050" w14:dir="2700000" w14:sx="100000" w14:sy="100000" w14:kx="0" w14:ky="0" w14:algn="tl">
-                  <w14:schemeClr w14:val="dk1">
-                    <w14:alpha w14:val="60000"/>
-                  </w14:schemeClr>
-                </w14:shadow>
-                <w14:textOutline w14:w="0" w14:cap="flat" w14:cmpd="sng" w14:algn="ctr">
-                  <w14:noFill/>
-                  <w14:prstDash w14:val="solid"/>
-                  <w14:round/>
-                </w14:textOutline>
-              </w:rPr>
-              <w:t>Alternate Weeks</w:t>
-            </w:r>
-          </w:p>
-          <w:p>
-            <w:pPr>
-              <w:jc w:val="center"/>
-              <w:rPr>
-                <w:rFonts w:ascii="Times New Roman" w:hAnsi="Times New Roman" w:cs="Times New Roman"/>
-                <w:bCs/>
-                <w:color w:val="000000" w:themeColor="text1"/>
-                <w:sz w:val="44"/>
-                <w:szCs w:val="44"/>
-                <w14:shadow w14:blurRad="38100" w14:dist="19050" w14:dir="2700000" w14:sx="100000" w14:sy="100000" w14:kx="0" w14:ky="0" w14:algn="tl">
-                  <w14:schemeClr w14:val="dk1">
-                    <w14:alpha w14:val="60000"/>
-                  </w14:schemeClr>
-                </w14:shadow>
-                <w14:textOutline w14:w="0" w14:cap="flat" w14:cmpd="sng" w14:algn="ctr">
-                  <w14:noFill/>
-                  <w14:prstDash w14:val="solid"/>
-                  <w14:round/>
-                </w14:textOutline>
-              </w:rPr>
-            </w:pPr>
-            <w:r>
-              <w:rPr>
-                <w:rFonts w:ascii="Times New Roman" w:hAnsi="Times New Roman" w:cs="Times New Roman"/>
-                <w:bCs/>
-                <w:color w:val="000000" w:themeColor="text1"/>
-                <w:sz w:val="44"/>
-                <w:szCs w:val="44"/>
-                <w14:shadow w14:blurRad="38100" w14:dist="19050" w14:dir="2700000" w14:sx="100000" w14:sy="100000" w14:kx="0" w14:ky="0" w14:algn="tl">
-                  <w14:schemeClr w14:val="dk1">
-                    <w14:alpha w14:val="60000"/>
-                  </w14:schemeClr>
-                </w14:shadow>
-                <w14:textOutline w14:w="0" w14:cap="flat" w14:cmpd="sng" w14:algn="ctr">
-                  <w14:noFill/>
-                  <w14:prstDash w14:val="solid"/>
-                  <w14:round/>
-                </w14:textOutline>
-              </w:rPr>
-              <w:t>Shanta ma’am</w:t>
-            </w:r>
+                <w:color w:val="000000" w:themeColor="text1"/>
+                <w:sz w:val="44"/>
+                <w:szCs w:val="44"/>
+                <w14:shadow w14:blurRad="38100" w14:dist="19050" w14:dir="2700000" w14:sx="100000" w14:sy="100000" w14:kx="0" w14:ky="0" w14:algn="tl">
+                  <w14:schemeClr w14:val="dk1">
+                    <w14:alpha w14:val="60000"/>
+                  </w14:schemeClr>
+                </w14:shadow>
+                <w14:textOutline w14:w="0" w14:cap="flat" w14:cmpd="sng" w14:algn="ctr">
+                  <w14:noFill/>
+                  <w14:prstDash w14:val="solid"/>
+                  <w14:round/>
+                </w14:textOutline>
+              </w:rPr>
+            </w:pPr>
           </w:p>
         </w:tc>
         <w:tc>
@@ -1822,21 +1933,182 @@
               <w:rPr>
                 <w:rFonts w:ascii="Times New Roman" w:hAnsi="Times New Roman" w:cs="Times New Roman"/>
                 <w:bCs/>
-                <w:color w:val="000000" w:themeColor="text1"/>
-                <w:sz w:val="44"/>
-                <w:szCs w:val="44"/>
-                <w14:shadow w14:blurRad="38100" w14:dist="19050" w14:dir="2700000" w14:sx="100000" w14:sy="100000" w14:kx="0" w14:ky="0" w14:algn="tl">
-                  <w14:schemeClr w14:val="dk1">
-                    <w14:alpha w14:val="60000"/>
-                  </w14:schemeClr>
-                </w14:shadow>
-                <w14:textOutline w14:w="0" w14:cap="flat" w14:cmpd="sng" w14:algn="ctr">
-                  <w14:noFill/>
-                  <w14:prstDash w14:val="solid"/>
-                  <w14:round/>
-                </w14:textOutline>
-              </w:rPr>
-            </w:pPr>
+                <w:sz w:val="44"/>
+                <w:szCs w:val="44"/>
+                <w14:shadow w14:blurRad="38100" w14:dist="19050" w14:dir="2700000" w14:sx="100000" w14:sy="100000" w14:kx="0" w14:ky="0" w14:algn="tl">
+                  <w14:schemeClr w14:val="dk1">
+                    <w14:alpha w14:val="60000"/>
+                  </w14:schemeClr>
+                </w14:shadow>
+                <w14:textOutline w14:w="0" w14:cap="flat" w14:cmpd="sng" w14:algn="ctr">
+                  <w14:noFill/>
+                  <w14:prstDash w14:val="solid"/>
+                  <w14:round/>
+                </w14:textOutline>
+              </w:rPr>
+            </w:pPr>
+            <w:r>
+              <w:rPr>
+                <w:rFonts w:ascii="Times New Roman" w:hAnsi="Times New Roman" w:cs="Times New Roman"/>
+                <w:bCs/>
+                <w:sz w:val="44"/>
+                <w:szCs w:val="44"/>
+                <w14:shadow w14:blurRad="38100" w14:dist="19050" w14:dir="2700000" w14:sx="100000" w14:sy="100000" w14:kx="0" w14:ky="0" w14:algn="tl">
+                  <w14:schemeClr w14:val="dk1">
+                    <w14:alpha w14:val="60000"/>
+                  </w14:schemeClr>
+                </w14:shadow>
+                <w14:textOutline w14:w="0" w14:cap="flat" w14:cmpd="sng" w14:algn="ctr">
+                  <w14:noFill/>
+                  <w14:prstDash w14:val="solid"/>
+                  <w14:round/>
+                </w14:textOutline>
+              </w:rPr>
+              <w:t xml:space="preserve">CSE </w:t>
+            </w:r>
+            <w:r>
+              <w:rPr>
+                <w:rFonts w:ascii="Times New Roman" w:hAnsi="Times New Roman" w:cs="Times New Roman"/>
+                <w:bCs/>
+                <w:sz w:val="44"/>
+                <w:szCs w:val="44"/>
+                <w14:shadow w14:blurRad="38100" w14:dist="19050" w14:dir="2700000" w14:sx="100000" w14:sy="100000" w14:kx="0" w14:ky="0" w14:algn="tl">
+                  <w14:schemeClr w14:val="dk1">
+                    <w14:alpha w14:val="60000"/>
+                  </w14:schemeClr>
+                </w14:shadow>
+                <w14:textOutline w14:w="0" w14:cap="flat" w14:cmpd="sng" w14:algn="ctr">
+                  <w14:noFill/>
+                  <w14:prstDash w14:val="solid"/>
+                  <w14:round/>
+                </w14:textOutline>
+              </w:rPr>
+              <w:t>4213</w:t>
+            </w:r>
+          </w:p>
+          <w:p>
+            <w:pPr>
+              <w:jc w:val="center"/>
+              <w:rPr>
+                <w:rFonts w:ascii="Times New Roman" w:hAnsi="Times New Roman" w:cs="Times New Roman"/>
+                <w:bCs/>
+                <w:color w:val="000000" w:themeColor="text1"/>
+                <w:sz w:val="44"/>
+                <w:szCs w:val="44"/>
+                <w14:shadow w14:blurRad="38100" w14:dist="19050" w14:dir="2700000" w14:sx="100000" w14:sy="100000" w14:kx="0" w14:ky="0" w14:algn="tl">
+                  <w14:schemeClr w14:val="dk1">
+                    <w14:alpha w14:val="60000"/>
+                  </w14:schemeClr>
+                </w14:shadow>
+                <w14:textOutline w14:w="0" w14:cap="flat" w14:cmpd="sng" w14:algn="ctr">
+                  <w14:noFill/>
+                  <w14:prstDash w14:val="solid"/>
+                  <w14:round/>
+                </w14:textOutline>
+              </w:rPr>
+            </w:pPr>
+            <w:r>
+              <w:rPr>
+                <w:rFonts w:ascii="Times New Roman" w:hAnsi="Times New Roman" w:cs="Times New Roman"/>
+                <w:bCs/>
+                <w:color w:val="000000" w:themeColor="text1"/>
+                <w:sz w:val="44"/>
+                <w:szCs w:val="44"/>
+                <w14:shadow w14:blurRad="38100" w14:dist="19050" w14:dir="2700000" w14:sx="100000" w14:sy="100000" w14:kx="0" w14:ky="0" w14:algn="tl">
+                  <w14:schemeClr w14:val="dk1">
+                    <w14:alpha w14:val="60000"/>
+                  </w14:schemeClr>
+                </w14:shadow>
+                <w14:textOutline w14:w="0" w14:cap="flat" w14:cmpd="sng" w14:algn="ctr">
+                  <w14:noFill/>
+                  <w14:prstDash w14:val="solid"/>
+                  <w14:round/>
+                </w14:textOutline>
+              </w:rPr>
+              <w:t xml:space="preserve">Room no. </w:t>
+            </w:r>
+            <w:r>
+              <w:rPr>
+                <w:rFonts w:ascii="Times New Roman" w:hAnsi="Times New Roman" w:cs="Times New Roman"/>
+                <w:bCs/>
+                <w:color w:val="000000" w:themeColor="text1"/>
+                <w:sz w:val="44"/>
+                <w:szCs w:val="44"/>
+                <w14:shadow w14:blurRad="38100" w14:dist="19050" w14:dir="2700000" w14:sx="100000" w14:sy="100000" w14:kx="0" w14:ky="0" w14:algn="tl">
+                  <w14:schemeClr w14:val="dk1">
+                    <w14:alpha w14:val="60000"/>
+                  </w14:schemeClr>
+                </w14:shadow>
+                <w14:textOutline w14:w="0" w14:cap="flat" w14:cmpd="sng" w14:algn="ctr">
+                  <w14:noFill/>
+                  <w14:prstDash w14:val="solid"/>
+                  <w14:round/>
+                </w14:textOutline>
+              </w:rPr>
+              <w:t>419</w:t>
+            </w:r>
+          </w:p>
+          <w:p>
+            <w:pPr>
+              <w:jc w:val="center"/>
+              <w:rPr>
+                <w:rFonts w:ascii="Times New Roman" w:hAnsi="Times New Roman" w:cs="Times New Roman"/>
+                <w:bCs/>
+                <w:color w:val="000000" w:themeColor="text1"/>
+                <w:sz w:val="44"/>
+                <w:szCs w:val="44"/>
+                <w14:shadow w14:blurRad="38100" w14:dist="19050" w14:dir="2700000" w14:sx="100000" w14:sy="100000" w14:kx="0" w14:ky="0" w14:algn="tl">
+                  <w14:schemeClr w14:val="dk1">
+                    <w14:alpha w14:val="60000"/>
+                  </w14:schemeClr>
+                </w14:shadow>
+                <w14:textOutline w14:w="0" w14:cap="flat" w14:cmpd="sng" w14:algn="ctr">
+                  <w14:noFill/>
+                  <w14:prstDash w14:val="solid"/>
+                  <w14:round/>
+                </w14:textOutline>
+              </w:rPr>
+            </w:pPr>
+            <w:r>
+              <w:rPr>
+                <w:rFonts w:ascii="Times New Roman" w:hAnsi="Times New Roman" w:cs="Times New Roman"/>
+                <w:bCs/>
+                <w:color w:val="000000" w:themeColor="text1"/>
+                <w:sz w:val="44"/>
+                <w:szCs w:val="44"/>
+                <w14:shadow w14:blurRad="38100" w14:dist="19050" w14:dir="2700000" w14:sx="100000" w14:sy="100000" w14:kx="0" w14:ky="0" w14:algn="tl">
+                  <w14:schemeClr w14:val="dk1">
+                    <w14:alpha w14:val="60000"/>
+                  </w14:schemeClr>
+                </w14:shadow>
+                <w14:textOutline w14:w="0" w14:cap="flat" w14:cmpd="sng" w14:algn="ctr">
+                  <w14:noFill/>
+                  <w14:prstDash w14:val="solid"/>
+                  <w14:round/>
+                </w14:textOutline>
+              </w:rPr>
+              <w:t>Tahmid</w:t>
+            </w:r>
+            <w:r>
+              <w:rPr>
+                <w:rFonts w:ascii="Times New Roman" w:hAnsi="Times New Roman" w:cs="Times New Roman"/>
+                <w:bCs/>
+                <w:color w:val="000000" w:themeColor="text1"/>
+                <w:sz w:val="44"/>
+                <w:szCs w:val="44"/>
+                <w14:shadow w14:blurRad="38100" w14:dist="19050" w14:dir="2700000" w14:sx="100000" w14:sy="100000" w14:kx="0" w14:ky="0" w14:algn="tl">
+                  <w14:schemeClr w14:val="dk1">
+                    <w14:alpha w14:val="60000"/>
+                  </w14:schemeClr>
+                </w14:shadow>
+                <w14:textOutline w14:w="0" w14:cap="flat" w14:cmpd="sng" w14:algn="ctr">
+                  <w14:noFill/>
+                  <w14:prstDash w14:val="solid"/>
+                  <w14:round/>
+                </w14:textOutline>
+              </w:rPr>
+              <w:t xml:space="preserve"> Sir</w:t>
+            </w:r>
           </w:p>
         </w:tc>
         <w:tc>
@@ -1854,6 +2126,50 @@
               <w:jc w:val="center"/>
               <w:rPr>
                 <w:rFonts w:ascii="Times New Roman" w:hAnsi="Times New Roman" w:cs="Times New Roman"/>
+                <w:b/>
+                <w:bCs/>
+                <w:color w:val="C45911" w:themeColor="accent2" w:themeShade="BF"/>
+                <w:sz w:val="48"/>
+                <w:szCs w:val="48"/>
+                <w14:shadow w14:blurRad="38100" w14:dist="25400" w14:dir="5400000" w14:sx="100000" w14:sy="100000" w14:kx="0" w14:ky="0" w14:algn="ctr">
+                  <w14:srgbClr w14:val="6E747A">
+                    <w14:alpha w14:val="57000"/>
+                  </w14:srgbClr>
+                </w14:shadow>
+                <w14:textOutline w14:w="0" w14:cap="flat" w14:cmpd="sng" w14:algn="ctr">
+                  <w14:noFill/>
+                  <w14:prstDash w14:val="solid"/>
+                  <w14:round/>
+                </w14:textOutline>
+              </w:rPr>
+            </w:pPr>
+            <w:r>
+              <w:rPr>
+                <w:rFonts w:ascii="Times New Roman" w:hAnsi="Times New Roman" w:cs="Times New Roman"/>
+                <w:b/>
+                <w:bCs/>
+                <w:color w:val="C45911" w:themeColor="accent2" w:themeShade="BF"/>
+                <w:sz w:val="48"/>
+                <w:szCs w:val="48"/>
+                <w14:shadow w14:blurRad="38100" w14:dist="25400" w14:dir="5400000" w14:sx="100000" w14:sy="100000" w14:kx="0" w14:ky="0" w14:algn="ctr">
+                  <w14:srgbClr w14:val="6E747A">
+                    <w14:alpha w14:val="57000"/>
+                  </w14:srgbClr>
+                </w14:shadow>
+                <w14:textOutline w14:w="0" w14:cap="flat" w14:cmpd="sng" w14:algn="ctr">
+                  <w14:noFill/>
+                  <w14:prstDash w14:val="solid"/>
+                  <w14:round/>
+                </w14:textOutline>
+              </w:rPr>
+              <w:t>No class</w:t>
+            </w:r>
+          </w:p>
+          <w:p>
+            <w:pPr>
+              <w:jc w:val="center"/>
+              <w:rPr>
+                <w:rFonts w:ascii="Times New Roman" w:hAnsi="Times New Roman" w:cs="Times New Roman"/>
                 <w:bCs/>
                 <w:color w:val="4472C4" w:themeColor="accent1"/>
                 <w:sz w:val="44"/>
@@ -1887,66 +2203,144 @@
               <w:jc w:val="center"/>
               <w:rPr>
                 <w:rFonts w:ascii="Times New Roman" w:hAnsi="Times New Roman" w:cs="Times New Roman"/>
-                <w:b/>
+                <w:bCs/>
+                <w:sz w:val="44"/>
+                <w:szCs w:val="44"/>
+                <w14:shadow w14:blurRad="38100" w14:dist="19050" w14:dir="2700000" w14:sx="100000" w14:sy="100000" w14:kx="0" w14:ky="0" w14:algn="tl">
+                  <w14:schemeClr w14:val="dk1">
+                    <w14:alpha w14:val="60000"/>
+                  </w14:schemeClr>
+                </w14:shadow>
+                <w14:textOutline w14:w="0" w14:cap="flat" w14:cmpd="sng" w14:algn="ctr">
+                  <w14:noFill/>
+                  <w14:prstDash w14:val="solid"/>
+                  <w14:round/>
+                </w14:textOutline>
+              </w:rPr>
+            </w:pPr>
+            <w:r>
+              <w:rPr>
+                <w:rFonts w:ascii="Times New Roman" w:hAnsi="Times New Roman" w:cs="Times New Roman"/>
+                <w:bCs/>
+                <w:sz w:val="44"/>
+                <w:szCs w:val="44"/>
+                <w14:shadow w14:blurRad="38100" w14:dist="19050" w14:dir="2700000" w14:sx="100000" w14:sy="100000" w14:kx="0" w14:ky="0" w14:algn="tl">
+                  <w14:schemeClr w14:val="dk1">
+                    <w14:alpha w14:val="60000"/>
+                  </w14:schemeClr>
+                </w14:shadow>
+                <w14:textOutline w14:w="0" w14:cap="flat" w14:cmpd="sng" w14:algn="ctr">
+                  <w14:noFill/>
+                  <w14:prstDash w14:val="solid"/>
+                  <w14:round/>
+                </w14:textOutline>
+              </w:rPr>
+              <w:t>CSE 4203</w:t>
+            </w:r>
+          </w:p>
+          <w:p>
+            <w:pPr>
+              <w:jc w:val="center"/>
+              <w:rPr>
+                <w:rFonts w:ascii="Times New Roman" w:hAnsi="Times New Roman" w:cs="Times New Roman"/>
+                <w:bCs/>
+                <w:color w:val="000000" w:themeColor="text1"/>
+                <w:sz w:val="44"/>
+                <w:szCs w:val="44"/>
+                <w14:shadow w14:blurRad="38100" w14:dist="19050" w14:dir="2700000" w14:sx="100000" w14:sy="100000" w14:kx="0" w14:ky="0" w14:algn="tl">
+                  <w14:schemeClr w14:val="dk1">
+                    <w14:alpha w14:val="60000"/>
+                  </w14:schemeClr>
+                </w14:shadow>
+                <w14:textOutline w14:w="0" w14:cap="flat" w14:cmpd="sng" w14:algn="ctr">
+                  <w14:noFill/>
+                  <w14:prstDash w14:val="solid"/>
+                  <w14:round/>
+                </w14:textOutline>
+              </w:rPr>
+            </w:pPr>
+            <w:r>
+              <w:rPr>
+                <w:rFonts w:ascii="Times New Roman" w:hAnsi="Times New Roman" w:cs="Times New Roman"/>
+                <w:bCs/>
+                <w:color w:val="000000" w:themeColor="text1"/>
+                <w:sz w:val="44"/>
+                <w:szCs w:val="44"/>
+                <w14:shadow w14:blurRad="38100" w14:dist="19050" w14:dir="2700000" w14:sx="100000" w14:sy="100000" w14:kx="0" w14:ky="0" w14:algn="tl">
+                  <w14:schemeClr w14:val="dk1">
+                    <w14:alpha w14:val="60000"/>
+                  </w14:schemeClr>
+                </w14:shadow>
+                <w14:textOutline w14:w="0" w14:cap="flat" w14:cmpd="sng" w14:algn="ctr">
+                  <w14:noFill/>
+                  <w14:prstDash w14:val="solid"/>
+                  <w14:round/>
+                </w14:textOutline>
+              </w:rPr>
+              <w:t xml:space="preserve">Room no. </w:t>
+            </w:r>
+            <w:r>
+              <w:rPr>
+                <w:rFonts w:ascii="Times New Roman" w:hAnsi="Times New Roman" w:cs="Times New Roman"/>
+                <w:bCs/>
+                <w:color w:val="000000" w:themeColor="text1"/>
+                <w:sz w:val="44"/>
+                <w:szCs w:val="44"/>
+                <w14:shadow w14:blurRad="38100" w14:dist="19050" w14:dir="2700000" w14:sx="100000" w14:sy="100000" w14:kx="0" w14:ky="0" w14:algn="tl">
+                  <w14:schemeClr w14:val="dk1">
+                    <w14:alpha w14:val="60000"/>
+                  </w14:schemeClr>
+                </w14:shadow>
+                <w14:textOutline w14:w="0" w14:cap="flat" w14:cmpd="sng" w14:algn="ctr">
+                  <w14:noFill/>
+                  <w14:prstDash w14:val="solid"/>
+                  <w14:round/>
+                </w14:textOutline>
+              </w:rPr>
+              <w:t>417</w:t>
+            </w:r>
+          </w:p>
+          <w:p>
+            <w:pPr>
+              <w:jc w:val="center"/>
+              <w:rPr>
+                <w:rFonts w:ascii="Times New Roman" w:hAnsi="Times New Roman" w:cs="Times New Roman"/>
                 <w:bCs/>
                 <w:color w:val="C45911" w:themeColor="accent2" w:themeShade="BF"/>
-                <w:sz w:val="48"/>
-                <w:szCs w:val="48"/>
-                <w14:shadow w14:blurRad="38100" w14:dist="25400" w14:dir="5400000" w14:sx="100000" w14:sy="100000" w14:kx="0" w14:ky="0" w14:algn="ctr">
-                  <w14:srgbClr w14:val="6E747A">
-                    <w14:alpha w14:val="57000"/>
-                  </w14:srgbClr>
-                </w14:shadow>
-                <w14:textOutline w14:w="0" w14:cap="flat" w14:cmpd="sng" w14:algn="ctr">
-                  <w14:noFill/>
-                  <w14:prstDash w14:val="solid"/>
-                  <w14:round/>
-                </w14:textOutline>
-              </w:rPr>
-            </w:pPr>
-            <w:r>
-              <w:rPr>
-                <w:rFonts w:ascii="Times New Roman" w:hAnsi="Times New Roman" w:cs="Times New Roman"/>
-                <w:b/>
-                <w:bCs/>
-                <w:color w:val="C45911" w:themeColor="accent2" w:themeShade="BF"/>
-                <w:sz w:val="48"/>
-                <w:szCs w:val="48"/>
-                <w14:shadow w14:blurRad="38100" w14:dist="25400" w14:dir="5400000" w14:sx="100000" w14:sy="100000" w14:kx="0" w14:ky="0" w14:algn="ctr">
-                  <w14:srgbClr w14:val="6E747A">
-                    <w14:alpha w14:val="57000"/>
-                  </w14:srgbClr>
-                </w14:shadow>
-                <w14:textOutline w14:w="0" w14:cap="flat" w14:cmpd="sng" w14:algn="ctr">
-                  <w14:noFill/>
-                  <w14:prstDash w14:val="solid"/>
-                  <w14:round/>
-                </w14:textOutline>
-              </w:rPr>
-              <w:t>No class</w:t>
-            </w:r>
-          </w:p>
-          <w:p>
-            <w:pPr>
-              <w:jc w:val="center"/>
-              <w:rPr>
-                <w:rFonts w:ascii="Times New Roman" w:hAnsi="Times New Roman" w:cs="Times New Roman"/>
-                <w:bCs/>
-                <w:color w:val="C45911" w:themeColor="accent2" w:themeShade="BF"/>
-                <w:sz w:val="44"/>
-                <w:szCs w:val="44"/>
-                <w14:shadow w14:blurRad="38100" w14:dist="19050" w14:dir="2700000" w14:sx="100000" w14:sy="100000" w14:kx="0" w14:ky="0" w14:algn="tl">
-                  <w14:schemeClr w14:val="dk1">
-                    <w14:alpha w14:val="60000"/>
-                  </w14:schemeClr>
-                </w14:shadow>
-                <w14:textOutline w14:w="0" w14:cap="flat" w14:cmpd="sng" w14:algn="ctr">
-                  <w14:noFill/>
-                  <w14:prstDash w14:val="solid"/>
-                  <w14:round/>
-                </w14:textOutline>
-              </w:rPr>
-            </w:pPr>
+                <w:sz w:val="44"/>
+                <w:szCs w:val="44"/>
+                <w14:shadow w14:blurRad="38100" w14:dist="19050" w14:dir="2700000" w14:sx="100000" w14:sy="100000" w14:kx="0" w14:ky="0" w14:algn="tl">
+                  <w14:schemeClr w14:val="dk1">
+                    <w14:alpha w14:val="60000"/>
+                  </w14:schemeClr>
+                </w14:shadow>
+                <w14:textOutline w14:w="0" w14:cap="flat" w14:cmpd="sng" w14:algn="ctr">
+                  <w14:noFill/>
+                  <w14:prstDash w14:val="solid"/>
+                  <w14:round/>
+                </w14:textOutline>
+              </w:rPr>
+            </w:pPr>
+            <w:r>
+              <w:rPr>
+                <w:rFonts w:ascii="Times New Roman" w:hAnsi="Times New Roman" w:cs="Times New Roman"/>
+                <w:bCs/>
+                <w:color w:val="000000" w:themeColor="text1"/>
+                <w:sz w:val="44"/>
+                <w:szCs w:val="44"/>
+                <w14:shadow w14:blurRad="38100" w14:dist="19050" w14:dir="2700000" w14:sx="100000" w14:sy="100000" w14:kx="0" w14:ky="0" w14:algn="tl">
+                  <w14:schemeClr w14:val="dk1">
+                    <w14:alpha w14:val="60000"/>
+                  </w14:schemeClr>
+                </w14:shadow>
+                <w14:textOutline w14:w="0" w14:cap="flat" w14:cmpd="sng" w14:algn="ctr">
+                  <w14:noFill/>
+                  <w14:prstDash w14:val="solid"/>
+                  <w14:round/>
+                </w14:textOutline>
+              </w:rPr>
+              <w:t>Humayara ma’am</w:t>
+            </w:r>
           </w:p>
         </w:tc>
         <w:tc>
@@ -1960,127 +2354,6 @@
           </w:tcPr>
           <w:p>
             <w:pPr>
-              <w:jc w:val="center"/>
-              <w:rPr>
-                <w:rFonts w:ascii="Times New Roman" w:hAnsi="Times New Roman" w:cs="Times New Roman"/>
-                <w:bCs/>
-                <w:sz w:val="44"/>
-                <w:szCs w:val="44"/>
-                <w14:shadow w14:blurRad="38100" w14:dist="19050" w14:dir="2700000" w14:sx="100000" w14:sy="100000" w14:kx="0" w14:ky="0" w14:algn="tl">
-                  <w14:schemeClr w14:val="dk1">
-                    <w14:alpha w14:val="60000"/>
-                  </w14:schemeClr>
-                </w14:shadow>
-                <w14:textOutline w14:w="0" w14:cap="flat" w14:cmpd="sng" w14:algn="ctr">
-                  <w14:noFill/>
-                  <w14:prstDash w14:val="solid"/>
-                  <w14:round/>
-                </w14:textOutline>
-              </w:rPr>
-            </w:pPr>
-            <w:r>
-              <w:rPr>
-                <w:rFonts w:ascii="Times New Roman" w:hAnsi="Times New Roman" w:cs="Times New Roman"/>
-                <w:bCs/>
-                <w:sz w:val="44"/>
-                <w:szCs w:val="44"/>
-                <w14:shadow w14:blurRad="38100" w14:dist="19050" w14:dir="2700000" w14:sx="100000" w14:sy="100000" w14:kx="0" w14:ky="0" w14:algn="tl">
-                  <w14:schemeClr w14:val="dk1">
-                    <w14:alpha w14:val="60000"/>
-                  </w14:schemeClr>
-                </w14:shadow>
-                <w14:textOutline w14:w="0" w14:cap="flat" w14:cmpd="sng" w14:algn="ctr">
-                  <w14:noFill/>
-                  <w14:prstDash w14:val="solid"/>
-                  <w14:round/>
-                </w14:textOutline>
-              </w:rPr>
-              <w:t xml:space="preserve">CSE </w:t>
-            </w:r>
-            <w:r>
-              <w:rPr>
-                <w:rFonts w:ascii="Times New Roman" w:hAnsi="Times New Roman" w:cs="Times New Roman"/>
-                <w:bCs/>
-                <w:sz w:val="44"/>
-                <w:szCs w:val="44"/>
-                <w14:shadow w14:blurRad="38100" w14:dist="19050" w14:dir="2700000" w14:sx="100000" w14:sy="100000" w14:kx="0" w14:ky="0" w14:algn="tl">
-                  <w14:schemeClr w14:val="dk1">
-                    <w14:alpha w14:val="60000"/>
-                  </w14:schemeClr>
-                </w14:shadow>
-                <w14:textOutline w14:w="0" w14:cap="flat" w14:cmpd="sng" w14:algn="ctr">
-                  <w14:noFill/>
-                  <w14:prstDash w14:val="solid"/>
-                  <w14:round/>
-                </w14:textOutline>
-              </w:rPr>
-              <w:t>4103</w:t>
-            </w:r>
-          </w:p>
-          <w:p>
-            <w:pPr>
-              <w:jc w:val="center"/>
-              <w:rPr>
-                <w:rFonts w:ascii="Times New Roman" w:hAnsi="Times New Roman" w:cs="Times New Roman"/>
-                <w:bCs/>
-                <w:color w:val="000000" w:themeColor="text1"/>
-                <w:sz w:val="44"/>
-                <w:szCs w:val="44"/>
-                <w14:shadow w14:blurRad="38100" w14:dist="19050" w14:dir="2700000" w14:sx="100000" w14:sy="100000" w14:kx="0" w14:ky="0" w14:algn="tl">
-                  <w14:schemeClr w14:val="dk1">
-                    <w14:alpha w14:val="60000"/>
-                  </w14:schemeClr>
-                </w14:shadow>
-                <w14:textOutline w14:w="0" w14:cap="flat" w14:cmpd="sng" w14:algn="ctr">
-                  <w14:noFill/>
-                  <w14:prstDash w14:val="solid"/>
-                  <w14:round/>
-                </w14:textOutline>
-              </w:rPr>
-            </w:pPr>
-            <w:r>
-              <w:rPr>
-                <w:rFonts w:ascii="Times New Roman" w:hAnsi="Times New Roman" w:cs="Times New Roman"/>
-                <w:bCs/>
-                <w:color w:val="000000" w:themeColor="text1"/>
-                <w:sz w:val="44"/>
-                <w:szCs w:val="44"/>
-                <w14:shadow w14:blurRad="38100" w14:dist="19050" w14:dir="2700000" w14:sx="100000" w14:sy="100000" w14:kx="0" w14:ky="0" w14:algn="tl">
-                  <w14:schemeClr w14:val="dk1">
-                    <w14:alpha w14:val="60000"/>
-                  </w14:schemeClr>
-                </w14:shadow>
-                <w14:textOutline w14:w="0" w14:cap="flat" w14:cmpd="sng" w14:algn="ctr">
-                  <w14:noFill/>
-                  <w14:prstDash w14:val="solid"/>
-                  <w14:round/>
-                </w14:textOutline>
-              </w:rPr>
-              <w:t xml:space="preserve">Room no. </w:t>
-            </w:r>
-            <w:r>
-              <w:rPr>
-                <w:rFonts w:ascii="Times New Roman" w:hAnsi="Times New Roman" w:cs="Times New Roman"/>
-                <w:bCs/>
-                <w:color w:val="000000" w:themeColor="text1"/>
-                <w:sz w:val="44"/>
-                <w:szCs w:val="44"/>
-                <w14:shadow w14:blurRad="38100" w14:dist="19050" w14:dir="2700000" w14:sx="100000" w14:sy="100000" w14:kx="0" w14:ky="0" w14:algn="tl">
-                  <w14:schemeClr w14:val="dk1">
-                    <w14:alpha w14:val="60000"/>
-                  </w14:schemeClr>
-                </w14:shadow>
-                <w14:textOutline w14:w="0" w14:cap="flat" w14:cmpd="sng" w14:algn="ctr">
-                  <w14:noFill/>
-                  <w14:prstDash w14:val="solid"/>
-                  <w14:round/>
-                </w14:textOutline>
-              </w:rPr>
-              <w:t>510</w:t>
-            </w:r>
-          </w:p>
-          <w:p>
-            <w:pPr>
               <w:tabs>
                 <w:tab w:val="left" w:pos="195"/>
                 <w:tab w:val="center" w:pos="1294"/>
@@ -2104,26 +2377,6 @@
                 </w14:textOutline>
               </w:rPr>
             </w:pPr>
-            <w:r>
-              <w:rPr>
-                <w:rFonts w:ascii="Times New Roman" w:hAnsi="Times New Roman" w:cs="Times New Roman"/>
-                <w:bCs/>
-                <w:color w:val="000000" w:themeColor="text1"/>
-                <w:sz w:val="44"/>
-                <w:szCs w:val="44"/>
-                <w14:shadow w14:blurRad="38100" w14:dist="19050" w14:dir="2700000" w14:sx="100000" w14:sy="100000" w14:kx="0" w14:ky="0" w14:algn="tl">
-                  <w14:schemeClr w14:val="dk1">
-                    <w14:alpha w14:val="60000"/>
-                  </w14:schemeClr>
-                </w14:shadow>
-                <w14:textOutline w14:w="0" w14:cap="flat" w14:cmpd="sng" w14:algn="ctr">
-                  <w14:noFill/>
-                  <w14:prstDash w14:val="solid"/>
-                  <w14:round/>
-                </w14:textOutline>
-              </w:rPr>
-              <w:t>Khorshed Sir</w:t>
-            </w:r>
           </w:p>
         </w:tc>
         <w:tc>
@@ -2331,143 +2584,21 @@
               <w:rPr>
                 <w:rFonts w:ascii="Times New Roman" w:hAnsi="Times New Roman" w:cs="Times New Roman"/>
                 <w:bCs/>
-                <w:sz w:val="44"/>
-                <w:szCs w:val="44"/>
-                <w14:shadow w14:blurRad="38100" w14:dist="19050" w14:dir="2700000" w14:sx="100000" w14:sy="100000" w14:kx="0" w14:ky="0" w14:algn="tl">
-                  <w14:schemeClr w14:val="dk1">
-                    <w14:alpha w14:val="60000"/>
-                  </w14:schemeClr>
-                </w14:shadow>
-                <w14:textOutline w14:w="0" w14:cap="flat" w14:cmpd="sng" w14:algn="ctr">
-                  <w14:noFill/>
-                  <w14:prstDash w14:val="solid"/>
-                  <w14:round/>
-                </w14:textOutline>
-              </w:rPr>
-            </w:pPr>
-            <w:r>
-              <w:rPr>
-                <w:rFonts w:ascii="Times New Roman" w:hAnsi="Times New Roman" w:cs="Times New Roman"/>
-                <w:bCs/>
-                <w:sz w:val="44"/>
-                <w:szCs w:val="44"/>
-                <w14:shadow w14:blurRad="38100" w14:dist="19050" w14:dir="2700000" w14:sx="100000" w14:sy="100000" w14:kx="0" w14:ky="0" w14:algn="tl">
-                  <w14:schemeClr w14:val="dk1">
-                    <w14:alpha w14:val="60000"/>
-                  </w14:schemeClr>
-                </w14:shadow>
-                <w14:textOutline w14:w="0" w14:cap="flat" w14:cmpd="sng" w14:algn="ctr">
-                  <w14:noFill/>
-                  <w14:prstDash w14:val="solid"/>
-                  <w14:round/>
-                </w14:textOutline>
-              </w:rPr>
-              <w:t>CSE 4106</w:t>
-            </w:r>
-          </w:p>
-          <w:p>
-            <w:pPr>
-              <w:jc w:val="center"/>
-              <w:rPr>
-                <w:rFonts w:ascii="Times New Roman" w:hAnsi="Times New Roman" w:cs="Times New Roman"/>
-                <w:bCs/>
-                <w:color w:val="000000" w:themeColor="text1"/>
-                <w:sz w:val="44"/>
-                <w:szCs w:val="44"/>
-                <w14:shadow w14:blurRad="38100" w14:dist="19050" w14:dir="2700000" w14:sx="100000" w14:sy="100000" w14:kx="0" w14:ky="0" w14:algn="tl">
-                  <w14:schemeClr w14:val="dk1">
-                    <w14:alpha w14:val="60000"/>
-                  </w14:schemeClr>
-                </w14:shadow>
-                <w14:textOutline w14:w="0" w14:cap="flat" w14:cmpd="sng" w14:algn="ctr">
-                  <w14:noFill/>
-                  <w14:prstDash w14:val="solid"/>
-                  <w14:round/>
-                </w14:textOutline>
-              </w:rPr>
-            </w:pPr>
-            <w:r>
-              <w:rPr>
-                <w:rFonts w:ascii="Times New Roman" w:hAnsi="Times New Roman" w:cs="Times New Roman"/>
-                <w:bCs/>
-                <w:color w:val="000000" w:themeColor="text1"/>
-                <w:sz w:val="44"/>
-                <w:szCs w:val="44"/>
-                <w14:shadow w14:blurRad="38100" w14:dist="19050" w14:dir="2700000" w14:sx="100000" w14:sy="100000" w14:kx="0" w14:ky="0" w14:algn="tl">
-                  <w14:schemeClr w14:val="dk1">
-                    <w14:alpha w14:val="60000"/>
-                  </w14:schemeClr>
-                </w14:shadow>
-                <w14:textOutline w14:w="0" w14:cap="flat" w14:cmpd="sng" w14:algn="ctr">
-                  <w14:noFill/>
-                  <w14:prstDash w14:val="solid"/>
-                  <w14:round/>
-                </w14:textOutline>
-              </w:rPr>
-              <w:t xml:space="preserve">Room no. </w:t>
-            </w:r>
-            <w:r>
-              <w:rPr>
-                <w:rFonts w:ascii="Times New Roman" w:hAnsi="Times New Roman" w:cs="Times New Roman"/>
-                <w:bCs/>
-                <w:color w:val="000000" w:themeColor="text1"/>
-                <w:sz w:val="44"/>
-                <w:szCs w:val="44"/>
-                <w14:shadow w14:blurRad="38100" w14:dist="19050" w14:dir="2700000" w14:sx="100000" w14:sy="100000" w14:kx="0" w14:ky="0" w14:algn="tl">
-                  <w14:schemeClr w14:val="dk1">
-                    <w14:alpha w14:val="60000"/>
-                  </w14:schemeClr>
-                </w14:shadow>
-                <w14:textOutline w14:w="0" w14:cap="flat" w14:cmpd="sng" w14:algn="ctr">
-                  <w14:noFill/>
-                  <w14:prstDash w14:val="solid"/>
-                  <w14:round/>
-                </w14:textOutline>
-              </w:rPr>
-              <w:t>704</w:t>
-            </w:r>
-          </w:p>
-          <w:p>
-            <w:pPr>
-              <w:jc w:val="center"/>
-              <w:rPr>
-                <w:rFonts w:ascii="Times New Roman" w:hAnsi="Times New Roman" w:cs="Times New Roman"/>
-                <w:bCs/>
-                <w:color w:val="000000" w:themeColor="text1"/>
-                <w:sz w:val="44"/>
-                <w:szCs w:val="44"/>
-                <w14:shadow w14:blurRad="38100" w14:dist="19050" w14:dir="2700000" w14:sx="100000" w14:sy="100000" w14:kx="0" w14:ky="0" w14:algn="tl">
-                  <w14:schemeClr w14:val="dk1">
-                    <w14:alpha w14:val="60000"/>
-                  </w14:schemeClr>
-                </w14:shadow>
-                <w14:textOutline w14:w="0" w14:cap="flat" w14:cmpd="sng" w14:algn="ctr">
-                  <w14:noFill/>
-                  <w14:prstDash w14:val="solid"/>
-                  <w14:round/>
-                </w14:textOutline>
-              </w:rPr>
-            </w:pPr>
-            <w:r>
-              <w:rPr>
-                <w:rFonts w:ascii="Times New Roman" w:hAnsi="Times New Roman" w:cs="Times New Roman"/>
-                <w:bCs/>
-                <w:color w:val="000000" w:themeColor="text1"/>
-                <w:sz w:val="44"/>
-                <w:szCs w:val="44"/>
-                <w14:shadow w14:blurRad="38100" w14:dist="19050" w14:dir="2700000" w14:sx="100000" w14:sy="100000" w14:kx="0" w14:ky="0" w14:algn="tl">
-                  <w14:schemeClr w14:val="dk1">
-                    <w14:alpha w14:val="60000"/>
-                  </w14:schemeClr>
-                </w14:shadow>
-                <w14:textOutline w14:w="0" w14:cap="flat" w14:cmpd="sng" w14:algn="ctr">
-                  <w14:noFill/>
-                  <w14:prstDash w14:val="solid"/>
-                  <w14:round/>
-                </w14:textOutline>
-              </w:rPr>
-              <w:t>Shanta ma’am</w:t>
-            </w:r>
+                <w:color w:val="000000" w:themeColor="text1"/>
+                <w:sz w:val="44"/>
+                <w:szCs w:val="44"/>
+                <w14:shadow w14:blurRad="38100" w14:dist="19050" w14:dir="2700000" w14:sx="100000" w14:sy="100000" w14:kx="0" w14:ky="0" w14:algn="tl">
+                  <w14:schemeClr w14:val="dk1">
+                    <w14:alpha w14:val="60000"/>
+                  </w14:schemeClr>
+                </w14:shadow>
+                <w14:textOutline w14:w="0" w14:cap="flat" w14:cmpd="sng" w14:algn="ctr">
+                  <w14:noFill/>
+                  <w14:prstDash w14:val="solid"/>
+                  <w14:round/>
+                </w14:textOutline>
+              </w:rPr>
+            </w:pPr>
           </w:p>
         </w:tc>
         <w:tc>
@@ -2486,145 +2617,21 @@
               <w:rPr>
                 <w:rFonts w:ascii="Times New Roman" w:hAnsi="Times New Roman" w:cs="Times New Roman"/>
                 <w:bCs/>
-                <w:color w:val="1F4E79" w:themeColor="accent5" w:themeShade="80"/>
-                <w:sz w:val="44"/>
-                <w:szCs w:val="44"/>
-                <w14:shadow w14:blurRad="38100" w14:dist="19050" w14:dir="2700000" w14:sx="100000" w14:sy="100000" w14:kx="0" w14:ky="0" w14:algn="tl">
-                  <w14:schemeClr w14:val="dk1">
-                    <w14:alpha w14:val="60000"/>
-                  </w14:schemeClr>
-                </w14:shadow>
-                <w14:textOutline w14:w="0" w14:cap="flat" w14:cmpd="sng" w14:algn="ctr">
-                  <w14:noFill/>
-                  <w14:prstDash w14:val="solid"/>
-                  <w14:round/>
-                </w14:textOutline>
-              </w:rPr>
-            </w:pPr>
-            <w:r>
-              <w:rPr>
-                <w:rFonts w:ascii="Times New Roman" w:hAnsi="Times New Roman" w:cs="Times New Roman"/>
-                <w:bCs/>
-                <w:color w:val="1F4E79" w:themeColor="accent5" w:themeShade="80"/>
-                <w:sz w:val="44"/>
-                <w:szCs w:val="44"/>
-                <w14:shadow w14:blurRad="38100" w14:dist="19050" w14:dir="2700000" w14:sx="100000" w14:sy="100000" w14:kx="0" w14:ky="0" w14:algn="tl">
-                  <w14:schemeClr w14:val="dk1">
-                    <w14:alpha w14:val="60000"/>
-                  </w14:schemeClr>
-                </w14:shadow>
-                <w14:textOutline w14:w="0" w14:cap="flat" w14:cmpd="sng" w14:algn="ctr">
-                  <w14:noFill/>
-                  <w14:prstDash w14:val="solid"/>
-                  <w14:round/>
-                </w14:textOutline>
-              </w:rPr>
-              <w:t>IPE 4102</w:t>
-            </w:r>
-          </w:p>
-          <w:p>
-            <w:pPr>
-              <w:jc w:val="center"/>
-              <w:rPr>
-                <w:rFonts w:ascii="Times New Roman" w:hAnsi="Times New Roman" w:cs="Times New Roman"/>
-                <w:bCs/>
-                <w:color w:val="000000" w:themeColor="text1"/>
-                <w:sz w:val="44"/>
-                <w:szCs w:val="44"/>
-                <w14:shadow w14:blurRad="38100" w14:dist="19050" w14:dir="2700000" w14:sx="100000" w14:sy="100000" w14:kx="0" w14:ky="0" w14:algn="tl">
-                  <w14:schemeClr w14:val="dk1">
-                    <w14:alpha w14:val="60000"/>
-                  </w14:schemeClr>
-                </w14:shadow>
-                <w14:textOutline w14:w="0" w14:cap="flat" w14:cmpd="sng" w14:algn="ctr">
-                  <w14:noFill/>
-                  <w14:prstDash w14:val="solid"/>
-                  <w14:round/>
-                </w14:textOutline>
-              </w:rPr>
-            </w:pPr>
-            <w:r>
-              <w:rPr>
-                <w:rFonts w:ascii="Times New Roman" w:hAnsi="Times New Roman" w:cs="Times New Roman"/>
-                <w:bCs/>
-                <w:color w:val="000000" w:themeColor="text1"/>
-                <w:sz w:val="44"/>
-                <w:szCs w:val="44"/>
-                <w14:shadow w14:blurRad="38100" w14:dist="19050" w14:dir="2700000" w14:sx="100000" w14:sy="100000" w14:kx="0" w14:ky="0" w14:algn="tl">
-                  <w14:schemeClr w14:val="dk1">
-                    <w14:alpha w14:val="60000"/>
-                  </w14:schemeClr>
-                </w14:shadow>
-                <w14:textOutline w14:w="0" w14:cap="flat" w14:cmpd="sng" w14:algn="ctr">
-                  <w14:noFill/>
-                  <w14:prstDash w14:val="solid"/>
-                  <w14:round/>
-                </w14:textOutline>
-              </w:rPr>
-              <w:t xml:space="preserve">Room no. </w:t>
-            </w:r>
-            <w:r>
-              <w:rPr>
-                <w:rFonts w:ascii="Times New Roman" w:hAnsi="Times New Roman" w:cs="Times New Roman"/>
-                <w:bCs/>
-                <w:color w:val="000000" w:themeColor="text1"/>
-                <w:sz w:val="44"/>
-                <w:szCs w:val="44"/>
-                <w14:shadow w14:blurRad="38100" w14:dist="19050" w14:dir="2700000" w14:sx="100000" w14:sy="100000" w14:kx="0" w14:ky="0" w14:algn="tl">
-                  <w14:schemeClr w14:val="dk1">
-                    <w14:alpha w14:val="60000"/>
-                  </w14:schemeClr>
-                </w14:shadow>
-                <w14:textOutline w14:w="0" w14:cap="flat" w14:cmpd="sng" w14:algn="ctr">
-                  <w14:noFill/>
-                  <w14:prstDash w14:val="solid"/>
-                  <w14:round/>
-                </w14:textOutline>
-              </w:rPr>
-              <w:t>512</w:t>
-            </w:r>
-          </w:p>
-          <w:p>
-            <w:pPr>
-              <w:jc w:val="center"/>
-              <w:rPr>
-                <w:rFonts w:ascii="Times New Roman" w:hAnsi="Times New Roman" w:cs="Times New Roman"/>
-                <w:bCs/>
-                <w:color w:val="000000" w:themeColor="text1"/>
-                <w:sz w:val="44"/>
-                <w:szCs w:val="44"/>
-                <w14:shadow w14:blurRad="38100" w14:dist="19050" w14:dir="2700000" w14:sx="100000" w14:sy="100000" w14:kx="0" w14:ky="0" w14:algn="tl">
-                  <w14:schemeClr w14:val="dk1">
-                    <w14:alpha w14:val="60000"/>
-                  </w14:schemeClr>
-                </w14:shadow>
-                <w14:textOutline w14:w="0" w14:cap="flat" w14:cmpd="sng" w14:algn="ctr">
-                  <w14:noFill/>
-                  <w14:prstDash w14:val="solid"/>
-                  <w14:round/>
-                </w14:textOutline>
-              </w:rPr>
-            </w:pPr>
-            <w:r>
-              <w:rPr>
-                <w:rFonts w:ascii="Times New Roman" w:hAnsi="Times New Roman" w:cs="Times New Roman"/>
-                <w:bCs/>
-                <w:color w:val="000000" w:themeColor="text1"/>
-                <w:sz w:val="44"/>
-                <w:szCs w:val="44"/>
-                <w14:shadow w14:blurRad="38100" w14:dist="19050" w14:dir="2700000" w14:sx="100000" w14:sy="100000" w14:kx="0" w14:ky="0" w14:algn="tl">
-                  <w14:schemeClr w14:val="dk1">
-                    <w14:alpha w14:val="60000"/>
-                  </w14:schemeClr>
-                </w14:shadow>
-                <w14:textOutline w14:w="0" w14:cap="flat" w14:cmpd="sng" w14:algn="ctr">
-                  <w14:noFill/>
-                  <w14:prstDash w14:val="solid"/>
-                  <w14:round/>
-                </w14:textOutline>
-              </w:rPr>
-              <w:t>Tahmid Sir</w:t>
-            </w:r>
+                <w:color w:val="000000" w:themeColor="text1"/>
+                <w:sz w:val="44"/>
+                <w:szCs w:val="44"/>
+                <w14:shadow w14:blurRad="38100" w14:dist="19050" w14:dir="2700000" w14:sx="100000" w14:sy="100000" w14:kx="0" w14:ky="0" w14:algn="tl">
+                  <w14:schemeClr w14:val="dk1">
+                    <w14:alpha w14:val="60000"/>
+                  </w14:schemeClr>
+                </w14:shadow>
+                <w14:textOutline w14:w="0" w14:cap="flat" w14:cmpd="sng" w14:algn="ctr">
+                  <w14:noFill/>
+                  <w14:prstDash w14:val="solid"/>
+                  <w14:round/>
+                </w14:textOutline>
+              </w:rPr>
+            </w:pPr>
           </w:p>
         </w:tc>
         <w:tc>
@@ -2676,6 +2683,108 @@
               <w:rPr>
                 <w:rFonts w:ascii="Times New Roman" w:hAnsi="Times New Roman" w:cs="Times New Roman"/>
                 <w:bCs/>
+                <w:sz w:val="44"/>
+                <w:szCs w:val="44"/>
+                <w14:shadow w14:blurRad="38100" w14:dist="19050" w14:dir="2700000" w14:sx="100000" w14:sy="100000" w14:kx="0" w14:ky="0" w14:algn="tl">
+                  <w14:schemeClr w14:val="dk1">
+                    <w14:alpha w14:val="60000"/>
+                  </w14:schemeClr>
+                </w14:shadow>
+                <w14:textOutline w14:w="0" w14:cap="flat" w14:cmpd="sng" w14:algn="ctr">
+                  <w14:noFill/>
+                  <w14:prstDash w14:val="solid"/>
+                  <w14:round/>
+                </w14:textOutline>
+              </w:rPr>
+            </w:pPr>
+            <w:r>
+              <w:rPr>
+                <w:rFonts w:ascii="Times New Roman" w:hAnsi="Times New Roman" w:cs="Times New Roman"/>
+                <w:bCs/>
+                <w:sz w:val="44"/>
+                <w:szCs w:val="44"/>
+                <w14:shadow w14:blurRad="38100" w14:dist="19050" w14:dir="2700000" w14:sx="100000" w14:sy="100000" w14:kx="0" w14:ky="0" w14:algn="tl">
+                  <w14:schemeClr w14:val="dk1">
+                    <w14:alpha w14:val="60000"/>
+                  </w14:schemeClr>
+                </w14:shadow>
+                <w14:textOutline w14:w="0" w14:cap="flat" w14:cmpd="sng" w14:algn="ctr">
+                  <w14:noFill/>
+                  <w14:prstDash w14:val="solid"/>
+                  <w14:round/>
+                </w14:textOutline>
+              </w:rPr>
+              <w:t>CSE 4217</w:t>
+            </w:r>
+          </w:p>
+          <w:p>
+            <w:pPr>
+              <w:jc w:val="center"/>
+              <w:rPr>
+                <w:rFonts w:ascii="Times New Roman" w:hAnsi="Times New Roman" w:cs="Times New Roman"/>
+                <w:bCs/>
+                <w:color w:val="000000" w:themeColor="text1"/>
+                <w:sz w:val="44"/>
+                <w:szCs w:val="44"/>
+                <w14:shadow w14:blurRad="38100" w14:dist="19050" w14:dir="2700000" w14:sx="100000" w14:sy="100000" w14:kx="0" w14:ky="0" w14:algn="tl">
+                  <w14:schemeClr w14:val="dk1">
+                    <w14:alpha w14:val="60000"/>
+                  </w14:schemeClr>
+                </w14:shadow>
+                <w14:textOutline w14:w="0" w14:cap="flat" w14:cmpd="sng" w14:algn="ctr">
+                  <w14:noFill/>
+                  <w14:prstDash w14:val="solid"/>
+                  <w14:round/>
+                </w14:textOutline>
+              </w:rPr>
+            </w:pPr>
+            <w:r>
+              <w:rPr>
+                <w:rFonts w:ascii="Times New Roman" w:hAnsi="Times New Roman" w:cs="Times New Roman"/>
+                <w:bCs/>
+                <w:color w:val="000000" w:themeColor="text1"/>
+                <w:sz w:val="44"/>
+                <w:szCs w:val="44"/>
+                <w14:shadow w14:blurRad="38100" w14:dist="19050" w14:dir="2700000" w14:sx="100000" w14:sy="100000" w14:kx="0" w14:ky="0" w14:algn="tl">
+                  <w14:schemeClr w14:val="dk1">
+                    <w14:alpha w14:val="60000"/>
+                  </w14:schemeClr>
+                </w14:shadow>
+                <w14:textOutline w14:w="0" w14:cap="flat" w14:cmpd="sng" w14:algn="ctr">
+                  <w14:noFill/>
+                  <w14:prstDash w14:val="solid"/>
+                  <w14:round/>
+                </w14:textOutline>
+              </w:rPr>
+              <w:t xml:space="preserve">Room no. </w:t>
+            </w:r>
+            <w:r>
+              <w:rPr>
+                <w:rFonts w:ascii="Times New Roman" w:hAnsi="Times New Roman" w:cs="Times New Roman"/>
+                <w:bCs/>
+                <w:color w:val="000000" w:themeColor="text1"/>
+                <w:sz w:val="44"/>
+                <w:szCs w:val="44"/>
+                <w14:shadow w14:blurRad="38100" w14:dist="19050" w14:dir="2700000" w14:sx="100000" w14:sy="100000" w14:kx="0" w14:ky="0" w14:algn="tl">
+                  <w14:schemeClr w14:val="dk1">
+                    <w14:alpha w14:val="60000"/>
+                  </w14:schemeClr>
+                </w14:shadow>
+                <w14:textOutline w14:w="0" w14:cap="flat" w14:cmpd="sng" w14:algn="ctr">
+                  <w14:noFill/>
+                  <w14:prstDash w14:val="solid"/>
+                  <w14:round/>
+                </w14:textOutline>
+              </w:rPr>
+              <w:t>315</w:t>
+            </w:r>
+          </w:p>
+          <w:p>
+            <w:pPr>
+              <w:jc w:val="center"/>
+              <w:rPr>
+                <w:rFonts w:ascii="Times New Roman" w:hAnsi="Times New Roman" w:cs="Times New Roman"/>
+                <w:bCs/>
                 <w:color w:val="C45911" w:themeColor="accent2" w:themeShade="BF"/>
                 <w:sz w:val="44"/>
                 <w:szCs w:val="44"/>
@@ -2691,6 +2800,26 @@
                 </w14:textOutline>
               </w:rPr>
             </w:pPr>
+            <w:r>
+              <w:rPr>
+                <w:rFonts w:ascii="Times New Roman" w:hAnsi="Times New Roman" w:cs="Times New Roman"/>
+                <w:bCs/>
+                <w:color w:val="000000" w:themeColor="text1"/>
+                <w:sz w:val="44"/>
+                <w:szCs w:val="44"/>
+                <w14:shadow w14:blurRad="38100" w14:dist="19050" w14:dir="2700000" w14:sx="100000" w14:sy="100000" w14:kx="0" w14:ky="0" w14:algn="tl">
+                  <w14:schemeClr w14:val="dk1">
+                    <w14:alpha w14:val="60000"/>
+                  </w14:schemeClr>
+                </w14:shadow>
+                <w14:textOutline w14:w="0" w14:cap="flat" w14:cmpd="sng" w14:algn="ctr">
+                  <w14:noFill/>
+                  <w14:prstDash w14:val="solid"/>
+                  <w14:round/>
+                </w14:textOutline>
+              </w:rPr>
+              <w:t>Nafisa ma’am</w:t>
+            </w:r>
           </w:p>
         </w:tc>
         <w:tc>
@@ -3461,7 +3590,64 @@
                   <w14:round/>
                 </w14:textOutline>
               </w:rPr>
-              <w:t>4103</w:t>
+              <w:t>4</w:t>
+            </w:r>
+            <w:r>
+              <w:rPr>
+                <w:rFonts w:ascii="Times New Roman" w:hAnsi="Times New Roman" w:cs="Times New Roman"/>
+                <w:bCs/>
+                <w:sz w:val="44"/>
+                <w:szCs w:val="44"/>
+                <w14:shadow w14:blurRad="38100" w14:dist="19050" w14:dir="2700000" w14:sx="100000" w14:sy="100000" w14:kx="0" w14:ky="0" w14:algn="tl">
+                  <w14:schemeClr w14:val="dk1">
+                    <w14:alpha w14:val="60000"/>
+                  </w14:schemeClr>
+                </w14:shadow>
+                <w14:textOutline w14:w="0" w14:cap="flat" w14:cmpd="sng" w14:algn="ctr">
+                  <w14:noFill/>
+                  <w14:prstDash w14:val="solid"/>
+                  <w14:round/>
+                </w14:textOutline>
+              </w:rPr>
+              <w:t>2</w:t>
+            </w:r>
+            <w:r>
+              <w:rPr>
+                <w:rFonts w:ascii="Times New Roman" w:hAnsi="Times New Roman" w:cs="Times New Roman"/>
+                <w:bCs/>
+                <w:sz w:val="44"/>
+                <w:szCs w:val="44"/>
+                <w14:shadow w14:blurRad="38100" w14:dist="19050" w14:dir="2700000" w14:sx="100000" w14:sy="100000" w14:kx="0" w14:ky="0" w14:algn="tl">
+                  <w14:schemeClr w14:val="dk1">
+                    <w14:alpha w14:val="60000"/>
+                  </w14:schemeClr>
+                </w14:shadow>
+                <w14:textOutline w14:w="0" w14:cap="flat" w14:cmpd="sng" w14:algn="ctr">
+                  <w14:noFill/>
+                  <w14:prstDash w14:val="solid"/>
+                  <w14:round/>
+                </w14:textOutline>
+              </w:rPr>
+              <w:t>1</w:t>
+            </w:r>
+            <w:r>
+              <w:rPr>
+                <w:rFonts w:ascii="Times New Roman" w:hAnsi="Times New Roman" w:cs="Times New Roman"/>
+                <w:bCs/>
+                <w:sz w:val="44"/>
+                <w:szCs w:val="44"/>
+                <w14:shadow w14:blurRad="38100" w14:dist="19050" w14:dir="2700000" w14:sx="100000" w14:sy="100000" w14:kx="0" w14:ky="0" w14:algn="tl">
+                  <w14:schemeClr w14:val="dk1">
+                    <w14:alpha w14:val="60000"/>
+                  </w14:schemeClr>
+                </w14:shadow>
+                <w14:textOutline w14:w="0" w14:cap="flat" w14:cmpd="sng" w14:algn="ctr">
+                  <w14:noFill/>
+                  <w14:prstDash w14:val="solid"/>
+                  <w14:round/>
+                </w14:textOutline>
+              </w:rPr>
+              <w:t>3</w:t>
             </w:r>
           </w:p>
           <w:p>
@@ -3523,7 +3709,27 @@
                   <w14:round/>
                 </w14:textOutline>
               </w:rPr>
-              <w:t>607</w:t>
+              <w:t>60</w:t>
+            </w:r>
+            <w:r>
+              <w:rPr>
+                <w:rFonts w:ascii="Times New Roman" w:hAnsi="Times New Roman" w:cs="Times New Roman"/>
+                <w:bCs/>
+                <w:color w:val="000000" w:themeColor="text1"/>
+                <w:sz w:val="44"/>
+                <w:szCs w:val="44"/>
+                <w14:shadow w14:blurRad="38100" w14:dist="19050" w14:dir="2700000" w14:sx="100000" w14:sy="100000" w14:kx="0" w14:ky="0" w14:algn="tl">
+                  <w14:schemeClr w14:val="dk1">
+                    <w14:alpha w14:val="60000"/>
+                  </w14:schemeClr>
+                </w14:shadow>
+                <w14:textOutline w14:w="0" w14:cap="flat" w14:cmpd="sng" w14:algn="ctr">
+                  <w14:noFill/>
+                  <w14:prstDash w14:val="solid"/>
+                  <w14:round/>
+                </w14:textOutline>
+              </w:rPr>
+              <w:t>9</w:t>
             </w:r>
           </w:p>
           <w:p>
@@ -3565,7 +3771,27 @@
                   <w14:round/>
                 </w14:textOutline>
               </w:rPr>
-              <w:t>Khorshed Sir</w:t>
+              <w:t>Tahmid</w:t>
+            </w:r>
+            <w:r>
+              <w:rPr>
+                <w:rFonts w:ascii="Times New Roman" w:hAnsi="Times New Roman" w:cs="Times New Roman"/>
+                <w:bCs/>
+                <w:color w:val="000000" w:themeColor="text1"/>
+                <w:sz w:val="44"/>
+                <w:szCs w:val="44"/>
+                <w14:shadow w14:blurRad="38100" w14:dist="19050" w14:dir="2700000" w14:sx="100000" w14:sy="100000" w14:kx="0" w14:ky="0" w14:algn="tl">
+                  <w14:schemeClr w14:val="dk1">
+                    <w14:alpha w14:val="60000"/>
+                  </w14:schemeClr>
+                </w14:shadow>
+                <w14:textOutline w14:w="0" w14:cap="flat" w14:cmpd="sng" w14:algn="ctr">
+                  <w14:noFill/>
+                  <w14:prstDash w14:val="solid"/>
+                  <w14:round/>
+                </w14:textOutline>
+              </w:rPr>
+              <w:t xml:space="preserve"> Sir</w:t>
             </w:r>
           </w:p>
         </w:tc>
@@ -3585,183 +3811,21 @@
               <w:rPr>
                 <w:rFonts w:ascii="Times New Roman" w:hAnsi="Times New Roman" w:cs="Times New Roman"/>
                 <w:bCs/>
-                <w:sz w:val="44"/>
-                <w:szCs w:val="44"/>
-                <w14:shadow w14:blurRad="38100" w14:dist="19050" w14:dir="2700000" w14:sx="100000" w14:sy="100000" w14:kx="0" w14:ky="0" w14:algn="tl">
-                  <w14:schemeClr w14:val="dk1">
-                    <w14:alpha w14:val="60000"/>
-                  </w14:schemeClr>
-                </w14:shadow>
-                <w14:textOutline w14:w="0" w14:cap="flat" w14:cmpd="sng" w14:algn="ctr">
-                  <w14:noFill/>
-                  <w14:prstDash w14:val="solid"/>
-                  <w14:round/>
-                </w14:textOutline>
-              </w:rPr>
-            </w:pPr>
-            <w:r>
-              <w:rPr>
-                <w:rFonts w:ascii="Times New Roman" w:hAnsi="Times New Roman" w:cs="Times New Roman"/>
-                <w:bCs/>
-                <w:sz w:val="44"/>
-                <w:szCs w:val="44"/>
-                <w14:shadow w14:blurRad="38100" w14:dist="19050" w14:dir="2700000" w14:sx="100000" w14:sy="100000" w14:kx="0" w14:ky="0" w14:algn="tl">
-                  <w14:schemeClr w14:val="dk1">
-                    <w14:alpha w14:val="60000"/>
-                  </w14:schemeClr>
-                </w14:shadow>
-                <w14:textOutline w14:w="0" w14:cap="flat" w14:cmpd="sng" w14:algn="ctr">
-                  <w14:noFill/>
-                  <w14:prstDash w14:val="solid"/>
-                  <w14:round/>
-                </w14:textOutline>
-              </w:rPr>
-              <w:t>CSE 4110</w:t>
-            </w:r>
-          </w:p>
-          <w:p>
-            <w:pPr>
-              <w:jc w:val="center"/>
-              <w:rPr>
-                <w:rFonts w:ascii="Times New Roman" w:hAnsi="Times New Roman" w:cs="Times New Roman"/>
-                <w:bCs/>
-                <w:color w:val="000000" w:themeColor="text1"/>
-                <w:sz w:val="44"/>
-                <w:szCs w:val="44"/>
-                <w14:shadow w14:blurRad="38100" w14:dist="19050" w14:dir="2700000" w14:sx="100000" w14:sy="100000" w14:kx="0" w14:ky="0" w14:algn="tl">
-                  <w14:schemeClr w14:val="dk1">
-                    <w14:alpha w14:val="60000"/>
-                  </w14:schemeClr>
-                </w14:shadow>
-                <w14:textOutline w14:w="0" w14:cap="flat" w14:cmpd="sng" w14:algn="ctr">
-                  <w14:noFill/>
-                  <w14:prstDash w14:val="solid"/>
-                  <w14:round/>
-                </w14:textOutline>
-              </w:rPr>
-            </w:pPr>
-            <w:r>
-              <w:rPr>
-                <w:rFonts w:ascii="Times New Roman" w:hAnsi="Times New Roman" w:cs="Times New Roman"/>
-                <w:bCs/>
-                <w:color w:val="000000" w:themeColor="text1"/>
-                <w:sz w:val="44"/>
-                <w:szCs w:val="44"/>
-                <w14:shadow w14:blurRad="38100" w14:dist="19050" w14:dir="2700000" w14:sx="100000" w14:sy="100000" w14:kx="0" w14:ky="0" w14:algn="tl">
-                  <w14:schemeClr w14:val="dk1">
-                    <w14:alpha w14:val="60000"/>
-                  </w14:schemeClr>
-                </w14:shadow>
-                <w14:textOutline w14:w="0" w14:cap="flat" w14:cmpd="sng" w14:algn="ctr">
-                  <w14:noFill/>
-                  <w14:prstDash w14:val="solid"/>
-                  <w14:round/>
-                </w14:textOutline>
-              </w:rPr>
-              <w:t xml:space="preserve">Room no. </w:t>
-            </w:r>
-            <w:r>
-              <w:rPr>
-                <w:rFonts w:ascii="Times New Roman" w:hAnsi="Times New Roman" w:cs="Times New Roman"/>
-                <w:bCs/>
-                <w:color w:val="000000" w:themeColor="text1"/>
-                <w:sz w:val="44"/>
-                <w:szCs w:val="44"/>
-                <w14:shadow w14:blurRad="38100" w14:dist="19050" w14:dir="2700000" w14:sx="100000" w14:sy="100000" w14:kx="0" w14:ky="0" w14:algn="tl">
-                  <w14:schemeClr w14:val="dk1">
-                    <w14:alpha w14:val="60000"/>
-                  </w14:schemeClr>
-                </w14:shadow>
-                <w14:textOutline w14:w="0" w14:cap="flat" w14:cmpd="sng" w14:algn="ctr">
-                  <w14:noFill/>
-                  <w14:prstDash w14:val="solid"/>
-                  <w14:round/>
-                </w14:textOutline>
-              </w:rPr>
-              <w:t>41</w:t>
-            </w:r>
-            <w:r>
-              <w:rPr>
-                <w:rFonts w:ascii="Times New Roman" w:hAnsi="Times New Roman" w:cs="Times New Roman"/>
-                <w:bCs/>
-                <w:color w:val="000000" w:themeColor="text1"/>
-                <w:sz w:val="44"/>
-                <w:szCs w:val="44"/>
-                <w14:shadow w14:blurRad="38100" w14:dist="19050" w14:dir="2700000" w14:sx="100000" w14:sy="100000" w14:kx="0" w14:ky="0" w14:algn="tl">
-                  <w14:schemeClr w14:val="dk1">
-                    <w14:alpha w14:val="60000"/>
-                  </w14:schemeClr>
-                </w14:shadow>
-                <w14:textOutline w14:w="0" w14:cap="flat" w14:cmpd="sng" w14:algn="ctr">
-                  <w14:noFill/>
-                  <w14:prstDash w14:val="solid"/>
-                  <w14:round/>
-                </w14:textOutline>
-              </w:rPr>
-              <w:t>2</w:t>
-            </w:r>
-          </w:p>
-          <w:p>
-            <w:pPr>
-              <w:jc w:val="center"/>
-              <w:rPr>
-                <w:rFonts w:ascii="Times New Roman" w:hAnsi="Times New Roman" w:cs="Times New Roman"/>
-                <w:bCs/>
-                <w:color w:val="000000" w:themeColor="text1"/>
-                <w:sz w:val="44"/>
-                <w:szCs w:val="44"/>
-                <w14:shadow w14:blurRad="38100" w14:dist="19050" w14:dir="2700000" w14:sx="100000" w14:sy="100000" w14:kx="0" w14:ky="0" w14:algn="tl">
-                  <w14:schemeClr w14:val="dk1">
-                    <w14:alpha w14:val="60000"/>
-                  </w14:schemeClr>
-                </w14:shadow>
-                <w14:textOutline w14:w="0" w14:cap="flat" w14:cmpd="sng" w14:algn="ctr">
-                  <w14:noFill/>
-                  <w14:prstDash w14:val="solid"/>
-                  <w14:round/>
-                </w14:textOutline>
-              </w:rPr>
-            </w:pPr>
-            <w:r>
-              <w:rPr>
-                <w:rFonts w:ascii="Times New Roman" w:hAnsi="Times New Roman" w:cs="Times New Roman"/>
-                <w:bCs/>
-                <w:color w:val="000000" w:themeColor="text1"/>
-                <w:sz w:val="44"/>
-                <w:szCs w:val="44"/>
-                <w14:shadow w14:blurRad="38100" w14:dist="19050" w14:dir="2700000" w14:sx="100000" w14:sy="100000" w14:kx="0" w14:ky="0" w14:algn="tl">
-                  <w14:schemeClr w14:val="dk1">
-                    <w14:alpha w14:val="60000"/>
-                  </w14:schemeClr>
-                </w14:shadow>
-                <w14:textOutline w14:w="0" w14:cap="flat" w14:cmpd="sng" w14:algn="ctr">
-                  <w14:noFill/>
-                  <w14:prstDash w14:val="solid"/>
-                  <w14:round/>
-                </w14:textOutline>
-              </w:rPr>
-              <w:t>Tabin</w:t>
-            </w:r>
-            <w:r>
-              <w:rPr>
-                <w:rFonts w:ascii="Times New Roman" w:hAnsi="Times New Roman" w:cs="Times New Roman"/>
-                <w:bCs/>
-                <w:color w:val="000000" w:themeColor="text1"/>
-                <w:sz w:val="44"/>
-                <w:szCs w:val="44"/>
-                <w14:shadow w14:blurRad="38100" w14:dist="19050" w14:dir="2700000" w14:sx="100000" w14:sy="100000" w14:kx="0" w14:ky="0" w14:algn="tl">
-                  <w14:schemeClr w14:val="dk1">
-                    <w14:alpha w14:val="60000"/>
-                  </w14:schemeClr>
-                </w14:shadow>
-                <w14:textOutline w14:w="0" w14:cap="flat" w14:cmpd="sng" w14:algn="ctr">
-                  <w14:noFill/>
-                  <w14:prstDash w14:val="solid"/>
-                  <w14:round/>
-                </w14:textOutline>
-              </w:rPr>
-              <w:t xml:space="preserve"> ma’am</w:t>
-            </w:r>
+                <w:color w:val="000000" w:themeColor="text1"/>
+                <w:sz w:val="44"/>
+                <w:szCs w:val="44"/>
+                <w14:shadow w14:blurRad="38100" w14:dist="19050" w14:dir="2700000" w14:sx="100000" w14:sy="100000" w14:kx="0" w14:ky="0" w14:algn="tl">
+                  <w14:schemeClr w14:val="dk1">
+                    <w14:alpha w14:val="60000"/>
+                  </w14:schemeClr>
+                </w14:shadow>
+                <w14:textOutline w14:w="0" w14:cap="flat" w14:cmpd="sng" w14:algn="ctr">
+                  <w14:noFill/>
+                  <w14:prstDash w14:val="solid"/>
+                  <w14:round/>
+                </w14:textOutline>
+              </w:rPr>
+            </w:pPr>
           </w:p>
         </w:tc>
         <w:tc>
@@ -3907,6 +3971,108 @@
               <w:rPr>
                 <w:rFonts w:ascii="Times New Roman" w:hAnsi="Times New Roman" w:cs="Times New Roman"/>
                 <w:bCs/>
+                <w:sz w:val="44"/>
+                <w:szCs w:val="44"/>
+                <w14:shadow w14:blurRad="38100" w14:dist="19050" w14:dir="2700000" w14:sx="100000" w14:sy="100000" w14:kx="0" w14:ky="0" w14:algn="tl">
+                  <w14:schemeClr w14:val="dk1">
+                    <w14:alpha w14:val="60000"/>
+                  </w14:schemeClr>
+                </w14:shadow>
+                <w14:textOutline w14:w="0" w14:cap="flat" w14:cmpd="sng" w14:algn="ctr">
+                  <w14:noFill/>
+                  <w14:prstDash w14:val="solid"/>
+                  <w14:round/>
+                </w14:textOutline>
+              </w:rPr>
+            </w:pPr>
+            <w:r>
+              <w:rPr>
+                <w:rFonts w:ascii="Times New Roman" w:hAnsi="Times New Roman" w:cs="Times New Roman"/>
+                <w:bCs/>
+                <w:sz w:val="44"/>
+                <w:szCs w:val="44"/>
+                <w14:shadow w14:blurRad="38100" w14:dist="19050" w14:dir="2700000" w14:sx="100000" w14:sy="100000" w14:kx="0" w14:ky="0" w14:algn="tl">
+                  <w14:schemeClr w14:val="dk1">
+                    <w14:alpha w14:val="60000"/>
+                  </w14:schemeClr>
+                </w14:shadow>
+                <w14:textOutline w14:w="0" w14:cap="flat" w14:cmpd="sng" w14:algn="ctr">
+                  <w14:noFill/>
+                  <w14:prstDash w14:val="solid"/>
+                  <w14:round/>
+                </w14:textOutline>
+              </w:rPr>
+              <w:t>CSE 4217</w:t>
+            </w:r>
+          </w:p>
+          <w:p>
+            <w:pPr>
+              <w:jc w:val="center"/>
+              <w:rPr>
+                <w:rFonts w:ascii="Times New Roman" w:hAnsi="Times New Roman" w:cs="Times New Roman"/>
+                <w:bCs/>
+                <w:color w:val="000000" w:themeColor="text1"/>
+                <w:sz w:val="44"/>
+                <w:szCs w:val="44"/>
+                <w14:shadow w14:blurRad="38100" w14:dist="19050" w14:dir="2700000" w14:sx="100000" w14:sy="100000" w14:kx="0" w14:ky="0" w14:algn="tl">
+                  <w14:schemeClr w14:val="dk1">
+                    <w14:alpha w14:val="60000"/>
+                  </w14:schemeClr>
+                </w14:shadow>
+                <w14:textOutline w14:w="0" w14:cap="flat" w14:cmpd="sng" w14:algn="ctr">
+                  <w14:noFill/>
+                  <w14:prstDash w14:val="solid"/>
+                  <w14:round/>
+                </w14:textOutline>
+              </w:rPr>
+            </w:pPr>
+            <w:r>
+              <w:rPr>
+                <w:rFonts w:ascii="Times New Roman" w:hAnsi="Times New Roman" w:cs="Times New Roman"/>
+                <w:bCs/>
+                <w:color w:val="000000" w:themeColor="text1"/>
+                <w:sz w:val="44"/>
+                <w:szCs w:val="44"/>
+                <w14:shadow w14:blurRad="38100" w14:dist="19050" w14:dir="2700000" w14:sx="100000" w14:sy="100000" w14:kx="0" w14:ky="0" w14:algn="tl">
+                  <w14:schemeClr w14:val="dk1">
+                    <w14:alpha w14:val="60000"/>
+                  </w14:schemeClr>
+                </w14:shadow>
+                <w14:textOutline w14:w="0" w14:cap="flat" w14:cmpd="sng" w14:algn="ctr">
+                  <w14:noFill/>
+                  <w14:prstDash w14:val="solid"/>
+                  <w14:round/>
+                </w14:textOutline>
+              </w:rPr>
+              <w:t xml:space="preserve">Room no. </w:t>
+            </w:r>
+            <w:r>
+              <w:rPr>
+                <w:rFonts w:ascii="Times New Roman" w:hAnsi="Times New Roman" w:cs="Times New Roman"/>
+                <w:bCs/>
+                <w:color w:val="000000" w:themeColor="text1"/>
+                <w:sz w:val="44"/>
+                <w:szCs w:val="44"/>
+                <w14:shadow w14:blurRad="38100" w14:dist="19050" w14:dir="2700000" w14:sx="100000" w14:sy="100000" w14:kx="0" w14:ky="0" w14:algn="tl">
+                  <w14:schemeClr w14:val="dk1">
+                    <w14:alpha w14:val="60000"/>
+                  </w14:schemeClr>
+                </w14:shadow>
+                <w14:textOutline w14:w="0" w14:cap="flat" w14:cmpd="sng" w14:algn="ctr">
+                  <w14:noFill/>
+                  <w14:prstDash w14:val="solid"/>
+                  <w14:round/>
+                </w14:textOutline>
+              </w:rPr>
+              <w:t>417</w:t>
+            </w:r>
+          </w:p>
+          <w:p>
+            <w:pPr>
+              <w:jc w:val="center"/>
+              <w:rPr>
+                <w:rFonts w:ascii="Times New Roman" w:hAnsi="Times New Roman" w:cs="Times New Roman"/>
+                <w:bCs/>
                 <w:color w:val="4472C4" w:themeColor="accent1"/>
                 <w:sz w:val="44"/>
                 <w:szCs w:val="44"/>
@@ -3922,6 +4088,26 @@
                 </w14:textOutline>
               </w:rPr>
             </w:pPr>
+            <w:r>
+              <w:rPr>
+                <w:rFonts w:ascii="Times New Roman" w:hAnsi="Times New Roman" w:cs="Times New Roman"/>
+                <w:bCs/>
+                <w:color w:val="000000" w:themeColor="text1"/>
+                <w:sz w:val="44"/>
+                <w:szCs w:val="44"/>
+                <w14:shadow w14:blurRad="38100" w14:dist="19050" w14:dir="2700000" w14:sx="100000" w14:sy="100000" w14:kx="0" w14:ky="0" w14:algn="tl">
+                  <w14:schemeClr w14:val="dk1">
+                    <w14:alpha w14:val="60000"/>
+                  </w14:schemeClr>
+                </w14:shadow>
+                <w14:textOutline w14:w="0" w14:cap="flat" w14:cmpd="sng" w14:algn="ctr">
+                  <w14:noFill/>
+                  <w14:prstDash w14:val="solid"/>
+                  <w14:round/>
+                </w14:textOutline>
+              </w:rPr>
+              <w:t>Nafisa ma’am</w:t>
+            </w:r>
           </w:p>
         </w:tc>
         <w:tc>
@@ -4310,49 +4496,87 @@
                   <w14:round/>
                 </w14:textOutline>
               </w:rPr>
-              <w:t>4104</w:t>
-            </w:r>
-          </w:p>
-          <w:p>
-            <w:pPr>
-              <w:jc w:val="center"/>
-              <w:rPr>
-                <w:rFonts w:ascii="Times New Roman" w:hAnsi="Times New Roman" w:cs="Times New Roman"/>
-                <w:bCs/>
-                <w:color w:val="000000" w:themeColor="text1"/>
-                <w:sz w:val="44"/>
-                <w:szCs w:val="44"/>
-                <w14:shadow w14:blurRad="38100" w14:dist="19050" w14:dir="2700000" w14:sx="100000" w14:sy="100000" w14:kx="0" w14:ky="0" w14:algn="tl">
-                  <w14:schemeClr w14:val="dk1">
-                    <w14:alpha w14:val="60000"/>
-                  </w14:schemeClr>
-                </w14:shadow>
-                <w14:textOutline w14:w="0" w14:cap="flat" w14:cmpd="sng" w14:algn="ctr">
-                  <w14:noFill/>
-                  <w14:prstDash w14:val="solid"/>
-                  <w14:round/>
-                </w14:textOutline>
-              </w:rPr>
-            </w:pPr>
-            <w:r>
-              <w:rPr>
-                <w:rFonts w:ascii="Times New Roman" w:hAnsi="Times New Roman" w:cs="Times New Roman"/>
-                <w:bCs/>
-                <w:color w:val="000000" w:themeColor="text1"/>
-                <w:sz w:val="44"/>
-                <w:szCs w:val="44"/>
-                <w14:shadow w14:blurRad="38100" w14:dist="19050" w14:dir="2700000" w14:sx="100000" w14:sy="100000" w14:kx="0" w14:ky="0" w14:algn="tl">
-                  <w14:schemeClr w14:val="dk1">
-                    <w14:alpha w14:val="60000"/>
-                  </w14:schemeClr>
-                </w14:shadow>
-                <w14:textOutline w14:w="0" w14:cap="flat" w14:cmpd="sng" w14:algn="ctr">
-                  <w14:noFill/>
-                  <w14:prstDash w14:val="solid"/>
-                  <w14:round/>
-                </w14:textOutline>
-              </w:rPr>
-              <w:t>Alternate Weeks</w:t>
+              <w:t>4</w:t>
+            </w:r>
+            <w:r>
+              <w:rPr>
+                <w:rFonts w:ascii="Times New Roman" w:hAnsi="Times New Roman" w:cs="Times New Roman"/>
+                <w:bCs/>
+                <w:sz w:val="44"/>
+                <w:szCs w:val="44"/>
+                <w14:shadow w14:blurRad="38100" w14:dist="19050" w14:dir="2700000" w14:sx="100000" w14:sy="100000" w14:kx="0" w14:ky="0" w14:algn="tl">
+                  <w14:schemeClr w14:val="dk1">
+                    <w14:alpha w14:val="60000"/>
+                  </w14:schemeClr>
+                </w14:shadow>
+                <w14:textOutline w14:w="0" w14:cap="flat" w14:cmpd="sng" w14:algn="ctr">
+                  <w14:noFill/>
+                  <w14:prstDash w14:val="solid"/>
+                  <w14:round/>
+                </w14:textOutline>
+              </w:rPr>
+              <w:t>21</w:t>
+            </w:r>
+            <w:r>
+              <w:rPr>
+                <w:rFonts w:ascii="Times New Roman" w:hAnsi="Times New Roman" w:cs="Times New Roman"/>
+                <w:bCs/>
+                <w:sz w:val="44"/>
+                <w:szCs w:val="44"/>
+                <w14:shadow w14:blurRad="38100" w14:dist="19050" w14:dir="2700000" w14:sx="100000" w14:sy="100000" w14:kx="0" w14:ky="0" w14:algn="tl">
+                  <w14:schemeClr w14:val="dk1">
+                    <w14:alpha w14:val="60000"/>
+                  </w14:schemeClr>
+                </w14:shadow>
+                <w14:textOutline w14:w="0" w14:cap="flat" w14:cmpd="sng" w14:algn="ctr">
+                  <w14:noFill/>
+                  <w14:prstDash w14:val="solid"/>
+                  <w14:round/>
+                </w14:textOutline>
+              </w:rPr>
+              <w:t>4</w:t>
+            </w:r>
+          </w:p>
+          <w:p>
+            <w:pPr>
+              <w:jc w:val="center"/>
+              <w:rPr>
+                <w:rFonts w:ascii="Times New Roman" w:hAnsi="Times New Roman" w:cs="Times New Roman"/>
+                <w:bCs/>
+                <w:color w:val="000000" w:themeColor="text1"/>
+                <w:sz w:val="44"/>
+                <w:szCs w:val="44"/>
+                <w14:shadow w14:blurRad="38100" w14:dist="19050" w14:dir="2700000" w14:sx="100000" w14:sy="100000" w14:kx="0" w14:ky="0" w14:algn="tl">
+                  <w14:schemeClr w14:val="dk1">
+                    <w14:alpha w14:val="60000"/>
+                  </w14:schemeClr>
+                </w14:shadow>
+                <w14:textOutline w14:w="0" w14:cap="flat" w14:cmpd="sng" w14:algn="ctr">
+                  <w14:noFill/>
+                  <w14:prstDash w14:val="solid"/>
+                  <w14:round/>
+                </w14:textOutline>
+              </w:rPr>
+            </w:pPr>
+            <w:r>
+              <w:rPr>
+                <w:rFonts w:ascii="Times New Roman" w:hAnsi="Times New Roman" w:cs="Times New Roman"/>
+                <w:bCs/>
+                <w:color w:val="000000" w:themeColor="text1"/>
+                <w:sz w:val="44"/>
+                <w:szCs w:val="44"/>
+                <w14:shadow w14:blurRad="38100" w14:dist="19050" w14:dir="2700000" w14:sx="100000" w14:sy="100000" w14:kx="0" w14:ky="0" w14:algn="tl">
+                  <w14:schemeClr w14:val="dk1">
+                    <w14:alpha w14:val="60000"/>
+                  </w14:schemeClr>
+                </w14:shadow>
+                <w14:textOutline w14:w="0" w14:cap="flat" w14:cmpd="sng" w14:algn="ctr">
+                  <w14:noFill/>
+                  <w14:prstDash w14:val="solid"/>
+                  <w14:round/>
+                </w14:textOutline>
+              </w:rPr>
+              <w:t>Room no. 709</w:t>
             </w:r>
           </w:p>
           <w:p>
@@ -4394,7 +4618,27 @@
                   <w14:round/>
                 </w14:textOutline>
               </w:rPr>
-              <w:t>Khorshed Sir</w:t>
+              <w:t>Saiful</w:t>
+            </w:r>
+            <w:r>
+              <w:rPr>
+                <w:rFonts w:ascii="Times New Roman" w:hAnsi="Times New Roman" w:cs="Times New Roman"/>
+                <w:bCs/>
+                <w:color w:val="000000" w:themeColor="text1"/>
+                <w:sz w:val="44"/>
+                <w:szCs w:val="44"/>
+                <w14:shadow w14:blurRad="38100" w14:dist="19050" w14:dir="2700000" w14:sx="100000" w14:sy="100000" w14:kx="0" w14:ky="0" w14:algn="tl">
+                  <w14:schemeClr w14:val="dk1">
+                    <w14:alpha w14:val="60000"/>
+                  </w14:schemeClr>
+                </w14:shadow>
+                <w14:textOutline w14:w="0" w14:cap="flat" w14:cmpd="sng" w14:algn="ctr">
+                  <w14:noFill/>
+                  <w14:prstDash w14:val="solid"/>
+                  <w14:round/>
+                </w14:textOutline>
+              </w:rPr>
+              <w:t xml:space="preserve"> Sir</w:t>
             </w:r>
           </w:p>
         </w:tc>
@@ -4447,143 +4691,21 @@
               <w:rPr>
                 <w:rFonts w:ascii="Times New Roman" w:hAnsi="Times New Roman" w:cs="Times New Roman"/>
                 <w:bCs/>
-                <w:sz w:val="44"/>
-                <w:szCs w:val="44"/>
-                <w14:shadow w14:blurRad="38100" w14:dist="19050" w14:dir="2700000" w14:sx="100000" w14:sy="100000" w14:kx="0" w14:ky="0" w14:algn="tl">
-                  <w14:schemeClr w14:val="dk1">
-                    <w14:alpha w14:val="60000"/>
-                  </w14:schemeClr>
-                </w14:shadow>
-                <w14:textOutline w14:w="0" w14:cap="flat" w14:cmpd="sng" w14:algn="ctr">
-                  <w14:noFill/>
-                  <w14:prstDash w14:val="solid"/>
-                  <w14:round/>
-                </w14:textOutline>
-              </w:rPr>
-            </w:pPr>
-            <w:r>
-              <w:rPr>
-                <w:rFonts w:ascii="Times New Roman" w:hAnsi="Times New Roman" w:cs="Times New Roman"/>
-                <w:bCs/>
-                <w:sz w:val="44"/>
-                <w:szCs w:val="44"/>
-                <w14:shadow w14:blurRad="38100" w14:dist="19050" w14:dir="2700000" w14:sx="100000" w14:sy="100000" w14:kx="0" w14:ky="0" w14:algn="tl">
-                  <w14:schemeClr w14:val="dk1">
-                    <w14:alpha w14:val="60000"/>
-                  </w14:schemeClr>
-                </w14:shadow>
-                <w14:textOutline w14:w="0" w14:cap="flat" w14:cmpd="sng" w14:algn="ctr">
-                  <w14:noFill/>
-                  <w14:prstDash w14:val="solid"/>
-                  <w14:round/>
-                </w14:textOutline>
-              </w:rPr>
-              <w:t>CSE 4110</w:t>
-            </w:r>
-          </w:p>
-          <w:p>
-            <w:pPr>
-              <w:jc w:val="center"/>
-              <w:rPr>
-                <w:rFonts w:ascii="Times New Roman" w:hAnsi="Times New Roman" w:cs="Times New Roman"/>
-                <w:bCs/>
-                <w:color w:val="000000" w:themeColor="text1"/>
-                <w:sz w:val="44"/>
-                <w:szCs w:val="44"/>
-                <w14:shadow w14:blurRad="38100" w14:dist="19050" w14:dir="2700000" w14:sx="100000" w14:sy="100000" w14:kx="0" w14:ky="0" w14:algn="tl">
-                  <w14:schemeClr w14:val="dk1">
-                    <w14:alpha w14:val="60000"/>
-                  </w14:schemeClr>
-                </w14:shadow>
-                <w14:textOutline w14:w="0" w14:cap="flat" w14:cmpd="sng" w14:algn="ctr">
-                  <w14:noFill/>
-                  <w14:prstDash w14:val="solid"/>
-                  <w14:round/>
-                </w14:textOutline>
-              </w:rPr>
-            </w:pPr>
-            <w:r>
-              <w:rPr>
-                <w:rFonts w:ascii="Times New Roman" w:hAnsi="Times New Roman" w:cs="Times New Roman"/>
-                <w:bCs/>
-                <w:color w:val="000000" w:themeColor="text1"/>
-                <w:sz w:val="44"/>
-                <w:szCs w:val="44"/>
-                <w14:shadow w14:blurRad="38100" w14:dist="19050" w14:dir="2700000" w14:sx="100000" w14:sy="100000" w14:kx="0" w14:ky="0" w14:algn="tl">
-                  <w14:schemeClr w14:val="dk1">
-                    <w14:alpha w14:val="60000"/>
-                  </w14:schemeClr>
-                </w14:shadow>
-                <w14:textOutline w14:w="0" w14:cap="flat" w14:cmpd="sng" w14:algn="ctr">
-                  <w14:noFill/>
-                  <w14:prstDash w14:val="solid"/>
-                  <w14:round/>
-                </w14:textOutline>
-              </w:rPr>
-              <w:t xml:space="preserve">Room no. </w:t>
-            </w:r>
-            <w:r>
-              <w:rPr>
-                <w:rFonts w:ascii="Times New Roman" w:hAnsi="Times New Roman" w:cs="Times New Roman"/>
-                <w:bCs/>
-                <w:color w:val="000000" w:themeColor="text1"/>
-                <w:sz w:val="44"/>
-                <w:szCs w:val="44"/>
-                <w14:shadow w14:blurRad="38100" w14:dist="19050" w14:dir="2700000" w14:sx="100000" w14:sy="100000" w14:kx="0" w14:ky="0" w14:algn="tl">
-                  <w14:schemeClr w14:val="dk1">
-                    <w14:alpha w14:val="60000"/>
-                  </w14:schemeClr>
-                </w14:shadow>
-                <w14:textOutline w14:w="0" w14:cap="flat" w14:cmpd="sng" w14:algn="ctr">
-                  <w14:noFill/>
-                  <w14:prstDash w14:val="solid"/>
-                  <w14:round/>
-                </w14:textOutline>
-              </w:rPr>
-              <w:t>414</w:t>
-            </w:r>
-          </w:p>
-          <w:p>
-            <w:pPr>
-              <w:jc w:val="center"/>
-              <w:rPr>
-                <w:rFonts w:ascii="Times New Roman" w:hAnsi="Times New Roman" w:cs="Times New Roman"/>
-                <w:bCs/>
-                <w:color w:val="000000" w:themeColor="text1"/>
-                <w:sz w:val="44"/>
-                <w:szCs w:val="44"/>
-                <w14:shadow w14:blurRad="38100" w14:dist="19050" w14:dir="2700000" w14:sx="100000" w14:sy="100000" w14:kx="0" w14:ky="0" w14:algn="tl">
-                  <w14:schemeClr w14:val="dk1">
-                    <w14:alpha w14:val="60000"/>
-                  </w14:schemeClr>
-                </w14:shadow>
-                <w14:textOutline w14:w="0" w14:cap="flat" w14:cmpd="sng" w14:algn="ctr">
-                  <w14:noFill/>
-                  <w14:prstDash w14:val="solid"/>
-                  <w14:round/>
-                </w14:textOutline>
-              </w:rPr>
-            </w:pPr>
-            <w:r>
-              <w:rPr>
-                <w:rFonts w:ascii="Times New Roman" w:hAnsi="Times New Roman" w:cs="Times New Roman"/>
-                <w:bCs/>
-                <w:color w:val="000000" w:themeColor="text1"/>
-                <w:sz w:val="44"/>
-                <w:szCs w:val="44"/>
-                <w14:shadow w14:blurRad="38100" w14:dist="19050" w14:dir="2700000" w14:sx="100000" w14:sy="100000" w14:kx="0" w14:ky="0" w14:algn="tl">
-                  <w14:schemeClr w14:val="dk1">
-                    <w14:alpha w14:val="60000"/>
-                  </w14:schemeClr>
-                </w14:shadow>
-                <w14:textOutline w14:w="0" w14:cap="flat" w14:cmpd="sng" w14:algn="ctr">
-                  <w14:noFill/>
-                  <w14:prstDash w14:val="solid"/>
-                  <w14:round/>
-                </w14:textOutline>
-              </w:rPr>
-              <w:t>Tabin ma’am</w:t>
-            </w:r>
+                <w:color w:val="000000" w:themeColor="text1"/>
+                <w:sz w:val="44"/>
+                <w:szCs w:val="44"/>
+                <w14:shadow w14:blurRad="38100" w14:dist="19050" w14:dir="2700000" w14:sx="100000" w14:sy="100000" w14:kx="0" w14:ky="0" w14:algn="tl">
+                  <w14:schemeClr w14:val="dk1">
+                    <w14:alpha w14:val="60000"/>
+                  </w14:schemeClr>
+                </w14:shadow>
+                <w14:textOutline w14:w="0" w14:cap="flat" w14:cmpd="sng" w14:algn="ctr">
+                  <w14:noFill/>
+                  <w14:prstDash w14:val="solid"/>
+                  <w14:round/>
+                </w14:textOutline>
+              </w:rPr>
+            </w:pPr>
           </w:p>
         </w:tc>
         <w:tc>
@@ -4634,21 +4756,218 @@
               <w:rPr>
                 <w:rFonts w:ascii="Times New Roman" w:hAnsi="Times New Roman" w:cs="Times New Roman"/>
                 <w:bCs/>
-                <w:color w:val="000000" w:themeColor="text1"/>
-                <w:sz w:val="44"/>
-                <w:szCs w:val="44"/>
-                <w14:shadow w14:blurRad="38100" w14:dist="19050" w14:dir="2700000" w14:sx="100000" w14:sy="100000" w14:kx="0" w14:ky="0" w14:algn="tl">
-                  <w14:schemeClr w14:val="dk1">
-                    <w14:alpha w14:val="60000"/>
-                  </w14:schemeClr>
-                </w14:shadow>
-                <w14:textOutline w14:w="0" w14:cap="flat" w14:cmpd="sng" w14:algn="ctr">
-                  <w14:noFill/>
-                  <w14:prstDash w14:val="solid"/>
-                  <w14:round/>
-                </w14:textOutline>
-              </w:rPr>
-            </w:pPr>
+                <w:sz w:val="44"/>
+                <w:szCs w:val="44"/>
+                <w14:shadow w14:blurRad="38100" w14:dist="19050" w14:dir="2700000" w14:sx="100000" w14:sy="100000" w14:kx="0" w14:ky="0" w14:algn="tl">
+                  <w14:schemeClr w14:val="dk1">
+                    <w14:alpha w14:val="60000"/>
+                  </w14:schemeClr>
+                </w14:shadow>
+                <w14:textOutline w14:w="0" w14:cap="flat" w14:cmpd="sng" w14:algn="ctr">
+                  <w14:noFill/>
+                  <w14:prstDash w14:val="solid"/>
+                  <w14:round/>
+                </w14:textOutline>
+              </w:rPr>
+            </w:pPr>
+            <w:r>
+              <w:rPr>
+                <w:rFonts w:ascii="Times New Roman" w:hAnsi="Times New Roman" w:cs="Times New Roman"/>
+                <w:bCs/>
+                <w:sz w:val="44"/>
+                <w:szCs w:val="44"/>
+                <w14:shadow w14:blurRad="38100" w14:dist="19050" w14:dir="2700000" w14:sx="100000" w14:sy="100000" w14:kx="0" w14:ky="0" w14:algn="tl">
+                  <w14:schemeClr w14:val="dk1">
+                    <w14:alpha w14:val="60000"/>
+                  </w14:schemeClr>
+                </w14:shadow>
+                <w14:textOutline w14:w="0" w14:cap="flat" w14:cmpd="sng" w14:algn="ctr">
+                  <w14:noFill/>
+                  <w14:prstDash w14:val="solid"/>
+                  <w14:round/>
+                </w14:textOutline>
+              </w:rPr>
+              <w:t>CSE 4</w:t>
+            </w:r>
+            <w:r>
+              <w:rPr>
+                <w:rFonts w:ascii="Times New Roman" w:hAnsi="Times New Roman" w:cs="Times New Roman"/>
+                <w:bCs/>
+                <w:sz w:val="44"/>
+                <w:szCs w:val="44"/>
+                <w14:shadow w14:blurRad="38100" w14:dist="19050" w14:dir="2700000" w14:sx="100000" w14:sy="100000" w14:kx="0" w14:ky="0" w14:algn="tl">
+                  <w14:schemeClr w14:val="dk1">
+                    <w14:alpha w14:val="60000"/>
+                  </w14:schemeClr>
+                </w14:shadow>
+                <w14:textOutline w14:w="0" w14:cap="flat" w14:cmpd="sng" w14:algn="ctr">
+                  <w14:noFill/>
+                  <w14:prstDash w14:val="solid"/>
+                  <w14:round/>
+                </w14:textOutline>
+              </w:rPr>
+              <w:t>2</w:t>
+            </w:r>
+            <w:r>
+              <w:rPr>
+                <w:rFonts w:ascii="Times New Roman" w:hAnsi="Times New Roman" w:cs="Times New Roman"/>
+                <w:bCs/>
+                <w:sz w:val="44"/>
+                <w:szCs w:val="44"/>
+                <w14:shadow w14:blurRad="38100" w14:dist="19050" w14:dir="2700000" w14:sx="100000" w14:sy="100000" w14:kx="0" w14:ky="0" w14:algn="tl">
+                  <w14:schemeClr w14:val="dk1">
+                    <w14:alpha w14:val="60000"/>
+                  </w14:schemeClr>
+                </w14:shadow>
+                <w14:textOutline w14:w="0" w14:cap="flat" w14:cmpd="sng" w14:algn="ctr">
+                  <w14:noFill/>
+                  <w14:prstDash w14:val="solid"/>
+                  <w14:round/>
+                </w14:textOutline>
+              </w:rPr>
+              <w:t>0</w:t>
+            </w:r>
+            <w:r>
+              <w:rPr>
+                <w:rFonts w:ascii="Times New Roman" w:hAnsi="Times New Roman" w:cs="Times New Roman"/>
+                <w:bCs/>
+                <w:sz w:val="44"/>
+                <w:szCs w:val="44"/>
+                <w14:shadow w14:blurRad="38100" w14:dist="19050" w14:dir="2700000" w14:sx="100000" w14:sy="100000" w14:kx="0" w14:ky="0" w14:algn="tl">
+                  <w14:schemeClr w14:val="dk1">
+                    <w14:alpha w14:val="60000"/>
+                  </w14:schemeClr>
+                </w14:shadow>
+                <w14:textOutline w14:w="0" w14:cap="flat" w14:cmpd="sng" w14:algn="ctr">
+                  <w14:noFill/>
+                  <w14:prstDash w14:val="solid"/>
+                  <w14:round/>
+                </w14:textOutline>
+              </w:rPr>
+              <w:t>4</w:t>
+            </w:r>
+          </w:p>
+          <w:p>
+            <w:pPr>
+              <w:jc w:val="center"/>
+              <w:rPr>
+                <w:rFonts w:ascii="Times New Roman" w:hAnsi="Times New Roman" w:cs="Times New Roman"/>
+                <w:bCs/>
+                <w:color w:val="000000" w:themeColor="text1"/>
+                <w:sz w:val="44"/>
+                <w:szCs w:val="44"/>
+                <w14:shadow w14:blurRad="38100" w14:dist="19050" w14:dir="2700000" w14:sx="100000" w14:sy="100000" w14:kx="0" w14:ky="0" w14:algn="tl">
+                  <w14:schemeClr w14:val="dk1">
+                    <w14:alpha w14:val="60000"/>
+                  </w14:schemeClr>
+                </w14:shadow>
+                <w14:textOutline w14:w="0" w14:cap="flat" w14:cmpd="sng" w14:algn="ctr">
+                  <w14:noFill/>
+                  <w14:prstDash w14:val="solid"/>
+                  <w14:round/>
+                </w14:textOutline>
+              </w:rPr>
+            </w:pPr>
+            <w:r>
+              <w:rPr>
+                <w:rFonts w:ascii="Times New Roman" w:hAnsi="Times New Roman" w:cs="Times New Roman"/>
+                <w:bCs/>
+                <w:color w:val="000000" w:themeColor="text1"/>
+                <w:sz w:val="44"/>
+                <w:szCs w:val="44"/>
+                <w14:shadow w14:blurRad="38100" w14:dist="19050" w14:dir="2700000" w14:sx="100000" w14:sy="100000" w14:kx="0" w14:ky="0" w14:algn="tl">
+                  <w14:schemeClr w14:val="dk1">
+                    <w14:alpha w14:val="60000"/>
+                  </w14:schemeClr>
+                </w14:shadow>
+                <w14:textOutline w14:w="0" w14:cap="flat" w14:cmpd="sng" w14:algn="ctr">
+                  <w14:noFill/>
+                  <w14:prstDash w14:val="solid"/>
+                  <w14:round/>
+                </w14:textOutline>
+              </w:rPr>
+              <w:t>Room no.</w:t>
+            </w:r>
+            <w:r>
+              <w:rPr>
+                <w:rFonts w:ascii="Times New Roman" w:hAnsi="Times New Roman" w:cs="Times New Roman"/>
+                <w:bCs/>
+                <w:color w:val="000000" w:themeColor="text1"/>
+                <w:sz w:val="44"/>
+                <w:szCs w:val="44"/>
+                <w14:shadow w14:blurRad="38100" w14:dist="19050" w14:dir="2700000" w14:sx="100000" w14:sy="100000" w14:kx="0" w14:ky="0" w14:algn="tl">
+                  <w14:schemeClr w14:val="dk1">
+                    <w14:alpha w14:val="60000"/>
+                  </w14:schemeClr>
+                </w14:shadow>
+                <w14:textOutline w14:w="0" w14:cap="flat" w14:cmpd="sng" w14:algn="ctr">
+                  <w14:noFill/>
+                  <w14:prstDash w14:val="solid"/>
+                  <w14:round/>
+                </w14:textOutline>
+              </w:rPr>
+              <w:t xml:space="preserve"> 418</w:t>
+            </w:r>
+            <w:r>
+              <w:rPr>
+                <w:rFonts w:ascii="Times New Roman" w:hAnsi="Times New Roman" w:cs="Times New Roman"/>
+                <w:bCs/>
+                <w:color w:val="000000" w:themeColor="text1"/>
+                <w:sz w:val="44"/>
+                <w:szCs w:val="44"/>
+                <w14:shadow w14:blurRad="38100" w14:dist="19050" w14:dir="2700000" w14:sx="100000" w14:sy="100000" w14:kx="0" w14:ky="0" w14:algn="tl">
+                  <w14:schemeClr w14:val="dk1">
+                    <w14:alpha w14:val="60000"/>
+                  </w14:schemeClr>
+                </w14:shadow>
+                <w14:textOutline w14:w="0" w14:cap="flat" w14:cmpd="sng" w14:algn="ctr">
+                  <w14:noFill/>
+                  <w14:prstDash w14:val="solid"/>
+                  <w14:round/>
+                </w14:textOutline>
+              </w:rPr>
+              <w:t xml:space="preserve"> </w:t>
+            </w:r>
+            <w:r>
+              <w:rPr>
+                <w:rFonts w:ascii="Times New Roman" w:hAnsi="Times New Roman" w:cs="Times New Roman"/>
+                <w:bCs/>
+                <w:color w:val="000000" w:themeColor="text1"/>
+                <w:sz w:val="44"/>
+                <w:szCs w:val="44"/>
+                <w14:shadow w14:blurRad="38100" w14:dist="19050" w14:dir="2700000" w14:sx="100000" w14:sy="100000" w14:kx="0" w14:ky="0" w14:algn="tl">
+                  <w14:schemeClr w14:val="dk1">
+                    <w14:alpha w14:val="60000"/>
+                  </w14:schemeClr>
+                </w14:shadow>
+                <w14:textOutline w14:w="0" w14:cap="flat" w14:cmpd="sng" w14:algn="ctr">
+                  <w14:noFill/>
+                  <w14:prstDash w14:val="solid"/>
+                  <w14:round/>
+                </w14:textOutline>
+              </w:rPr>
+              <w:t>Humayara</w:t>
+            </w:r>
+            <w:r>
+              <w:rPr>
+                <w:rFonts w:ascii="Times New Roman" w:hAnsi="Times New Roman" w:cs="Times New Roman"/>
+                <w:bCs/>
+                <w:color w:val="000000" w:themeColor="text1"/>
+                <w:sz w:val="44"/>
+                <w:szCs w:val="44"/>
+                <w14:shadow w14:blurRad="38100" w14:dist="19050" w14:dir="2700000" w14:sx="100000" w14:sy="100000" w14:kx="0" w14:ky="0" w14:algn="tl">
+                  <w14:schemeClr w14:val="dk1">
+                    <w14:alpha w14:val="60000"/>
+                  </w14:schemeClr>
+                </w14:shadow>
+                <w14:textOutline w14:w="0" w14:cap="flat" w14:cmpd="sng" w14:algn="ctr">
+                  <w14:noFill/>
+                  <w14:prstDash w14:val="solid"/>
+                  <w14:round/>
+                </w14:textOutline>
+              </w:rPr>
+              <w:t xml:space="preserve"> ma’am</w:t>
+            </w:r>
           </w:p>
         </w:tc>
         <w:tc>
@@ -4941,111 +5260,111 @@
                   <w14:round/>
                 </w14:textOutline>
               </w:rPr>
-              <w:t>4104</w:t>
-            </w:r>
-          </w:p>
-          <w:p>
-            <w:pPr>
-              <w:jc w:val="center"/>
-              <w:rPr>
-                <w:rFonts w:ascii="Times New Roman" w:hAnsi="Times New Roman" w:cs="Times New Roman"/>
-                <w:bCs/>
-                <w:color w:val="000000" w:themeColor="text1"/>
-                <w:sz w:val="44"/>
-                <w:szCs w:val="44"/>
-                <w14:shadow w14:blurRad="38100" w14:dist="19050" w14:dir="2700000" w14:sx="100000" w14:sy="100000" w14:kx="0" w14:ky="0" w14:algn="tl">
-                  <w14:schemeClr w14:val="dk1">
-                    <w14:alpha w14:val="60000"/>
-                  </w14:schemeClr>
-                </w14:shadow>
-                <w14:textOutline w14:w="0" w14:cap="flat" w14:cmpd="sng" w14:algn="ctr">
-                  <w14:noFill/>
-                  <w14:prstDash w14:val="solid"/>
-                  <w14:round/>
-                </w14:textOutline>
-              </w:rPr>
-            </w:pPr>
-            <w:r>
-              <w:rPr>
-                <w:rFonts w:ascii="Times New Roman" w:hAnsi="Times New Roman" w:cs="Times New Roman"/>
-                <w:bCs/>
-                <w:color w:val="000000" w:themeColor="text1"/>
-                <w:sz w:val="44"/>
-                <w:szCs w:val="44"/>
-                <w14:shadow w14:blurRad="38100" w14:dist="19050" w14:dir="2700000" w14:sx="100000" w14:sy="100000" w14:kx="0" w14:ky="0" w14:algn="tl">
-                  <w14:schemeClr w14:val="dk1">
-                    <w14:alpha w14:val="60000"/>
-                  </w14:schemeClr>
-                </w14:shadow>
-                <w14:textOutline w14:w="0" w14:cap="flat" w14:cmpd="sng" w14:algn="ctr">
-                  <w14:noFill/>
-                  <w14:prstDash w14:val="solid"/>
-                  <w14:round/>
-                </w14:textOutline>
-              </w:rPr>
-              <w:t xml:space="preserve">Room no. </w:t>
-            </w:r>
-            <w:r>
-              <w:rPr>
-                <w:rFonts w:ascii="Times New Roman" w:hAnsi="Times New Roman" w:cs="Times New Roman"/>
-                <w:bCs/>
-                <w:color w:val="000000" w:themeColor="text1"/>
-                <w:sz w:val="44"/>
-                <w:szCs w:val="44"/>
-                <w14:shadow w14:blurRad="38100" w14:dist="19050" w14:dir="2700000" w14:sx="100000" w14:sy="100000" w14:kx="0" w14:ky="0" w14:algn="tl">
-                  <w14:schemeClr w14:val="dk1">
-                    <w14:alpha w14:val="60000"/>
-                  </w14:schemeClr>
-                </w14:shadow>
-                <w14:textOutline w14:w="0" w14:cap="flat" w14:cmpd="sng" w14:algn="ctr">
-                  <w14:noFill/>
-                  <w14:prstDash w14:val="solid"/>
-                  <w14:round/>
-                </w14:textOutline>
-              </w:rPr>
-              <w:t>709</w:t>
-            </w:r>
-          </w:p>
-          <w:p>
-            <w:pPr>
-              <w:jc w:val="center"/>
-              <w:rPr>
-                <w:rFonts w:ascii="Times New Roman" w:hAnsi="Times New Roman" w:cs="Times New Roman"/>
-                <w:bCs/>
-                <w:color w:val="000000" w:themeColor="text1"/>
-                <w:sz w:val="44"/>
-                <w:szCs w:val="44"/>
-                <w14:shadow w14:blurRad="38100" w14:dist="19050" w14:dir="2700000" w14:sx="100000" w14:sy="100000" w14:kx="0" w14:ky="0" w14:algn="tl">
-                  <w14:schemeClr w14:val="dk1">
-                    <w14:alpha w14:val="60000"/>
-                  </w14:schemeClr>
-                </w14:shadow>
-                <w14:textOutline w14:w="0" w14:cap="flat" w14:cmpd="sng" w14:algn="ctr">
-                  <w14:noFill/>
-                  <w14:prstDash w14:val="solid"/>
-                  <w14:round/>
-                </w14:textOutline>
-              </w:rPr>
-            </w:pPr>
-            <w:r>
-              <w:rPr>
-                <w:rFonts w:ascii="Times New Roman" w:hAnsi="Times New Roman" w:cs="Times New Roman"/>
-                <w:bCs/>
-                <w:color w:val="000000" w:themeColor="text1"/>
-                <w:sz w:val="44"/>
-                <w:szCs w:val="44"/>
-                <w14:shadow w14:blurRad="38100" w14:dist="19050" w14:dir="2700000" w14:sx="100000" w14:sy="100000" w14:kx="0" w14:ky="0" w14:algn="tl">
-                  <w14:schemeClr w14:val="dk1">
-                    <w14:alpha w14:val="60000"/>
-                  </w14:schemeClr>
-                </w14:shadow>
-                <w14:textOutline w14:w="0" w14:cap="flat" w14:cmpd="sng" w14:algn="ctr">
-                  <w14:noFill/>
-                  <w14:prstDash w14:val="solid"/>
-                  <w14:round/>
-                </w14:textOutline>
-              </w:rPr>
-              <w:t>Khorshed Sir</w:t>
+              <w:t>4214</w:t>
+            </w:r>
+          </w:p>
+          <w:p>
+            <w:pPr>
+              <w:jc w:val="center"/>
+              <w:rPr>
+                <w:rFonts w:ascii="Times New Roman" w:hAnsi="Times New Roman" w:cs="Times New Roman"/>
+                <w:bCs/>
+                <w:color w:val="000000" w:themeColor="text1"/>
+                <w:sz w:val="44"/>
+                <w:szCs w:val="44"/>
+                <w14:shadow w14:blurRad="38100" w14:dist="19050" w14:dir="2700000" w14:sx="100000" w14:sy="100000" w14:kx="0" w14:ky="0" w14:algn="tl">
+                  <w14:schemeClr w14:val="dk1">
+                    <w14:alpha w14:val="60000"/>
+                  </w14:schemeClr>
+                </w14:shadow>
+                <w14:textOutline w14:w="0" w14:cap="flat" w14:cmpd="sng" w14:algn="ctr">
+                  <w14:noFill/>
+                  <w14:prstDash w14:val="solid"/>
+                  <w14:round/>
+                </w14:textOutline>
+              </w:rPr>
+            </w:pPr>
+            <w:r>
+              <w:rPr>
+                <w:rFonts w:ascii="Times New Roman" w:hAnsi="Times New Roman" w:cs="Times New Roman"/>
+                <w:bCs/>
+                <w:color w:val="000000" w:themeColor="text1"/>
+                <w:sz w:val="44"/>
+                <w:szCs w:val="44"/>
+                <w14:shadow w14:blurRad="38100" w14:dist="19050" w14:dir="2700000" w14:sx="100000" w14:sy="100000" w14:kx="0" w14:ky="0" w14:algn="tl">
+                  <w14:schemeClr w14:val="dk1">
+                    <w14:alpha w14:val="60000"/>
+                  </w14:schemeClr>
+                </w14:shadow>
+                <w14:textOutline w14:w="0" w14:cap="flat" w14:cmpd="sng" w14:algn="ctr">
+                  <w14:noFill/>
+                  <w14:prstDash w14:val="solid"/>
+                  <w14:round/>
+                </w14:textOutline>
+              </w:rPr>
+              <w:t>Room no. 709</w:t>
+            </w:r>
+          </w:p>
+          <w:p>
+            <w:pPr>
+              <w:jc w:val="center"/>
+              <w:rPr>
+                <w:rFonts w:ascii="Times New Roman" w:hAnsi="Times New Roman" w:cs="Times New Roman"/>
+                <w:bCs/>
+                <w:color w:val="000000" w:themeColor="text1"/>
+                <w:sz w:val="44"/>
+                <w:szCs w:val="44"/>
+                <w14:shadow w14:blurRad="38100" w14:dist="19050" w14:dir="2700000" w14:sx="100000" w14:sy="100000" w14:kx="0" w14:ky="0" w14:algn="tl">
+                  <w14:schemeClr w14:val="dk1">
+                    <w14:alpha w14:val="60000"/>
+                  </w14:schemeClr>
+                </w14:shadow>
+                <w14:textOutline w14:w="0" w14:cap="flat" w14:cmpd="sng" w14:algn="ctr">
+                  <w14:noFill/>
+                  <w14:prstDash w14:val="solid"/>
+                  <w14:round/>
+                </w14:textOutline>
+              </w:rPr>
+            </w:pPr>
+            <w:r>
+              <w:rPr>
+                <w:rFonts w:ascii="Times New Roman" w:hAnsi="Times New Roman" w:cs="Times New Roman"/>
+                <w:bCs/>
+                <w:color w:val="000000" w:themeColor="text1"/>
+                <w:sz w:val="44"/>
+                <w:szCs w:val="44"/>
+                <w14:shadow w14:blurRad="38100" w14:dist="19050" w14:dir="2700000" w14:sx="100000" w14:sy="100000" w14:kx="0" w14:ky="0" w14:algn="tl">
+                  <w14:schemeClr w14:val="dk1">
+                    <w14:alpha w14:val="60000"/>
+                  </w14:schemeClr>
+                </w14:shadow>
+                <w14:textOutline w14:w="0" w14:cap="flat" w14:cmpd="sng" w14:algn="ctr">
+                  <w14:noFill/>
+                  <w14:prstDash w14:val="solid"/>
+                  <w14:round/>
+                </w14:textOutline>
+              </w:rPr>
+              <w:t>Saiful</w:t>
+            </w:r>
+            <w:r>
+              <w:rPr>
+                <w:rFonts w:ascii="Times New Roman" w:hAnsi="Times New Roman" w:cs="Times New Roman"/>
+                <w:bCs/>
+                <w:color w:val="000000" w:themeColor="text1"/>
+                <w:sz w:val="44"/>
+                <w:szCs w:val="44"/>
+                <w14:shadow w14:blurRad="38100" w14:dist="19050" w14:dir="2700000" w14:sx="100000" w14:sy="100000" w14:kx="0" w14:ky="0" w14:algn="tl">
+                  <w14:schemeClr w14:val="dk1">
+                    <w14:alpha w14:val="60000"/>
+                  </w14:schemeClr>
+                </w14:shadow>
+                <w14:textOutline w14:w="0" w14:cap="flat" w14:cmpd="sng" w14:algn="ctr">
+                  <w14:noFill/>
+                  <w14:prstDash w14:val="solid"/>
+                  <w14:round/>
+                </w14:textOutline>
+              </w:rPr>
+              <w:t xml:space="preserve"> Sir</w:t>
             </w:r>
           </w:p>
         </w:tc>
@@ -5065,163 +5384,21 @@
               <w:rPr>
                 <w:rFonts w:ascii="Times New Roman" w:hAnsi="Times New Roman" w:cs="Times New Roman"/>
                 <w:bCs/>
-                <w:sz w:val="44"/>
-                <w:szCs w:val="44"/>
-                <w14:shadow w14:blurRad="38100" w14:dist="19050" w14:dir="2700000" w14:sx="100000" w14:sy="100000" w14:kx="0" w14:ky="0" w14:algn="tl">
-                  <w14:schemeClr w14:val="dk1">
-                    <w14:alpha w14:val="60000"/>
-                  </w14:schemeClr>
-                </w14:shadow>
-                <w14:textOutline w14:w="0" w14:cap="flat" w14:cmpd="sng" w14:algn="ctr">
-                  <w14:noFill/>
-                  <w14:prstDash w14:val="solid"/>
-                  <w14:round/>
-                </w14:textOutline>
-              </w:rPr>
-            </w:pPr>
-            <w:r>
-              <w:rPr>
-                <w:rFonts w:ascii="Times New Roman" w:hAnsi="Times New Roman" w:cs="Times New Roman"/>
-                <w:bCs/>
-                <w:sz w:val="44"/>
-                <w:szCs w:val="44"/>
-                <w14:shadow w14:blurRad="38100" w14:dist="19050" w14:dir="2700000" w14:sx="100000" w14:sy="100000" w14:kx="0" w14:ky="0" w14:algn="tl">
-                  <w14:schemeClr w14:val="dk1">
-                    <w14:alpha w14:val="60000"/>
-                  </w14:schemeClr>
-                </w14:shadow>
-                <w14:textOutline w14:w="0" w14:cap="flat" w14:cmpd="sng" w14:algn="ctr">
-                  <w14:noFill/>
-                  <w14:prstDash w14:val="solid"/>
-                  <w14:round/>
-                </w14:textOutline>
-              </w:rPr>
-              <w:t>CSE 4105</w:t>
-            </w:r>
-          </w:p>
-          <w:p>
-            <w:pPr>
-              <w:jc w:val="center"/>
-              <w:rPr>
-                <w:rFonts w:ascii="Times New Roman" w:hAnsi="Times New Roman" w:cs="Times New Roman"/>
-                <w:bCs/>
-                <w:color w:val="000000" w:themeColor="text1"/>
-                <w:sz w:val="44"/>
-                <w:szCs w:val="44"/>
-                <w14:shadow w14:blurRad="38100" w14:dist="19050" w14:dir="2700000" w14:sx="100000" w14:sy="100000" w14:kx="0" w14:ky="0" w14:algn="tl">
-                  <w14:schemeClr w14:val="dk1">
-                    <w14:alpha w14:val="60000"/>
-                  </w14:schemeClr>
-                </w14:shadow>
-                <w14:textOutline w14:w="0" w14:cap="flat" w14:cmpd="sng" w14:algn="ctr">
-                  <w14:noFill/>
-                  <w14:prstDash w14:val="solid"/>
-                  <w14:round/>
-                </w14:textOutline>
-              </w:rPr>
-            </w:pPr>
-            <w:r>
-              <w:rPr>
-                <w:rFonts w:ascii="Times New Roman" w:hAnsi="Times New Roman" w:cs="Times New Roman"/>
-                <w:bCs/>
-                <w:color w:val="000000" w:themeColor="text1"/>
-                <w:sz w:val="44"/>
-                <w:szCs w:val="44"/>
-                <w14:shadow w14:blurRad="38100" w14:dist="19050" w14:dir="2700000" w14:sx="100000" w14:sy="100000" w14:kx="0" w14:ky="0" w14:algn="tl">
-                  <w14:schemeClr w14:val="dk1">
-                    <w14:alpha w14:val="60000"/>
-                  </w14:schemeClr>
-                </w14:shadow>
-                <w14:textOutline w14:w="0" w14:cap="flat" w14:cmpd="sng" w14:algn="ctr">
-                  <w14:noFill/>
-                  <w14:prstDash w14:val="solid"/>
-                  <w14:round/>
-                </w14:textOutline>
-              </w:rPr>
-              <w:t xml:space="preserve">Room no. </w:t>
-            </w:r>
-            <w:r>
-              <w:rPr>
-                <w:rFonts w:ascii="Times New Roman" w:hAnsi="Times New Roman" w:cs="Times New Roman"/>
-                <w:bCs/>
-                <w:color w:val="000000" w:themeColor="text1"/>
-                <w:sz w:val="44"/>
-                <w:szCs w:val="44"/>
-                <w14:shadow w14:blurRad="38100" w14:dist="19050" w14:dir="2700000" w14:sx="100000" w14:sy="100000" w14:kx="0" w14:ky="0" w14:algn="tl">
-                  <w14:schemeClr w14:val="dk1">
-                    <w14:alpha w14:val="60000"/>
-                  </w14:schemeClr>
-                </w14:shadow>
-                <w14:textOutline w14:w="0" w14:cap="flat" w14:cmpd="sng" w14:algn="ctr">
-                  <w14:noFill/>
-                  <w14:prstDash w14:val="solid"/>
-                  <w14:round/>
-                </w14:textOutline>
-              </w:rPr>
-              <w:t>310</w:t>
-            </w:r>
-          </w:p>
-          <w:p>
-            <w:pPr>
-              <w:jc w:val="center"/>
-              <w:rPr>
-                <w:rFonts w:ascii="Times New Roman" w:hAnsi="Times New Roman" w:cs="Times New Roman"/>
-                <w:bCs/>
-                <w:color w:val="000000" w:themeColor="text1"/>
-                <w:sz w:val="44"/>
-                <w:szCs w:val="44"/>
-                <w14:shadow w14:blurRad="38100" w14:dist="19050" w14:dir="2700000" w14:sx="100000" w14:sy="100000" w14:kx="0" w14:ky="0" w14:algn="tl">
-                  <w14:schemeClr w14:val="dk1">
-                    <w14:alpha w14:val="60000"/>
-                  </w14:schemeClr>
-                </w14:shadow>
-                <w14:textOutline w14:w="0" w14:cap="flat" w14:cmpd="sng" w14:algn="ctr">
-                  <w14:noFill/>
-                  <w14:prstDash w14:val="solid"/>
-                  <w14:round/>
-                </w14:textOutline>
-              </w:rPr>
-            </w:pPr>
-            <w:r>
-              <w:rPr>
-                <w:rFonts w:ascii="Times New Roman" w:hAnsi="Times New Roman" w:cs="Times New Roman"/>
-                <w:bCs/>
-                <w:color w:val="000000" w:themeColor="text1"/>
-                <w:sz w:val="44"/>
-                <w:szCs w:val="44"/>
-                <w14:shadow w14:blurRad="38100" w14:dist="19050" w14:dir="2700000" w14:sx="100000" w14:sy="100000" w14:kx="0" w14:ky="0" w14:algn="tl">
-                  <w14:schemeClr w14:val="dk1">
-                    <w14:alpha w14:val="60000"/>
-                  </w14:schemeClr>
-                </w14:shadow>
-                <w14:textOutline w14:w="0" w14:cap="flat" w14:cmpd="sng" w14:algn="ctr">
-                  <w14:noFill/>
-                  <w14:prstDash w14:val="solid"/>
-                  <w14:round/>
-                </w14:textOutline>
-              </w:rPr>
-              <w:t>Rubyeat</w:t>
-            </w:r>
-            <w:r>
-              <w:rPr>
-                <w:rFonts w:ascii="Times New Roman" w:hAnsi="Times New Roman" w:cs="Times New Roman"/>
-                <w:bCs/>
-                <w:color w:val="000000" w:themeColor="text1"/>
-                <w:sz w:val="44"/>
-                <w:szCs w:val="44"/>
-                <w14:shadow w14:blurRad="38100" w14:dist="19050" w14:dir="2700000" w14:sx="100000" w14:sy="100000" w14:kx="0" w14:ky="0" w14:algn="tl">
-                  <w14:schemeClr w14:val="dk1">
-                    <w14:alpha w14:val="60000"/>
-                  </w14:schemeClr>
-                </w14:shadow>
-                <w14:textOutline w14:w="0" w14:cap="flat" w14:cmpd="sng" w14:algn="ctr">
-                  <w14:noFill/>
-                  <w14:prstDash w14:val="solid"/>
-                  <w14:round/>
-                </w14:textOutline>
-              </w:rPr>
-              <w:t xml:space="preserve"> ma’am</w:t>
-            </w:r>
+                <w:color w:val="000000" w:themeColor="text1"/>
+                <w:sz w:val="44"/>
+                <w:szCs w:val="44"/>
+                <w14:shadow w14:blurRad="38100" w14:dist="19050" w14:dir="2700000" w14:sx="100000" w14:sy="100000" w14:kx="0" w14:ky="0" w14:algn="tl">
+                  <w14:schemeClr w14:val="dk1">
+                    <w14:alpha w14:val="60000"/>
+                  </w14:schemeClr>
+                </w14:shadow>
+                <w14:textOutline w14:w="0" w14:cap="flat" w14:cmpd="sng" w14:algn="ctr">
+                  <w14:noFill/>
+                  <w14:prstDash w14:val="solid"/>
+                  <w14:round/>
+                </w14:textOutline>
+              </w:rPr>
+            </w:pPr>
           </w:p>
         </w:tc>
         <w:tc>
@@ -5240,143 +5417,21 @@
               <w:rPr>
                 <w:rFonts w:ascii="Times New Roman" w:hAnsi="Times New Roman" w:cs="Times New Roman"/>
                 <w:bCs/>
-                <w:sz w:val="44"/>
-                <w:szCs w:val="44"/>
-                <w14:shadow w14:blurRad="38100" w14:dist="19050" w14:dir="2700000" w14:sx="100000" w14:sy="100000" w14:kx="0" w14:ky="0" w14:algn="tl">
-                  <w14:schemeClr w14:val="dk1">
-                    <w14:alpha w14:val="60000"/>
-                  </w14:schemeClr>
-                </w14:shadow>
-                <w14:textOutline w14:w="0" w14:cap="flat" w14:cmpd="sng" w14:algn="ctr">
-                  <w14:noFill/>
-                  <w14:prstDash w14:val="solid"/>
-                  <w14:round/>
-                </w14:textOutline>
-              </w:rPr>
-            </w:pPr>
-            <w:r>
-              <w:rPr>
-                <w:rFonts w:ascii="Times New Roman" w:hAnsi="Times New Roman" w:cs="Times New Roman"/>
-                <w:bCs/>
-                <w:sz w:val="44"/>
-                <w:szCs w:val="44"/>
-                <w14:shadow w14:blurRad="38100" w14:dist="19050" w14:dir="2700000" w14:sx="100000" w14:sy="100000" w14:kx="0" w14:ky="0" w14:algn="tl">
-                  <w14:schemeClr w14:val="dk1">
-                    <w14:alpha w14:val="60000"/>
-                  </w14:schemeClr>
-                </w14:shadow>
-                <w14:textOutline w14:w="0" w14:cap="flat" w14:cmpd="sng" w14:algn="ctr">
-                  <w14:noFill/>
-                  <w14:prstDash w14:val="solid"/>
-                  <w14:round/>
-                </w14:textOutline>
-              </w:rPr>
-              <w:t>CSE 4105</w:t>
-            </w:r>
-          </w:p>
-          <w:p>
-            <w:pPr>
-              <w:jc w:val="center"/>
-              <w:rPr>
-                <w:rFonts w:ascii="Times New Roman" w:hAnsi="Times New Roman" w:cs="Times New Roman"/>
-                <w:bCs/>
-                <w:color w:val="000000" w:themeColor="text1"/>
-                <w:sz w:val="44"/>
-                <w:szCs w:val="44"/>
-                <w14:shadow w14:blurRad="38100" w14:dist="19050" w14:dir="2700000" w14:sx="100000" w14:sy="100000" w14:kx="0" w14:ky="0" w14:algn="tl">
-                  <w14:schemeClr w14:val="dk1">
-                    <w14:alpha w14:val="60000"/>
-                  </w14:schemeClr>
-                </w14:shadow>
-                <w14:textOutline w14:w="0" w14:cap="flat" w14:cmpd="sng" w14:algn="ctr">
-                  <w14:noFill/>
-                  <w14:prstDash w14:val="solid"/>
-                  <w14:round/>
-                </w14:textOutline>
-              </w:rPr>
-            </w:pPr>
-            <w:r>
-              <w:rPr>
-                <w:rFonts w:ascii="Times New Roman" w:hAnsi="Times New Roman" w:cs="Times New Roman"/>
-                <w:bCs/>
-                <w:color w:val="000000" w:themeColor="text1"/>
-                <w:sz w:val="44"/>
-                <w:szCs w:val="44"/>
-                <w14:shadow w14:blurRad="38100" w14:dist="19050" w14:dir="2700000" w14:sx="100000" w14:sy="100000" w14:kx="0" w14:ky="0" w14:algn="tl">
-                  <w14:schemeClr w14:val="dk1">
-                    <w14:alpha w14:val="60000"/>
-                  </w14:schemeClr>
-                </w14:shadow>
-                <w14:textOutline w14:w="0" w14:cap="flat" w14:cmpd="sng" w14:algn="ctr">
-                  <w14:noFill/>
-                  <w14:prstDash w14:val="solid"/>
-                  <w14:round/>
-                </w14:textOutline>
-              </w:rPr>
-              <w:t xml:space="preserve">Room no. </w:t>
-            </w:r>
-            <w:r>
-              <w:rPr>
-                <w:rFonts w:ascii="Times New Roman" w:hAnsi="Times New Roman" w:cs="Times New Roman"/>
-                <w:bCs/>
-                <w:color w:val="000000" w:themeColor="text1"/>
-                <w:sz w:val="44"/>
-                <w:szCs w:val="44"/>
-                <w14:shadow w14:blurRad="38100" w14:dist="19050" w14:dir="2700000" w14:sx="100000" w14:sy="100000" w14:kx="0" w14:ky="0" w14:algn="tl">
-                  <w14:schemeClr w14:val="dk1">
-                    <w14:alpha w14:val="60000"/>
-                  </w14:schemeClr>
-                </w14:shadow>
-                <w14:textOutline w14:w="0" w14:cap="flat" w14:cmpd="sng" w14:algn="ctr">
-                  <w14:noFill/>
-                  <w14:prstDash w14:val="solid"/>
-                  <w14:round/>
-                </w14:textOutline>
-              </w:rPr>
-              <w:t>311</w:t>
-            </w:r>
-          </w:p>
-          <w:p>
-            <w:pPr>
-              <w:jc w:val="center"/>
-              <w:rPr>
-                <w:rFonts w:ascii="Times New Roman" w:hAnsi="Times New Roman" w:cs="Times New Roman"/>
-                <w:bCs/>
-                <w:color w:val="000000" w:themeColor="text1"/>
-                <w:sz w:val="44"/>
-                <w:szCs w:val="44"/>
-                <w14:shadow w14:blurRad="38100" w14:dist="19050" w14:dir="2700000" w14:sx="100000" w14:sy="100000" w14:kx="0" w14:ky="0" w14:algn="tl">
-                  <w14:schemeClr w14:val="dk1">
-                    <w14:alpha w14:val="60000"/>
-                  </w14:schemeClr>
-                </w14:shadow>
-                <w14:textOutline w14:w="0" w14:cap="flat" w14:cmpd="sng" w14:algn="ctr">
-                  <w14:noFill/>
-                  <w14:prstDash w14:val="solid"/>
-                  <w14:round/>
-                </w14:textOutline>
-              </w:rPr>
-            </w:pPr>
-            <w:r>
-              <w:rPr>
-                <w:rFonts w:ascii="Times New Roman" w:hAnsi="Times New Roman" w:cs="Times New Roman"/>
-                <w:bCs/>
-                <w:color w:val="000000" w:themeColor="text1"/>
-                <w:sz w:val="44"/>
-                <w:szCs w:val="44"/>
-                <w14:shadow w14:blurRad="38100" w14:dist="19050" w14:dir="2700000" w14:sx="100000" w14:sy="100000" w14:kx="0" w14:ky="0" w14:algn="tl">
-                  <w14:schemeClr w14:val="dk1">
-                    <w14:alpha w14:val="60000"/>
-                  </w14:schemeClr>
-                </w14:shadow>
-                <w14:textOutline w14:w="0" w14:cap="flat" w14:cmpd="sng" w14:algn="ctr">
-                  <w14:noFill/>
-                  <w14:prstDash w14:val="solid"/>
-                  <w14:round/>
-                </w14:textOutline>
-              </w:rPr>
-              <w:t>Rubyeat ma’am</w:t>
-            </w:r>
+                <w:color w:val="000000" w:themeColor="text1"/>
+                <w:sz w:val="44"/>
+                <w:szCs w:val="44"/>
+                <w14:shadow w14:blurRad="38100" w14:dist="19050" w14:dir="2700000" w14:sx="100000" w14:sy="100000" w14:kx="0" w14:ky="0" w14:algn="tl">
+                  <w14:schemeClr w14:val="dk1">
+                    <w14:alpha w14:val="60000"/>
+                  </w14:schemeClr>
+                </w14:shadow>
+                <w14:textOutline w14:w="0" w14:cap="flat" w14:cmpd="sng" w14:algn="ctr">
+                  <w14:noFill/>
+                  <w14:prstDash w14:val="solid"/>
+                  <w14:round/>
+                </w14:textOutline>
+              </w:rPr>
+            </w:pPr>
           </w:p>
         </w:tc>
         <w:tc>
@@ -5427,21 +5482,125 @@
               <w:rPr>
                 <w:rFonts w:ascii="Times New Roman" w:hAnsi="Times New Roman" w:cs="Times New Roman"/>
                 <w:bCs/>
-                <w:color w:val="4472C4" w:themeColor="accent1"/>
-                <w:sz w:val="44"/>
-                <w:szCs w:val="44"/>
-                <w14:shadow w14:blurRad="38100" w14:dist="25400" w14:dir="5400000" w14:sx="100000" w14:sy="100000" w14:kx="0" w14:ky="0" w14:algn="ctr">
-                  <w14:srgbClr w14:val="6E747A">
-                    <w14:alpha w14:val="57000"/>
-                  </w14:srgbClr>
-                </w14:shadow>
-                <w14:textOutline w14:w="0" w14:cap="flat" w14:cmpd="sng" w14:algn="ctr">
-                  <w14:noFill/>
-                  <w14:prstDash w14:val="solid"/>
-                  <w14:round/>
-                </w14:textOutline>
-              </w:rPr>
-            </w:pPr>
+                <w:color w:val="000000" w:themeColor="text1"/>
+                <w:sz w:val="44"/>
+                <w:szCs w:val="44"/>
+                <w14:shadow w14:blurRad="38100" w14:dist="19050" w14:dir="2700000" w14:sx="100000" w14:sy="100000" w14:kx="0" w14:ky="0" w14:algn="tl">
+                  <w14:schemeClr w14:val="dk1">
+                    <w14:alpha w14:val="60000"/>
+                  </w14:schemeClr>
+                </w14:shadow>
+                <w14:textOutline w14:w="0" w14:cap="flat" w14:cmpd="sng" w14:algn="ctr">
+                  <w14:noFill/>
+                  <w14:prstDash w14:val="solid"/>
+                  <w14:round/>
+                </w14:textOutline>
+              </w:rPr>
+            </w:pPr>
+            <w:r>
+              <w:rPr>
+                <w:rFonts w:ascii="Times New Roman" w:hAnsi="Times New Roman" w:cs="Times New Roman"/>
+                <w:bCs/>
+                <w:color w:val="000000" w:themeColor="text1"/>
+                <w:sz w:val="44"/>
+                <w:szCs w:val="44"/>
+                <w14:shadow w14:blurRad="38100" w14:dist="19050" w14:dir="2700000" w14:sx="100000" w14:sy="100000" w14:kx="0" w14:ky="0" w14:algn="tl">
+                  <w14:schemeClr w14:val="dk1">
+                    <w14:alpha w14:val="60000"/>
+                  </w14:schemeClr>
+                </w14:shadow>
+                <w14:textOutline w14:w="0" w14:cap="flat" w14:cmpd="sng" w14:algn="ctr">
+                  <w14:noFill/>
+                  <w14:prstDash w14:val="solid"/>
+                  <w14:round/>
+                </w14:textOutline>
+              </w:rPr>
+              <w:t>CSE 4218</w:t>
+            </w:r>
+          </w:p>
+          <w:p>
+            <w:pPr>
+              <w:jc w:val="center"/>
+              <w:rPr>
+                <w:rFonts w:ascii="Times New Roman" w:hAnsi="Times New Roman" w:cs="Times New Roman"/>
+                <w:bCs/>
+                <w:color w:val="000000" w:themeColor="text1"/>
+                <w:sz w:val="44"/>
+                <w:szCs w:val="44"/>
+                <w14:shadow w14:blurRad="38100" w14:dist="19050" w14:dir="2700000" w14:sx="100000" w14:sy="100000" w14:kx="0" w14:ky="0" w14:algn="tl">
+                  <w14:schemeClr w14:val="dk1">
+                    <w14:alpha w14:val="60000"/>
+                  </w14:schemeClr>
+                </w14:shadow>
+                <w14:textOutline w14:w="0" w14:cap="flat" w14:cmpd="sng" w14:algn="ctr">
+                  <w14:noFill/>
+                  <w14:prstDash w14:val="solid"/>
+                  <w14:round/>
+                </w14:textOutline>
+              </w:rPr>
+            </w:pPr>
+            <w:r>
+              <w:rPr>
+                <w:rFonts w:ascii="Times New Roman" w:hAnsi="Times New Roman" w:cs="Times New Roman"/>
+                <w:bCs/>
+                <w:color w:val="000000" w:themeColor="text1"/>
+                <w:sz w:val="44"/>
+                <w:szCs w:val="44"/>
+                <w14:shadow w14:blurRad="38100" w14:dist="19050" w14:dir="2700000" w14:sx="100000" w14:sy="100000" w14:kx="0" w14:ky="0" w14:algn="tl">
+                  <w14:schemeClr w14:val="dk1">
+                    <w14:alpha w14:val="60000"/>
+                  </w14:schemeClr>
+                </w14:shadow>
+                <w14:textOutline w14:w="0" w14:cap="flat" w14:cmpd="sng" w14:algn="ctr">
+                  <w14:noFill/>
+                  <w14:prstDash w14:val="solid"/>
+                  <w14:round/>
+                </w14:textOutline>
+              </w:rPr>
+              <w:t>Alternate Weeks</w:t>
+            </w:r>
+          </w:p>
+          <w:p>
+            <w:pPr>
+              <w:jc w:val="center"/>
+              <w:rPr>
+                <w:rFonts w:ascii="Times New Roman" w:hAnsi="Times New Roman" w:cs="Times New Roman"/>
+                <w:bCs/>
+                <w:color w:val="000000" w:themeColor="text1"/>
+                <w:sz w:val="44"/>
+                <w:szCs w:val="44"/>
+                <w14:shadow w14:blurRad="38100" w14:dist="19050" w14:dir="2700000" w14:sx="100000" w14:sy="100000" w14:kx="0" w14:ky="0" w14:algn="tl">
+                  <w14:schemeClr w14:val="dk1">
+                    <w14:alpha w14:val="60000"/>
+                  </w14:schemeClr>
+                </w14:shadow>
+                <w14:textOutline w14:w="0" w14:cap="flat" w14:cmpd="sng" w14:algn="ctr">
+                  <w14:noFill/>
+                  <w14:prstDash w14:val="solid"/>
+                  <w14:round/>
+                </w14:textOutline>
+              </w:rPr>
+            </w:pPr>
+            <w:r>
+              <w:rPr>
+                <w:rFonts w:ascii="Times New Roman" w:hAnsi="Times New Roman" w:cs="Times New Roman"/>
+                <w:bCs/>
+                <w:color w:val="000000" w:themeColor="text1"/>
+                <w:sz w:val="44"/>
+                <w:szCs w:val="44"/>
+                <w14:shadow w14:blurRad="38100" w14:dist="19050" w14:dir="2700000" w14:sx="100000" w14:sy="100000" w14:kx="0" w14:ky="0" w14:algn="tl">
+                  <w14:schemeClr w14:val="dk1">
+                    <w14:alpha w14:val="60000"/>
+                  </w14:schemeClr>
+                </w14:shadow>
+                <w14:textOutline w14:w="0" w14:cap="flat" w14:cmpd="sng" w14:algn="ctr">
+                  <w14:noFill/>
+                  <w14:prstDash w14:val="solid"/>
+                  <w14:round/>
+                </w14:textOutline>
+              </w:rPr>
+              <w:t>Nafisa ma’am</w:t>
+            </w:r>
           </w:p>
         </w:tc>
         <w:tc>
@@ -6028,7 +6187,7 @@
   <w:style w:type="paragraph" w:default="1" w:styleId="Normal">
     <w:name w:val="Normal"/>
     <w:qFormat/>
-    <w:rsid w:val="00EB0687"/>
+    <w:rsid w:val="001900AE"/>
   </w:style>
   <w:style w:type="character" w:default="1" w:styleId="DefaultParagraphFont">
     <w:name w:val="Default Paragraph Font"/>

</xml_diff>